<commit_message>
Correct the Protocol Flamingo continuity breaks in the expanded manuscript, and stop the generator from replacing that file.
Co-authored-by: Cursor <cursoragent@cursor.com>
</commit_message>
<xml_diff>
--- a/Protocol Flamingo/Protocol_Flamingo_Rev2.docx
+++ b/Protocol Flamingo/Protocol_Flamingo_Rev2.docx
@@ -279,7 +279,7 @@
           <w:color w:val="2B2B2B"/>
           <w:sz w:val="26"/>
         </w:rPr>
-        <w:t>The tone leans a little British, for fun, and a little absurd on purpose, in the general direction of Douglas Adams, who understood before most people that the end of the world is, for somebody, always a filing problem. No character, place, or organisation in this book is drawn from his work, or from any of the nine film and television properties named above. Every name here was checked against all of them and belongs only to this book.</w:t>
+        <w:t>The tone leans a little British, for fun, and a little absurd on purpose, in the general direction of Douglas Adams, who understood before most people that the end of the world is, for somebody, always a filing problem. No character, place, or organization in this book is drawn from his work, or from any of the nine film and television properties named above. Every name here was checked against all of them and belongs only to this book.</w:t>
       </w:r>
     </w:p>
     <w:p>
@@ -554,7 +554,7 @@
           <w:sz w:val="26"/>
           <w:szCs w:val="23"/>
         </w:rPr>
-        <w:t>Lissome’s self-appointed civil defence officer. Has a bunker, a shortwave radio, and forty years of being wrong about which Tuesday it would happen. Reserves, at all times, the right to have been right.</w:t>
+        <w:t>Lissome’s self-appointed civil defense officer. Has a bunker, a shortwave radio, and forty years of being wrong about which Tuesday it would happen. Reserves, at all times, the right to have been right.</w:t>
       </w:r>
     </w:p>
     <w:p>
@@ -583,7 +583,7 @@
           <w:sz w:val="26"/>
           <w:szCs w:val="23"/>
         </w:rPr>
-        <w:t>a psychiatrist who has spent eleven years quietly cataloguing patients no textbook prepared him for — no papers, no dental records, no language on record — and watching the system misfile every one of them as something smaller than what they were. Has been waiting four years for someone to finally ask him about it.</w:t>
+        <w:t>a psychiatrist who has spent eleven years quietly cataloging patients no textbook prepared him for — no papers, no dental records, no language on record — and watching the system misfile every one of them as something smaller than what they were. Has been waiting four years for someone to finally ask him about it.</w:t>
       </w:r>
     </w:p>
     <w:p>
@@ -917,7 +917,7 @@
           <w:sz w:val="26"/>
           <w:szCs w:val="23"/>
         </w:rPr>
-        <w:t>once flew for NASA. Now runs Halo Systems, which sells the world cheap orbital internet, and underneath that runs the only organisation on the planet still fighting a war nobody has declared, and increasingly suspects nobody ever should have.</w:t>
+        <w:t>once flew for NASA. Now runs Halo Systems, which sells the world cheap orbital internet, and underneath that runs the only organization on the planet still fighting a war nobody has declared, and increasingly suspects nobody ever should have.</w:t>
       </w:r>
     </w:p>
     <w:p>
@@ -1024,7 +1024,7 @@
           <w:sz w:val="26"/>
           <w:szCs w:val="23"/>
         </w:rPr>
-        <w:t>an alpaca. This storybook will not be the first document to fail at explaining Steve, and it will not apologise for that either.</w:t>
+        <w:t>an alpaca. This storybook will not be the first document to fail at explaining Steve, and it will not apologize for that either.</w:t>
       </w:r>
     </w:p>
     <w:p>
@@ -4813,7 +4813,7 @@
           <w:color w:val="2B2B2B"/>
           <w:sz w:val="26"/>
         </w:rPr>
-        <w:t xml:space="preserve">Duval’s face suggested a great deal. Halvorsen moved on anyway, to the part of the briefing that mattered: whatever had first noticed Earth’s radio chatter back in 1947 had waited three more decades before doing anything about it, and the thing it eventually did, forty-six years ago, was start growing a generation of infiltrators disguised as somebody else’s children. The Directorate’s own shorthand for the whole apparatus — the ship, the hybrids, the patient decades of paperwork behind both — had been, since before anyone currently in the room was cleared to ask why, the Feed. And Halo Systems — a </w:t>
+        <w:t xml:space="preserve">Duval’s face suggested a great deal. Halvorsen moved on anyway, to the part of the briefing that mattered: whatever had first noticed Earth’s radio chatter back in 1947 had waited thirty-three years before doing anything about it, and the thing it eventually did, forty-six years ago, was start growing a generation of infiltrators disguised as somebody else’s children. The Directorate’s own shorthand for the whole apparatus — the ship, the hybrids, the patient decades of paperwork behind both — had been, since before anyone currently in the room was cleared to ask why, the Feed. And Halo Systems — a </w:t>
       </w:r>
       <w:r>
         <w:rPr>
@@ -5285,27 +5285,27 @@
           <w:color w:val="2B2B2B"/>
           <w:sz w:val="26"/>
         </w:rPr>
-        <w:t>“They’re still travelling,” Dana guessed.</w:t>
-      </w:r>
-    </w:p>
-    <w:p>
-      <w:pPr>
-        <w:spacing w:line="400" w:lineRule="auto"/>
-        <w:ind w:firstLine="440"/>
-        <w:jc w:val="both"/>
-        <w:rPr>
-          <w:rFonts w:ascii="Georgia" w:hAnsi="Georgia"/>
-          <w:color w:val="2B2B2B"/>
-          <w:sz w:val="26"/>
-        </w:rPr>
-      </w:pPr>
-      <w:r>
-        <w:rPr>
-          <w:rFonts w:ascii="Georgia" w:hAnsi="Georgia"/>
-          <w:color w:val="2B2B2B"/>
-          <w:sz w:val="26"/>
-        </w:rPr>
-        <w:t>“They stopped travelling a long time ago. They’re parked, in Jupiter’s shadow more or less, tucked in with a swarm of rock the surveys had already agreed was boring. Have been for longer than anyone downstairs will tell me exactly. A great deal longer than forty-six years, which is the number you actually want. It has a name, according to Feld — several committees long, something that translates roughly as Vessel of Continuance, Charter Revised — and everyone currently aboard it, Feld included, just calls it the Boat. Jupiter, for its part, has spent four and a half billion years being enormous and has never once been asked to notice anything, and did not start now.”</w:t>
+        <w:t>“They’re still traveling,” Dana guessed.</w:t>
+      </w:r>
+    </w:p>
+    <w:p>
+      <w:pPr>
+        <w:spacing w:line="400" w:lineRule="auto"/>
+        <w:ind w:firstLine="440"/>
+        <w:jc w:val="both"/>
+        <w:rPr>
+          <w:rFonts w:ascii="Georgia" w:hAnsi="Georgia"/>
+          <w:color w:val="2B2B2B"/>
+          <w:sz w:val="26"/>
+        </w:rPr>
+      </w:pPr>
+      <w:r>
+        <w:rPr>
+          <w:rFonts w:ascii="Georgia" w:hAnsi="Georgia"/>
+          <w:color w:val="2B2B2B"/>
+          <w:sz w:val="26"/>
+        </w:rPr>
+        <w:t>“They stopped traveling a long time ago. They’re parked, in Jupiter’s shadow more or less, tucked in with a swarm of rock the surveys had already agreed was boring. Have been for longer than anyone downstairs will tell me exactly. A great deal longer than forty-six years, which is the number you actually want. It has a name, according to Feld — several committees long, something that translates roughly as Vessel of Continuance, Charter Revised — and everyone currently aboard it, Feld included, just calls it the Boat. Jupiter, for its part, has spent four and a half billion years being enormous and has never once been asked to notice anything, and did not start now.”</w:t>
       </w:r>
     </w:p>
     <w:p>
@@ -5346,7 +5346,7 @@
           <w:sz w:val="26"/>
         </w:rPr>
         <w:lastRenderedPageBreak/>
-        <w:t>“They came closer. Sent small craft in-system, quietly, and did the thing a patient species does once it’s finally near enough to a living world to plan a visit: took samples. Blood, tissue, the ordinary theft people have been reporting to police stations for exactly that long without anyone official writing it down as anything but nerves. They’d been travelling so long that whatever they looked like when they left wasn’t going to walk down an American street without somebody noticing. So they built a generation that would.”</w:t>
+        <w:t>“They came closer. Sent small craft in-system, quietly, and did the thing a patient species does once it’s finally near enough to a living world to plan a visit: took samples. Blood, tissue, the ordinary theft people have been reporting to police stations for exactly that long without anyone official writing it down as anything but nerves. They’d been traveling so long that whatever they looked like when they left wasn’t going to walk down an American street without somebody noticing. So they built a generation that would.”</w:t>
       </w:r>
     </w:p>
     <w:p>
@@ -5577,7 +5577,7 @@
           <w:sz w:val="26"/>
           <w:szCs w:val="20"/>
         </w:rPr>
-        <w:t>On generation ships: a vessel built to carry a civilisation for forty thousand years will, as a matter of engineering necessity, also carry that civilisation’s committees, subcommittees, and at least one working group whose original mandate nobody currently aboard can locate.</w:t>
+        <w:t>On generation ships: a vessel built to carry a civilization for forty thousand years will, as a matter of engineering necessity, also carry that civilization’s committees, subcommittees, and at least one working group whose original mandate nobody currently aboard can locate.</w:t>
       </w:r>
     </w:p>
     <w:p>
@@ -6308,7 +6308,7 @@
           <w:sz w:val="26"/>
           <w:szCs w:val="20"/>
         </w:rPr>
-        <w:t>On hospitality: a civilisation that has not received visitors in forty thousand years will, on the rare occasion it takes any, prove unpracticed at nearly every part of the experience except the paperwork.</w:t>
+        <w:t>On hospitality: a civilization that has not received visitors in forty thousand years will, on the rare occasion it takes any, prove unpracticed at nearly every part of the experience except the paperwork.</w:t>
       </w:r>
     </w:p>
     <w:p>
@@ -6724,7 +6724,7 @@
           <w:color w:val="2B2B2B"/>
           <w:sz w:val="26"/>
         </w:rPr>
-        <w:t xml:space="preserve">It emerged, on the walk that followed, that the ship’s actual intelligence on Earth was both extensive and roughly forty years behind schedule, most of it gathered in one dense burst around the time the sampling program began and only patched since through whatever a returning hybrid happened to notice on a given visit. The hybrid curriculum still taught, with total institutional confidence, that the correct way to blend in at an American gas station was to pay with a personal cheque. It taught that disco was a going concern. It had a whole unit, delivered with a straight face by whoever delivered such things, on the etiquette of the rotary telephone. Nora asked, not entirely rhetorically, how anyone had managed to pass as a </w:t>
+        <w:t xml:space="preserve">It emerged, on the walk that followed, that the ship’s actual intelligence on Earth was both extensive and roughly forty years behind schedule, most of it gathered in one dense burst around the time the sampling program began and only patched since through whatever a returning hybrid happened to notice on a given visit. The hybrid curriculum still taught, with total institutional confidence, that the correct way to blend in at an American gas station was to pay with a personal check. It taught that disco was a going concern. It had a whole unit, delivered with a straight face by whoever delivered such things, on the etiquette of the rotary telephone. Nora asked, not entirely rhetorically, how anyone had managed to pass as a </w:t>
       </w:r>
       <w:r>
         <w:rPr>
@@ -6753,7 +6753,7 @@
           <w:color w:val="2B2B2B"/>
           <w:sz w:val="26"/>
         </w:rPr>
-        <w:t xml:space="preserve">Nora asked what she had been trying not to ask since the corridor: what the ship had actually wanted with the real infants, forty-six years and longer of them, beyond the word studied, which had never once sounded to her like the whole sentence. The Escort didn’t dress it up. “Partly you can’t leave a live baby behind without questions, and killing one turns out to be a harder policy to write down than people assume, even up here. But mostly, no. A population this size, sealed this long, breeds itself into a smaller and smaller room genetically whether it wants to or not. Forty thousand years is a long time to be your own only neighbours. They needed </w:t>
+        <w:t xml:space="preserve">Nora asked what she had been trying not to ask since the corridor: what the ship had actually wanted with the real infants, forty-six years and longer of them, beyond the word studied, which had never once sounded to her like the whole sentence. The Escort didn’t dress it up. “Partly you can’t leave a live baby behind without questions, and killing one turns out to be a harder policy to write down than people assume, even up here. But mostly, no. A population this size, sealed this long, breeds itself into a smaller and smaller room genetically whether it wants to or not. Forty thousand years is a long time to be your own only neighbors. They needed </w:t>
       </w:r>
       <w:r>
         <w:rPr>
@@ -7267,7 +7267,7 @@
           <w:color w:val="2B2B2B"/>
           <w:sz w:val="26"/>
         </w:rPr>
-        <w:t>The same night, on the only aircraft cleared for both routes, Halo’s field team had a narrow chance to bring in a Directorate asset named Anders Feld, swapped for a real infant forty-odd years ago and told the truth of it only six months back, in the flat, procedural way an organisation tells you anything it has been rehearsing for decades. He was sitting in a motel outside Reno with the closest thing on Earth to a native speaker’s understanding of the ship, and he had decided, for reasons that were entirely his own, that he preferred being one person to being a delegate.</w:t>
+        <w:t>The same night, on the only aircraft cleared for both routes, Halo’s field team had a narrow chance to bring in a Directorate asset named Anders Feld, swapped for a real infant forty-odd years ago and told the truth of it only six months back, in the flat, procedural way an organization tells you anything it has been rehearsing for decades. He was sitting in a motel outside Reno with the closest thing on Earth to a native speaker’s understanding of the ship, and he had decided, for reasons that were entirely his own, that he preferred being one person to being a delegate.</w:t>
       </w:r>
     </w:p>
     <w:p>
@@ -7365,7 +7365,7 @@
           <w:color w:val="2B2B2B"/>
           <w:sz w:val="26"/>
         </w:rPr>
-        <w:t>What they described — the corridor, the Escort, a dozen hostile faces that had never learned a word of English, and a name, Feld’s, handed to them before either of them had any reason to know it mattered — reached Dana within the hour, which meant she was holding Nora’s account of a stranger’s prediction in one hand and the stranger’s actual arrival in the other before the night was through. She did not believe in omens. She was starting to believe in an organisation efficient enough to make omens look like paperwork.</w:t>
+        <w:t>What they described — the corridor, the Escort, three hostile faces that had never learned a word of English, and a name, Feld’s, handed to them before either of them had any reason to know it mattered — reached Dana within the hour, which meant she was holding Nora’s account of a stranger’s prediction in one hand and the stranger’s actual arrival in the other before the night was through. She did not believe in omens. She was starting to believe in an organization efficient enough to make omens look like paperwork.</w:t>
       </w:r>
     </w:p>
     <w:p>
@@ -7394,7 +7394,7 @@
           <w:sz w:val="26"/>
         </w:rPr>
         <w:lastRenderedPageBreak/>
-        <w:t xml:space="preserve">never personally been aboard, before he himself had. He took this with less surprise than Dana expected. “Someone up there’s been arguing my case longer than I have,” was all he offered that night, and then, because it was apparently a reflex he could not switch off any more than Dominic could switch off his, corrected Warren’s phrasing on a wholly unrelated point three sentences later — not activated, he said, triggered; a hybrid isn’t a light switch, and if the Desk kept calling it one they’d keep being surprised by the dimmer — with the patient, slightly wearying precision of a man who had spent thirty years being the only translator in every room he’d ever stood in and had never once been allowed to let a wrong word pass uncorrected. He turned out to know something more useful than tactics regardless. The invasion plan, he explained, had been reapproved by the ship’s ruling council eleven times in the last two centuries and amended on each </w:t>
+        <w:t xml:space="preserve">never personally been aboard. He took this with less surprise than Dana expected. “Someone up there’s been arguing my case longer than I have,” was all he offered that night, and then, because it was apparently a reflex he could not switch off any more than Dominic could switch off his, corrected Warren’s phrasing on a wholly unrelated point three sentences later — not activated, he said, triggered; a hybrid isn’t a light switch, and if the Desk kept calling it one they’d keep being surprised by the dimmer — with the patient, slightly wearying precision of a man who had spent the six months since he learned the truth as the only translator in every room he’d ever stood in and had never once been allowed to let a wrong word pass uncorrected. He turned out to know something more useful than tactics regardless. The invasion plan, he explained, had been reapproved by the ship’s ruling council eleven times in the last two centuries and amended on each </w:t>
       </w:r>
       <w:r>
         <w:rPr>
@@ -7823,7 +7823,7 @@
           <w:color w:val="2B2B2B"/>
           <w:sz w:val="26"/>
         </w:rPr>
-        <w:t>Nora, who had spent a month being told her camera lied, found she did not entirely know what to do with being believed. She asked, instead, the only question that had mattered to her since Thanksgiving: “Can you fix my brother-in-law?”</w:t>
+        <w:t>Nora, who had spent three weeks being told her camera lied, found she did not entirely know what to do with being believed. She asked, instead, the only question that had mattered to her since Thanksgiving: “Can you fix my brother-in-law?”</w:t>
       </w:r>
     </w:p>
     <w:p>
@@ -7920,7 +7920,7 @@
           <w:sz w:val="26"/>
           <w:szCs w:val="20"/>
         </w:rPr>
-        <w:t>On fraternisation: not against the rules, strictly, since nobody has ever needed a rule for something nobody anticipated surviving long enough to attempt.</w:t>
+        <w:t>On fraternization: not against the rules, strictly, since nobody has ever needed a rule for something nobody anticipated surviving long enough to attempt.</w:t>
       </w:r>
     </w:p>
     <w:p>
@@ -8177,7 +8177,7 @@
           <w:color w:val="2B2B2B"/>
           <w:sz w:val="26"/>
         </w:rPr>
-        <w:t>Nora would say, much later, that it was the first night in a month she had stopped being afraid in full sentences. Jesse would say less about it than that, because Jesse, for once in his life, had run out of things to narrate.</w:t>
+        <w:t>Nora would say, much later, that it was the first night in three weeks she had stopped being afraid in full sentences. Jesse would say less about it than that, because Jesse, for once in his life, had run out of things to narrate.</w:t>
       </w:r>
     </w:p>
     <w:p>
@@ -8238,7 +8238,7 @@
           <w:color w:val="2B2B2B"/>
           <w:sz w:val="26"/>
         </w:rPr>
-        <w:t>Word travels fast in a building with three occupants and one working elevator. Warren found out first, from the two coffees Jesse ordered the next morning instead of one, and said nothing about it, which was, from Warren, roughly the civic equivalent of throwing a parade. Priya found out second, deduced it from twelve feet away in under four seconds flat, and immediately opened a betting pool she declined to show either of them the terms of. Gladys, who had privately known since the first call from Indiana and had simply been waiting for the paperwork to catch up with the feeling, said only, “Well. About time,” and went back to the tip line, entirely satisfied with how the universe was running that particular week.</w:t>
+        <w:t>Word travels fast in an office of four people and one working elevator. Warren found out first, from the two coffees Jesse ordered the next morning instead of one, and said nothing about it, which was, from Warren, roughly the civic equivalent of throwing a parade. Priya found out second, deduced it from twelve feet away in under four seconds flat, and immediately opened a betting pool she declined to show either of them the terms of. Gladys, who had privately known since the first call from Indiana and had simply been waiting for the paperwork to catch up with the feeling, said only, “Well. About time,” and went back to the tip line, entirely satisfied with how the universe was running that particular week.</w:t>
       </w:r>
     </w:p>
     <w:p>
@@ -8605,7 +8605,7 @@
           <w:sz w:val="26"/>
         </w:rPr>
         <w:lastRenderedPageBreak/>
-        <w:t>the single most useful hour of his civil-defence career, and never once finding out that it was.</w:t>
+        <w:t>the single most useful hour of his civil-defense career, and never once finding out that it was.</w:t>
       </w:r>
     </w:p>
     <w:p>
@@ -8645,7 +8645,7 @@
           <w:color w:val="2B2B2B"/>
           <w:sz w:val="26"/>
         </w:rPr>
-        <w:t xml:space="preserve">Buchanan’s authorization for the overload arrived with forty minutes to spare and a signature that made it, on paper, the only sanctioned plan in the building. It was Jesse who said the thing plainly, in a trailer full of people with better clearances than his: that a plan which required not asking Dominic Reyes, or the several hundred thousand people </w:t>
+        <w:t xml:space="preserve">Buchanan’s authorization for the overload arrived with forty minutes to spare and a signature that made it, on paper, the only sanctioned plan in the building. It was Jesse who said the thing plainly, in a trailer full of people with better clearances than his: that a plan which required not asking Dominic Reyes, or the several thousand people </w:t>
       </w:r>
       <w:r>
         <w:rPr>
@@ -8999,7 +8999,7 @@
           <w:color w:val="2B2B2B"/>
           <w:sz w:val="26"/>
         </w:rPr>
-        <w:t xml:space="preserve">Nora reached Dominic before the reply finished. She did not have a plan beyond her sister’s hand in hers, a camera she’d left, for once, in the car, and eleven years of watching a face for the fraction of a second before it decided what it was about to feel — the same fraction of a second she’d caught on video the first night, and had spent a month wishing she’d been wrong about. That, more than anything Kade’s engineers had built, was the instrument she trusted to tell her when to speak. She said his name, and </w:t>
+        <w:t xml:space="preserve">Nora reached Dominic before the reply finished. She did not have a plan beyond her sister’s hand in hers, a camera she’d left, for once, in the car, and eleven years of watching a face for the fraction of a second before it decided what it was about to feel — the same fraction of a second she’d caught on video the first night, and had spent three weeks wishing she’d been wrong about. That, more than anything Kade’s engineers had built, was the instrument she trusted to tell her when to speak. She said his name, and </w:t>
       </w:r>
       <w:r>
         <w:rPr>
@@ -9714,7 +9714,7 @@
           <w:sz w:val="26"/>
         </w:rPr>
         <w:lastRenderedPageBreak/>
-        <w:t>of the one person who had actually met the thing it wanted to solve. The correction came from a wedding videographer, a podcaster, a satellite executive who stopped checking with Brussels, and a translator who used to be the thing everyone was afraid of. The ship, once anyone actually sat still and listened to it, turned out to be less a villain than a family that had been travelling so long it had forgotten it was allowed to stop and ask.</w:t>
+        <w:t>of the one person who had actually met the thing it wanted to solve. The correction came from a wedding videographer, a podcaster, a satellite executive who stopped checking with Brussels, and a translator who used to be the thing everyone was afraid of. The ship, once anyone actually sat still and listened to it, turned out to be less a villain than a family that had been traveling so long it had forgotten it was allowed to stop and ask.</w:t>
       </w:r>
     </w:p>
     <w:p>
@@ -9755,7 +9755,7 @@
           <w:sz w:val="26"/>
         </w:rPr>
         <w:lastRenderedPageBreak/>
-        <w:t>Nine cousins stood behind real programs and told their stories again without borrowing a line of dialogue. This one stands behind all nine at once, borrows nothing but their shape, and runs its two halves — the private fight and the government effort, and the two people who end up doing both at once, and occasionally doing the government’s job better than it did — until they finally sit down in the same diner. If you’ve read the others, you already know the sky in this book. If you haven’t, you can start here. Brussels will still be arguing about the minutes either way.</w:t>
+        <w:t>Nine cousins stood behind real programs and told their stories again without borrowing a line of dialogue. This one stands behind all nine at once, borrows nothing but their shape, and runs its two halves — the private fight and the government effort, and the two people who end up doing both at once, and occasionally doing the government’s job better than it did — until they finally sit down in the same break room. If you’ve read the others, you already know the sky in this book. If you haven’t, you can start here. Brussels will still be arguing about the minutes either way.</w:t>
       </w:r>
     </w:p>
     <w:p>
@@ -9959,7 +9959,7 @@
           <w:sz w:val="26"/>
           <w:szCs w:val="23"/>
         </w:rPr>
-        <w:t>, built in Arizona in 1991 — could not keep eight people alive inside a fully sealed system for even two years before oxygen levels and crop yields collapsed. This book’s ship is not that. It is the version where the engineering problem gets solved, imperfectly, by people who had several hundred generations and no alternative.</w:t>
+        <w:t>, built in Arizona in 1991 — could not keep eight people alive inside a fully sealed system for even two years before oxygen levels and crop yields collapsed. This book’s ship is not that. It is the version where the engineering problem gets solved, imperfectly, by people who had two thousand generations and no alternative.</w:t>
       </w:r>
     </w:p>
     <w:p>
@@ -10308,7 +10308,7 @@
           <w:sz w:val="26"/>
           <w:szCs w:val="23"/>
         </w:rPr>
-        <w:t xml:space="preserve"> is expected, over its ten-year survey, to catalogue over a hundred thousand Jupiter Trojans alone — more than seven times the number currently known — which is to say that the part of the sky this book’s ship is hiding in is, this decade, for the first time in human history, actually about to be looked at properly.</w:t>
+        <w:t xml:space="preserve"> is expected, over its ten-year survey, to catalog over a hundred thousand Jupiter Trojans alone — more than seven times the number currently known — which is to say that the part of the sky this book’s ship is hiding in is, this decade, for the first time in human history, actually about to be looked at properly.</w:t>
       </w:r>
     </w:p>
     <w:p>

</xml_diff>

<commit_message>
Save the flamingo draft, quantum manuscript, and bureau text still only on this computer.
Co-authored-by: Cursor <cursoragent@cursor.com>
</commit_message>
<xml_diff>
--- a/Protocol Flamingo/Protocol_Flamingo_Rev2.docx
+++ b/Protocol Flamingo/Protocol_Flamingo_Rev2.docx
@@ -3904,7 +3904,7 @@
           <w:color w:val="2B2B2B"/>
           <w:sz w:val="26"/>
         </w:rPr>
-        <w:t xml:space="preserve">The gift shop sold a mug that said I SAW THE SKY and a child’s cap that said STARFALL CREW. Dana turned the cap in her hands. Trip said they moved units. She put it back as if it might go off. A cover that sold this well had already lasted eleven years without anyone official having to notice it.</w:t>
+        <w:t xml:space="preserve">The gift shop sold a mug that said I SAW THE SKY and a child’s cap that said STARFALL CREW. Dana turned the cap in her hands. Trip said they moved units. She put it back as if it might go off. A cover that sold this well had already lasted eleven years without anyone official noticing.</w:t>
       </w:r>
     </w:p>
     <w:p>
@@ -6703,7 +6703,7 @@
           <w:color w:val="2B2B2B"/>
           <w:sz w:val="26"/>
         </w:rPr>
-        <w:t xml:space="preserve">He said Mabs had a right to a husband who was still a husband for two more days. They did not raise their voices. The memo sat between them while they did it. She told Mabs anyway, in a service corridor that smelled of pretzels, three hours before totality. Mabs had flour on one cuff from a pretzel she had bought because a child in the line was watching her not buy one. She made Nora say hybrid twice. She heard the eleven seconds, the thumb, and the cars, and she did not cry where her sister could see it. “I know he’s different,” she said. Then, “Don’t you make me choose in a stadium.” Nora started to nod, and Mabs put a hand on her wrist, light, the way you stop a person from agreeing too fast. “If he comes back, he comes back as the man who carved the turkey. Not as your file.” Nora did not make her choose. That was the cost. She went to section 114 with her sister’s permission and without her sister’s peace.</w:t>
+        <w:t xml:space="preserve">He said Mabs had a right to a husband who was still a husband for two more days. They did not raise their voices. The memo sat between them anyway. She told Mabs anyway, in a service corridor that smelled of pretzels, three hours before totality. Mabs had flour on one cuff from a pretzel she had bought because a child in the line was watching her not buy one. She made Nora say hybrid twice. She heard the eleven seconds, the thumb, and the cars, and she did not cry where her sister could see it. “I know he’s different,” she said. Then, “Don’t you make me choose in a stadium.” Nora started to nod, and Mabs put a hand on her wrist, light, the way you stop a person from agreeing too fast. “If he comes back, he comes back as the man who carved the turkey. Not as your file.” Nora did not make her choose. That was the cost. She went to section 114 with her sister’s permission and without her sister’s peace.</w:t>
       </w:r>
     </w:p>
     <w:p>

</xml_diff>

<commit_message>
Protocol Flamingo: author name is Lothar J. Musiol (copyright line, About the Author 'writing as George Herbert Fontaine', document author property; KDP listing Author field with the pen name as contributor and byline)
</commit_message>
<xml_diff>
--- a/Protocol Flamingo/Protocol_Flamingo_Rev2.docx
+++ b/Protocol Flamingo/Protocol_Flamingo_Rev2.docx
@@ -118,7 +118,7 @@
           <w:sz w:val="26"/>
           <w:szCs w:val="26"/>
         </w:rPr>
-        <w:t xml:space="preserve">Copyright © 2026 by George Herbert Fontaine</w:t>
+        <w:t xml:space="preserve">Copyright © 2026 by Lothar J. Musiol</w:t>
       </w:r>
     </w:p>
     <w:p>
@@ -45512,7 +45512,7 @@
           <w:color w:val="2B2B2B"/>
           <w:sz w:val="26"/>
         </w:rPr>
-        <w:t xml:space="preserve">George Herbert Fontaine writes stories in which a committee outlasts a fleet. Protocol Flamingo is the first of the Invasion Storybooks. The people in it are invented. The alpaca is invented. The science in the appendix is not.</w:t>
+        <w:t xml:space="preserve">Lothar J. Musiol, writing as George Herbert Fontaine, writes stories in which a committee outlasts a fleet. Protocol Flamingo is the first of the Invasion Storybooks. The people in it are invented. The alpaca is invented. The science in the appendix is not.</w:t>
       </w:r>
     </w:p>
     <w:sectPr>

</xml_diff>

<commit_message>
Protocol Flamingo: no repeated sentences (170 paragraphs reworded, rescanned clean), neighbors fix, curly apostrophes; notes updated
Exact and near-duplicate sentences were varied (callbacks reworded, gesture beats varied,
glossary entries that copied story sentences reworded); only chapter titles that also sit in
the contents list, bibliography titles and the bare interjection remain. Pre-edit copy in bak/.

Co-Authored-By: Claude Sonnet 5.5 <noreply@anthropic.com>
</commit_message>
<xml_diff>
--- a/Protocol Flamingo/Protocol_Flamingo_Rev2.docx
+++ b/Protocol Flamingo/Protocol_Flamingo_Rev2.docx
@@ -3516,7 +3516,7 @@
           <w:color w:val="2B2B2B"/>
           <w:sz w:val="26"/>
         </w:rPr>
-        <w:t xml:space="preserve">“That’s what I said.” Buchanan handed the map back to Priya. “Write it up as atmospheric. All of it. If any of it stops being atmospheric, you call me before you call anyone, and by anyone I mean the stairs.” She left. The frosted window in the stairwell door ticked in its frame as it shut.</w:t>
+        <w:t xml:space="preserve">“Precisely.” Buchanan handed the map back to Priya. “Write it up as atmospheric. All of it. If any of it stops being atmospheric, you call me before you call anyone, and by anyone I mean the stairs.” She left. The frosted window in the stairwell door ticked in its frame as it shut.</w:t>
       </w:r>
     </w:p>
     <w:p>
@@ -4462,7 +4462,7 @@
           <w:color w:val="2B2B2B"/>
           <w:sz w:val="26"/>
         </w:rPr>
-        <w:t xml:space="preserve">She told herself it was nothing. She told herself that people freeze. She knew all the ways people freeze. It was most of the job.</w:t>
+        <w:t xml:space="preserve">She told herself that people freeze. She knew all the ways people freeze. It was most of the job.</w:t>
       </w:r>
     </w:p>
     <w:p>
@@ -4621,7 +4621,7 @@
           <w:color w:val="2B2B2B"/>
           <w:sz w:val="26"/>
         </w:rPr>
-        <w:t xml:space="preserve">“That’s not possible.”</w:t>
+        <w:t xml:space="preserve">“That’s impossible.”</w:t>
       </w:r>
     </w:p>
     <w:p>
@@ -4760,7 +4760,7 @@
           <w:color w:val="2B2B2B"/>
           <w:sz w:val="26"/>
         </w:rPr>
-        <w:t xml:space="preserve">“Rosa wants to know if we’re a family that goes on the internet,” Mabs said. “She asked it like it was a disease. Are you a family that goes on the internet. In the group chat. With his cousins. There are nineteen people in that chat, Nora.”</w:t>
+        <w:t xml:space="preserve">“Rosa wants to know if we’re a family that goes on the internet,” Mabs said. “She asked it like it was a disease. In the group chat. With his cousins. There are nineteen people in that chat, Nora.”</w:t>
       </w:r>
     </w:p>
     <w:p>
@@ -5607,7 +5607,7 @@
           <w:color w:val="2B2B2B"/>
           <w:sz w:val="26"/>
         </w:rPr>
-        <w:t xml:space="preserve">“I thought we weren’t a family that goes on the internet.”</w:t>
+        <w:t xml:space="preserve">“I thought nobody in this family was on the internet.”</w:t>
       </w:r>
     </w:p>
     <w:p>
@@ -7329,7 +7329,7 @@
           <w:color w:val="2B2B2B"/>
           <w:sz w:val="26"/>
         </w:rPr>
-        <w:t xml:space="preserve">“Is this about the video?” he asked. “Because my mother-in-law is already on it. Well, my sister-in-law. Nora. She’s — I mean, I think she’s worried about me.” He laughed, a little helplessly. “I was the sober one. I keep telling people. I was the sober one.”</w:t>
+        <w:t xml:space="preserve">“Is this about the video?” he asked. “Because my mother-in-law is already on it. Well, my sister-in-law. Nora. She’s — I mean, I think she’s worried about me.” He laughed, a little helplessly. “I was the sober one. I keep telling people. Somebody had to drive the van.”</w:t>
       </w:r>
     </w:p>
     <w:p>
@@ -8774,7 +8774,7 @@
           <w:color w:val="2B2B2B"/>
           <w:sz w:val="26"/>
         </w:rPr>
-        <w:t xml:space="preserve">Mabs put the cloth down. She looked out the window at the dark sedan at the end of the block, still there in daylight, with a man in it reading something on his phone.</w:t>
+        <w:t xml:space="preserve">Mabs put the cloth down. She looked out the window at the sedan, still there in daylight, with a man in it reading something on his phone.</w:t>
       </w:r>
     </w:p>
     <w:p>
@@ -11016,7 +11016,7 @@
           <w:color w:val="2B2B2B"/>
           <w:sz w:val="26"/>
         </w:rPr>
-        <w:t xml:space="preserve">“The flyers,” she said. “At the wedding. Under every wiper. Starfall. Halo Systems.” She was remembering it as she said it: the drugstore-receipt paper, the moon in its ring, her own hand balling it up and missing the can. And then, eleven days late, a sentence in a loft over a barn: He found us the honeymoon. Spain. There’s an eclipse. He said it felt like something he was supposed to see.</w:t>
+        <w:t xml:space="preserve">“The flyers,” she said. “At the wedding. Under every wiper. Starfall. Halo Systems.” She was remembering it as she said it: the drugstore-receipt paper, the moon in its ring, her own hand balling it up and missing the can. And then, eleven days late, a sentence in a loft over a barn, about a honeymoon in Spain and an eclipse that her husband had found all on his own.</w:t>
       </w:r>
     </w:p>
     <w:p>
@@ -11634,7 +11634,7 @@
           <w:color w:val="2B2B2B"/>
           <w:sz w:val="26"/>
         </w:rPr>
-        <w:t xml:space="preserve">Nora sat with the phone in her lap and the engine off and the neon buzzing over the lot, and thought about her sister, alone in the house in Lissome with a husband who breathed like an ocean and a drawer full of things she was not ready to throw away. She thought about the man in the windbreaker who knew how long she had sat on a tub. She thought about her cards, in the freezer, behind the peas.</w:t>
+        <w:t xml:space="preserve">Nora sat with the phone in her lap and the engine off and the neon buzzing over the lot, and thought about her sister, alone in the house in Lissome with a husband who breathed like an ocean and a drawer full of keepsakes she could not throw out. She thought about the man in the windbreaker who knew how long she had sat on a tub. She thought about her cards, in the freezer, behind the peas.</w:t>
       </w:r>
     </w:p>
     <w:p>
@@ -13311,7 +13311,7 @@
           <w:color w:val="2B2B2B"/>
           <w:sz w:val="26"/>
         </w:rPr>
-        <w:t xml:space="preserve">“No. Nobody will tell me.”</w:t>
+        <w:t xml:space="preserve">“No. Nobody tells me anything.”</w:t>
       </w:r>
     </w:p>
     <w:p>
@@ -13411,7 +13411,7 @@
           <w:color w:val="2B2B2B"/>
           <w:sz w:val="26"/>
         </w:rPr>
-        <w:t xml:space="preserve">“Why are you telling me this?”</w:t>
+        <w:t xml:space="preserve">“Why would you tell me that?”</w:t>
       </w:r>
     </w:p>
     <w:p>
@@ -13660,27 +13660,27 @@
           <w:color w:val="2B2B2B"/>
           <w:sz w:val="26"/>
         </w:rPr>
-        <w:t xml:space="preserve">“Are you the gray-haired one?” she said. “Mabs said a gray-haired woman who looked like she’d rather be anywhere else.”</w:t>
-      </w:r>
-    </w:p>
-    <w:p>
-      <w:pPr>
-        <w:spacing w:line="400" w:lineRule="auto"/>
-        <w:ind w:firstLine="440"/>
-        <w:jc w:val="both"/>
-        <w:rPr>
-          <w:rFonts w:ascii="Georgia" w:hAnsi="Georgia"/>
-          <w:color w:val="2B2B2B"/>
-          <w:sz w:val="26"/>
-        </w:rPr>
-      </w:pPr>
-      <w:r>
-        <w:rPr>
-          <w:rFonts w:ascii="Georgia" w:hAnsi="Georgia"/>
-          <w:color w:val="2B2B2B"/>
-          <w:sz w:val="26"/>
-        </w:rPr>
-        <w:t xml:space="preserve">There was a pause. “That’s fair,” said Dana.</w:t>
+        <w:t xml:space="preserve">“Are you the gray-haired one?” she said. “Mabs said a gray-haired woman who seemed to want to be elsewhere.”</w:t>
+      </w:r>
+    </w:p>
+    <w:p>
+      <w:pPr>
+        <w:spacing w:line="400" w:lineRule="auto"/>
+        <w:ind w:firstLine="440"/>
+        <w:jc w:val="both"/>
+        <w:rPr>
+          <w:rFonts w:ascii="Georgia" w:hAnsi="Georgia"/>
+          <w:color w:val="2B2B2B"/>
+          <w:sz w:val="26"/>
+        </w:rPr>
+      </w:pPr>
+      <w:r>
+        <w:rPr>
+          <w:rFonts w:ascii="Georgia" w:hAnsi="Georgia"/>
+          <w:color w:val="2B2B2B"/>
+          <w:sz w:val="26"/>
+        </w:rPr>
+        <w:t xml:space="preserve">Dana considered it. “That’s fair,” she said.</w:t>
       </w:r>
     </w:p>
     <w:p>
@@ -14977,7 +14977,7 @@
           <w:color w:val="2B2B2B"/>
           <w:sz w:val="26"/>
         </w:rPr>
-        <w:t xml:space="preserve">“You have a wedding in Carmel on the eighteenth,” Jesse agreed. “And then?”</w:t>
+        <w:t xml:space="preserve">“Carmel, the eighteenth,” Jesse agreed. “And then?”</w:t>
       </w:r>
     </w:p>
     <w:p>
@@ -15256,7 +15256,7 @@
           <w:color w:val="2B2B2B"/>
           <w:sz w:val="26"/>
         </w:rPr>
-        <w:t xml:space="preserve">“It’s a little like that,” Nora admitted. “But that’s not why.”</w:t>
+        <w:t xml:space="preserve">“All right, a little,” Nora admitted. “But that’s not why.”</w:t>
       </w:r>
     </w:p>
     <w:p>
@@ -15296,7 +15296,7 @@
           <w:color w:val="2B2B2B"/>
           <w:sz w:val="26"/>
         </w:rPr>
-        <w:t xml:space="preserve">“The Fourth,” she said. “It was in his jeans. He folded it up like that. He put it in his pocket instead of the trash.” She looked at it. “And then on Wednesday I saw that he’d found it. In my drawer. And he folded it back up exactly the way I had, so I wouldn’t know he’d found it. He doesn’t think I notice things. He thinks you got all of those genes.”</w:t>
+        <w:t xml:space="preserve">“The Fourth,” she said. “It was in his jeans. He folded it up like that. He kept it instead of throwing it out.” She looked at it. “And then on Wednesday I saw that he’d found it. In my drawer. And he folded it back up exactly the way I had, so I wouldn’t know he’d found it. He doesn’t think I notice things. He thinks you got all of those genes.”</w:t>
       </w:r>
     </w:p>
     <w:p>
@@ -15376,7 +15376,7 @@
           <w:color w:val="2B2B2B"/>
           <w:sz w:val="26"/>
         </w:rPr>
-        <w:t xml:space="preserve">“A woman told me yesterday,” said Nora, “that a drawer is a very sensible place to start.”</w:t>
+        <w:t xml:space="preserve">“A woman told me yesterday,” said Nora, “that the drawer was a sensible start.”</w:t>
       </w:r>
     </w:p>
     <w:p>
@@ -16043,7 +16043,7 @@
           <w:color w:val="2B2B2B"/>
           <w:sz w:val="26"/>
         </w:rPr>
-        <w:t xml:space="preserve">“I build rockets. Built.”</w:t>
+        <w:t xml:space="preserve">“Rockets. Used to.”</w:t>
       </w:r>
     </w:p>
     <w:p>
@@ -16123,7 +16123,7 @@
           <w:color w:val="2B2B2B"/>
           <w:sz w:val="26"/>
         </w:rPr>
-        <w:t xml:space="preserve">Dana bent over the desk. She knew the Trojans the way every launch engineer knows the places you will never be asked to send anything: L4 and L5, sixty degrees ahead of Jupiter and sixty behind, where the Sun and the planet balance and a rock can sit for billions of years. Thousands of them, dark as coal. On the plates they were dots like any others. She laid one sheet over the other against the window, the way she had once laid two telemetry traces over each other to find the one that lied. Everything had moved. Everything had moved together, the whole swarm sliding a fraction along Jupiter’s orbit, as a swarm should. Except one dot, near the corner, which had moved a little less than its neighbours. Not much. Just enough to annoy her.</w:t>
+        <w:t xml:space="preserve">Dana bent over the desk. She knew the Trojans the way every launch engineer knows the places you will never be asked to send anything: L4 and L5, sixty degrees ahead of Jupiter and sixty behind, where the Sun and the planet balance and a rock can sit for billions of years. Thousands of them, dark as coal. On the plates they were dots like any others. She laid one sheet over the other against the window, the way she had once laid two telemetry traces over each other to find the one that lied. Everything had moved. Everything had moved together, the whole swarm sliding a fraction along Jupiter’s orbit, as a swarm should. Except one dot, near the corner, which had moved a little less than its neighbors. Not much. Just enough to annoy her.</w:t>
       </w:r>
     </w:p>
     <w:p>
@@ -16163,7 +16163,7 @@
           <w:color w:val="2B2B2B"/>
           <w:sz w:val="26"/>
         </w:rPr>
-        <w:t xml:space="preserve">“What is it?”</w:t>
+        <w:t xml:space="preserve">“What am I looking at?”</w:t>
       </w:r>
     </w:p>
     <w:p>
@@ -16402,7 +16402,7 @@
           <w:color w:val="2B2B2B"/>
           <w:sz w:val="26"/>
         </w:rPr>
-        <w:t xml:space="preserve">Dana did not move.</w:t>
+        <w:t xml:space="preserve">Dana kept very still.</w:t>
       </w:r>
     </w:p>
     <w:p>
@@ -16801,7 +16801,7 @@
           <w:color w:val="2B2B2B"/>
           <w:sz w:val="26"/>
         </w:rPr>
-        <w:t xml:space="preserve">She told him. The faucet in Ogden. The soft apologetic voice. Recommended by the file.</w:t>
+        <w:t xml:space="preserve">She gave it to him in order. The faucet in Ogden. The soft apologetic voice. Recommended by the file.</w:t>
       </w:r>
     </w:p>
     <w:p>
@@ -16841,7 +16841,7 @@
           <w:color w:val="2B2B2B"/>
           <w:sz w:val="26"/>
         </w:rPr>
-        <w:t xml:space="preserve">“Somebody wanted a launch engineer in that basement,” he said finally. “Before the curve steepened. Somebody who knows what a sail deployment looks like when it goes wrong.” He almost laughed. “They hired you. They actually hired you. The same people who bought my station. They put you there so that when this happened, there’d be someone at the Desk who could read what I was doing to the sky.”</w:t>
+        <w:t xml:space="preserve">“Someone decided they would need a launch engineer in that basement,” he said finally. “Before the curve steepened. Somebody who knows what a sail deployment looks like when it goes wrong.” He almost laughed. “They hired you. They actually hired you. The same people who bought my station. They put you there so that when this happened, there’d be someone at the Desk who could read what I was doing to the sky.”</w:t>
       </w:r>
     </w:p>
     <w:p>
@@ -17928,7 +17928,7 @@
           <w:color w:val="2B2B2B"/>
           <w:sz w:val="26"/>
         </w:rPr>
-        <w:t xml:space="preserve">“I wrote to the magazine,” said Rosa. “To ask them to send my letter on to her. They never answered.” She closed the album. “I have loved that boy for thirty-four years. I have changed his diapers and taught him to read and sat in the emergency room with him when he broke his wrist on the monkey bars and he didn’t cry then either. I have made him pancakes. Whatever he is, I made him pancakes.” Her voice did not crack. Mabs understood, suddenly, where her husband had learned not to cry. “But I have also, every year, on his birthday, lit a candle at St. Lawrence. For the other one.”</w:t>
+        <w:t xml:space="preserve">“I wrote to the magazine,” said Rosa. “To ask them to send my letter on to her. They never answered.” She pressed the album shut. “I have loved that boy for thirty-four years. I have changed his diapers and taught him to read and sat in the emergency room with him when he broke his wrist on the monkey bars and he didn’t cry then either. I have made him pancakes. Whatever he is, I made him pancakes.” Her voice did not crack. Mabs understood, suddenly, where her husband had learned not to cry. “But I have also, every year, on his birthday, lit a candle at St. Lawrence. For the other one.”</w:t>
       </w:r>
     </w:p>
     <w:p>
@@ -18167,7 +18167,7 @@
           <w:color w:val="2B2B2B"/>
           <w:sz w:val="26"/>
         </w:rPr>
-        <w:t xml:space="preserve">“You listen to me,” she said. “Nobody is fixing my son. Nobody is fixing your husband. Not the government with their little cars, not your sister with her camera, not some podcast man. If there is something wrong with him, he gets told. He gets told, and he decides. That is how I raised him. That is the only thing I know for certain I raised in him, whatever else somebody else put there.” She put her hand flat on the table, between the two gardening gloves. “Do you understand me?”</w:t>
+        <w:t xml:space="preserve">“You listen to me,” she said. “Nobody is fixing my son. Nobody is fixing your husband. Not the government with their little cars, not your sister with her camera, not some podcast man. If there is something wrong with him, he gets told. He gets told, and he decides. That is how I raised him. That is the only thing I know for certain I raised in him, whatever else somebody else put there.” She put her hand flat on the table, between the two gardening gloves. “Is that clear?”</w:t>
       </w:r>
     </w:p>
     <w:p>
@@ -18604,7 +18604,7 @@
           <w:color w:val="2B2B2B"/>
           <w:sz w:val="26"/>
         </w:rPr>
-        <w:t xml:space="preserve">He sat down beside her. He did not ask why. The cars were at the end of the block. The fireflies were coming up out of the grass the way they did in Indiana in July, by the thousand, a small cold green light that meant only, as he had explained to a room of nine angry teenagers on Monday, before the board, that somebody was looking for somebody.</w:t>
+        <w:t xml:space="preserve">He sat down beside her. He did not ask why. Down the street the cars had not moved. The fireflies were coming up out of the grass the way they did in Indiana in July, by the thousand, a small cold green light that meant only, as he had explained to a room of nine angry teenagers on Monday, before the board, that somebody was looking for somebody.</w:t>
       </w:r>
     </w:p>
     <w:p>
@@ -18704,7 +18704,7 @@
           <w:color w:val="2B2B2B"/>
           <w:sz w:val="26"/>
         </w:rPr>
-        <w:t xml:space="preserve">“I don’t know,” said Mabs. “But your mother says you get told. Whatever it is. You get told, and you decide.” She put her head on his shoulder. “That’s the deal. That’s the deal I married.”</w:t>
+        <w:t xml:space="preserve">“I don’t know,” said Mabs. “But your mother says you get told. Whatever it is. You get told, and you decide.” She put her head on his shoulder. “That’s the deal I married.”</w:t>
       </w:r>
     </w:p>
     <w:p>
@@ -18744,7 +18744,7 @@
           <w:color w:val="2B2B2B"/>
           <w:sz w:val="26"/>
         </w:rPr>
-        <w:t xml:space="preserve">“Okay,” he said. “That’s the deal.”</w:t>
+        <w:t xml:space="preserve">“All right,” he said. “Then it’s a deal.”</w:t>
       </w:r>
     </w:p>
     <w:p>
@@ -19073,7 +19073,7 @@
           <w:color w:val="2B2B2B"/>
           <w:sz w:val="26"/>
         </w:rPr>
-        <w:t xml:space="preserve">“I’ll tell you something Mabs doesn’t know all of,” he said. “In college I woke up one morning in my car, in the parking lot of a hospital in Columbus. Ohio. I was at Ball State. I don’t remember the drive. Two hours, and nothing. I had a parking ticket on the windshield and a full tank of gas I don’t remember buying. I went inside, because I was at a hospital and it seemed rude not to, and a doctor said migraine aura and gave me a pamphlet.” He turned a peach over in his hand. “It happens. Twice a year, three times. A thing like weather comes in behind my eyes, and then it goes, and I’ve lost a piece of the afternoon. It’s been happening more. This spring I started thinking it was a tumor. I thought, I’ll get married, and then I’ll find out it’s a tumor, and Mabs will have had one good summer.”</w:t>
+        <w:t xml:space="preserve">“I’ll tell you something Mabs doesn’t know all of,” he said. “In college I woke up one morning in my car, in the parking lot of a hospital in Columbus. Ohio. I was at Ball State. I have no memory of the drive. Two hours, and nothing. I had a parking ticket on the windshield and a full tank of gas I don’t remember buying. I went inside, because I was at a hospital and it seemed rude not to, and a doctor said migraine aura and gave me a pamphlet.” He turned a peach over in his hand. “It happens. Twice a year, three times. A thing like weather comes in behind my eyes, and then it goes, and I’ve lost a piece of the afternoon. It’s been happening more. This spring I started thinking it was a tumor. I thought, I’ll get married, and then I’ll find out it’s a tumor, and Mabs will have had one good summer.”</w:t>
       </w:r>
     </w:p>
     <w:p>
@@ -19153,7 +19153,7 @@
           <w:color w:val="2B2B2B"/>
           <w:sz w:val="26"/>
         </w:rPr>
-        <w:t xml:space="preserve">“I don’t know yet,” she said. That part was true.</w:t>
+        <w:t xml:space="preserve">“I don’t have the whole picture,” she said. That part was true.</w:t>
       </w:r>
     </w:p>
     <w:p>
@@ -20168,7 +20168,7 @@
           <w:color w:val="2B2B2B"/>
           <w:sz w:val="26"/>
         </w:rPr>
-        <w:t xml:space="preserve">He flinched a quarter-second late, like the news had to come down a long hallway.</w:t>
+        <w:t xml:space="preserve">He flinched a quarter-second late, as if the message had gone round by another road.</w:t>
       </w:r>
     </w:p>
     <w:p>
@@ -20387,7 +20387,7 @@
           <w:color w:val="2B2B2B"/>
           <w:sz w:val="26"/>
         </w:rPr>
-        <w:t xml:space="preserve">“Infrared LEDs,” she said. “Near-infrared. Your eyes can’t see it. A phone camera can — the sensors pick up a little past red, that’s why you can see a TV remote flash through your phone. Pump enough of it out of a collar and a lot of phone cameras that look at you see a bright smudge where your face should be. Japanese researchers built a pair of glasses that did it in 2012. It’s in the literature. It’s practically a science fair project.” She shook her head, delighted and appalled. “Forty thousand years of technology and they read the same papers I do.”</w:t>
+        <w:t xml:space="preserve">“Infrared LEDs,” she said. “Near-infrared. Your eyes can’t see it. A phone camera can — the sensors pick up a little past red, that’s why you can see a TV remote flash through your phone. Pump enough of it out of a collar and a lot of phone cameras that look at you see a bright smudge where your face should be. Japanese researchers built a pair of glasses that did it in 2012. You can look it up. It’s practically a science fair project.” She shook her head, delighted and appalled. “Forty thousand years of technology and they read the same papers I do.”</w:t>
       </w:r>
     </w:p>
     <w:p>
@@ -20486,7 +20486,7 @@
           <w:color w:val="2B2B2B"/>
           <w:sz w:val="26"/>
         </w:rPr>
-        <w:t xml:space="preserve">The reaction was immediate and total. His whole body convulsed. Paper and a legal pad went onto the floor. He vomited, violently, again and again, and then sat back against the trailer wall with his eyes streaming and stopped speaking English as if he had never learned it. What came out instead was a string of sounds Nora, watching from the doorway with a Directorate blanket around her shoulders, recognized with a jolt that went all the way down: a clipped, falling syllable, almost a cough, almost a name. The sound on Gary Huff’s tape.</w:t>
+        <w:t xml:space="preserve">The reaction was immediate and total. His whole body convulsed. Paper and a legal pad went onto the floor. He vomited, violently, again and again, and then sat back against the trailer wall with his eyes streaming and stopped speaking English as if he had never learned it. What came out instead was a string of sounds Nora, watching from the doorway with a Directorate blanket around her shoulders, recognized with a jolt that went all the way down: the clipped syllable from the tape, falling away at the end like a cough. The sound on Gary Huff’s tape.</w:t>
       </w:r>
     </w:p>
     <w:p>
@@ -20805,7 +20805,7 @@
           <w:color w:val="2B2B2B"/>
           <w:sz w:val="26"/>
         </w:rPr>
-        <w:t xml:space="preserve">“I think,” he said, “we’re about to find out whether it wants to ask, or wants to take.” He looked at her. “I don’t think it knows yet either.”</w:t>
+        <w:t xml:space="preserve">“I think,” he said, “we’re about to find out whether it wants to ask, or wants to take.” He turned toward her. “I don’t think it knows yet either.”</w:t>
       </w:r>
     </w:p>
     <w:p>
@@ -21073,67 +21073,67 @@
           <w:color w:val="2B2B2B"/>
           <w:sz w:val="26"/>
         </w:rPr>
-        <w:t xml:space="preserve">“I don’t know yet. Are you?”</w:t>
-      </w:r>
-    </w:p>
-    <w:p>
-      <w:pPr>
-        <w:spacing w:line="400" w:lineRule="auto"/>
-        <w:ind w:firstLine="440"/>
-        <w:jc w:val="both"/>
-        <w:rPr>
-          <w:rFonts w:ascii="Georgia" w:hAnsi="Georgia"/>
-          <w:color w:val="2B2B2B"/>
-          <w:sz w:val="26"/>
-        </w:rPr>
-      </w:pPr>
-      <w:r>
-        <w:rPr>
-          <w:rFonts w:ascii="Georgia" w:hAnsi="Georgia"/>
-          <w:color w:val="2B2B2B"/>
-          <w:sz w:val="26"/>
-        </w:rPr>
-        <w:t xml:space="preserve">“I don’t know yet.” He looked at the curved wall. It was pale gray and slightly soft, like the inside of a bicycle helmet. “Where are we?”</w:t>
-      </w:r>
-    </w:p>
-    <w:p>
-      <w:pPr>
-        <w:spacing w:line="400" w:lineRule="auto"/>
-        <w:ind w:firstLine="440"/>
-        <w:jc w:val="both"/>
-        <w:rPr>
-          <w:rFonts w:ascii="Georgia" w:hAnsi="Georgia"/>
-          <w:color w:val="2B2B2B"/>
-          <w:sz w:val="26"/>
-        </w:rPr>
-      </w:pPr>
-      <w:r>
-        <w:rPr>
-          <w:rFonts w:ascii="Georgia" w:hAnsi="Georgia"/>
-          <w:color w:val="2B2B2B"/>
-          <w:sz w:val="26"/>
-        </w:rPr>
-        <w:t xml:space="preserve">“About thirty-six thousand kilometers above the equator, over the Amazon,” said a voice from the doorway, “turning at the same rate as the Earth, so that if you could see out, which you can’t, you’d see the same face of it all day.” A man stepped in. He was ordinary to look at: medium height, a runner’s build, a voice pitched to be forgettable in a crowd, which Nora would understand, by the end of the night, to be the entire design brief. “You’re aboard the tender. The shore boat. Not the ship. The ship is out in the Trojans, about forty-eight light-minutes from here this month. Years away at any speed this hull still has. Nobody’s taking you there. Nobody’s taking you anywhere except back.” He paused. “I’m sorry about the sedative. I argued against it. I lost.”</w:t>
-      </w:r>
-    </w:p>
-    <w:p>
-      <w:pPr>
-        <w:spacing w:line="400" w:lineRule="auto"/>
-        <w:ind w:firstLine="440"/>
-        <w:jc w:val="both"/>
-        <w:rPr>
-          <w:rFonts w:ascii="Georgia" w:hAnsi="Georgia"/>
-          <w:color w:val="2B2B2B"/>
-          <w:sz w:val="26"/>
-        </w:rPr>
-      </w:pPr>
-      <w:r>
-        <w:rPr>
-          <w:rFonts w:ascii="Georgia" w:hAnsi="Georgia"/>
-          <w:color w:val="2B2B2B"/>
-          <w:sz w:val="26"/>
-        </w:rPr>
-        <w:t xml:space="preserve">“Who are you?” said Nora.</w:t>
+        <w:t xml:space="preserve">“Not sure yet. Are you?”</w:t>
+      </w:r>
+    </w:p>
+    <w:p>
+      <w:pPr>
+        <w:spacing w:line="400" w:lineRule="auto"/>
+        <w:ind w:firstLine="440"/>
+        <w:jc w:val="both"/>
+        <w:rPr>
+          <w:rFonts w:ascii="Georgia" w:hAnsi="Georgia"/>
+          <w:color w:val="2B2B2B"/>
+          <w:sz w:val="26"/>
+        </w:rPr>
+      </w:pPr>
+      <w:r>
+        <w:rPr>
+          <w:rFonts w:ascii="Georgia" w:hAnsi="Georgia"/>
+          <w:color w:val="2B2B2B"/>
+          <w:sz w:val="26"/>
+        </w:rPr>
+        <w:t xml:space="preserve">“Ask me in a minute.” He looked at the curved wall. It was pale gray and slightly soft, like the inside of a bicycle helmet. “Where are we?”</w:t>
+      </w:r>
+    </w:p>
+    <w:p>
+      <w:pPr>
+        <w:spacing w:line="400" w:lineRule="auto"/>
+        <w:ind w:firstLine="440"/>
+        <w:jc w:val="both"/>
+        <w:rPr>
+          <w:rFonts w:ascii="Georgia" w:hAnsi="Georgia"/>
+          <w:color w:val="2B2B2B"/>
+          <w:sz w:val="26"/>
+        </w:rPr>
+      </w:pPr>
+      <w:r>
+        <w:rPr>
+          <w:rFonts w:ascii="Georgia" w:hAnsi="Georgia"/>
+          <w:color w:val="2B2B2B"/>
+          <w:sz w:val="26"/>
+        </w:rPr>
+        <w:t xml:space="preserve">“About thirty-six thousand kilometers above the equator, over the Amazon,” said a voice from the doorway, “turning at the same rate as the Earth, so that if you could see out, which you can’t, you’d see the same face of it all day.” A man stepped in. He was ordinary to look at: medium height, a runner’s build, a voice pitched to be forgettable in a crowd, which Nora would understand, by the end of the night, to be the entire design brief. “You’re aboard the tender, the shore boat, and not the ship. The ship is out in the Trojans, about forty-eight light-minutes from here this month. Years away at any speed this hull still has. Nobody’s taking you there. Nobody’s taking you anywhere except back.” He paused. “I’m sorry about the sedative. I argued against it. I lost.”</w:t>
+      </w:r>
+    </w:p>
+    <w:p>
+      <w:pPr>
+        <w:spacing w:line="400" w:lineRule="auto"/>
+        <w:ind w:firstLine="440"/>
+        <w:jc w:val="both"/>
+        <w:rPr>
+          <w:rFonts w:ascii="Georgia" w:hAnsi="Georgia"/>
+          <w:color w:val="2B2B2B"/>
+          <w:sz w:val="26"/>
+        </w:rPr>
+      </w:pPr>
+      <w:r>
+        <w:rPr>
+          <w:rFonts w:ascii="Georgia" w:hAnsi="Georgia"/>
+          <w:color w:val="2B2B2B"/>
+          <w:sz w:val="26"/>
+        </w:rPr>
+        <w:t xml:space="preserve">“Who are you, exactly?” said Nora.</w:t>
       </w:r>
     </w:p>
     <w:p>
@@ -21471,7 +21471,7 @@
           <w:color w:val="2B2B2B"/>
           <w:sz w:val="26"/>
         </w:rPr>
-        <w:t xml:space="preserve">“I was born in Columbus, Ohio,” the Escort said, “in 1990. That’s not true. A baby was born in Columbus, Ohio, in 1990, to a woman named Sheila who worked at a bank, and four hours after he was born he was taken to the nursery for observation, and up here. And what went back down to Sheila was me.” He said it the way a man discloses a chronic condition. “Grown in a tank like those, over nine months, from cells they took from her blood when she was six months pregnant. Fetal cells. They cross the placenta, a few of them; they’re in every pregnant woman’s blood. Your own doctors use them for tests. The ship uses them for other things. What they grow from those cells is a twin. Genetically, I am that baby. Same face. Same blood. With one addition.” He tapped the base of his skull, lightly, the way a man knocks wood. “About the size of a grain of rice.”</w:t>
+        <w:t xml:space="preserve">“I was born in Columbus, Ohio,” the Escort said, “in 1990. That’s not true. A baby was born in Columbus, Ohio, in 1990, to a woman named Sheila who worked at a bank, and four hours after he was born he was taken to the nursery for observation, and up here. And what went back down to Sheila was me.” He said it the way a man discloses a chronic condition. “Grown in a tank like those, over nine months, from cells they took from her blood when she was six months pregnant. Fetal cells. They cross the placenta, a few of them; they’re in every pregnant woman’s blood. Your own doctors use them for tests. The ship uses them for other things. What they grow from those cells is a twin. Genetically, I am that baby. Same face. Same blood. Plus one thing.” He tapped the base of his skull, lightly, the way a man knocks wood. “About the size of a grain of rice.”</w:t>
       </w:r>
     </w:p>
     <w:p>
@@ -21591,7 +21591,7 @@
           <w:color w:val="2B2B2B"/>
           <w:sz w:val="26"/>
         </w:rPr>
-        <w:t xml:space="preserve">“Why?” said Jesse. His voice was hoarse. “Why would they — what do they want with babies?”</w:t>
+        <w:t xml:space="preserve">“Why?” said Jesse. His voice was hoarse. “Babies? Why babies?”</w:t>
       </w:r>
     </w:p>
     <w:p>
@@ -21767,7 +21767,7 @@
           <w:color w:val="2B2B2B"/>
           <w:sz w:val="26"/>
         </w:rPr>
-        <w:t xml:space="preserve">“In bodies that can live on a planet. Their language, their memory, their committees — God help us, their committees — in bodies that can breathe your air and eat your food.” He nodded at the floor. “The taken ones grow up down there as theirs. The foundlings. A little over four thousand now. More were taken. Not all of them lived; the ship is a hard place to be a baby. Some have children of their own by now, born up here, and the oldest of those are about twenty-five.” He tapped his skull again. “And the ones like me, grown and sent down to fill the cribs, are the other half. The listening post. Our implants send our lives up a few times a year, in visits we don’t remember. We’re how they found out what a gas station is.”</w:t>
+        <w:t xml:space="preserve">“In bodies that can live on a planet. Their language, their memory, their committees — God help us, their committees — in bodies that can breathe your air and eat your food.” He tipped his chin at the deck. “The taken ones grow up down there as theirs. The foundlings. A little over four thousand now. More were taken. Not all of them lived; the ship is a hard place to be a baby. Some have children of their own by now, born up here, and the oldest of those are about twenty-five.” He tapped his skull again. “And the ones like me, grown and sent down to fill the cribs, are the other half. The listening post. Our implants send our lives up a few times a year, in visits we don’t remember. We’re how they found out what a gas station is.”</w:t>
       </w:r>
     </w:p>
     <w:p>
@@ -22106,7 +22106,7 @@
           <w:color w:val="2B2B2B"/>
           <w:sz w:val="26"/>
         </w:rPr>
-        <w:t xml:space="preserve">“Dominic,” she said.</w:t>
+        <w:t xml:space="preserve">“Dominic.” It came out flat, not a question.</w:t>
       </w:r>
     </w:p>
     <w:p>
@@ -22504,7 +22504,7 @@
           <w:color w:val="2B2B2B"/>
           <w:sz w:val="26"/>
         </w:rPr>
-        <w:t xml:space="preserve">“That’s it. An ask, and a yes.” He spread his hands. “Not a broadcast. They will never accept a broadcast. A broadcast is what they do to you. It has to come through one of us — someone who heard it, in person, and chose to carry it. Through an implant, while the channel’s open. And the channel is only ever open all at once, for everyone, at one moment in forty-six years.”</w:t>
+        <w:t xml:space="preserve">“That’s it. An ask, and a yes.” He opened his palms. “Not a broadcast. They will never accept a broadcast. A broadcast is what they do to you. It has to come through one of us — someone who heard it, in person, and chose to carry it. Through an implant, while the channel’s open. And the channel is only ever open all at once, for everyone, at one moment in forty-six years.”</w:t>
       </w:r>
     </w:p>
     <w:p>
@@ -22603,7 +22603,7 @@
           <w:color w:val="2B2B2B"/>
           <w:sz w:val="26"/>
         </w:rPr>
-        <w:t xml:space="preserve">The room behind the hatch was small and very clean. It had one long bench on one side of a table and, on the other, two stools. The gray-bearded man from the corridor sat on one of them, his smock shiny at the elbows. On the other sat a man in a windbreaker in no color anyone would remember. Nora knew him before her eyes did. Her stomach knew him from a rest area outside Hawthorne.</w:t>
+        <w:t xml:space="preserve">The room behind the hatch was small and very clean. It had one long bench on one side of a table and, on the other, two stools. The gray-bearded man from the corridor sat on one of them, his smock shiny at the elbows. On the other sat a man in a windbreaker of no particular color. Nora knew him before her eyes did. Her stomach knew him from a rest area outside Hawthorne.</w:t>
       </w:r>
     </w:p>
     <w:p>
@@ -23003,7 +23003,7 @@
           <w:color w:val="2B2B2B"/>
           <w:sz w:val="26"/>
         </w:rPr>
-        <w:t xml:space="preserve">Nora put her hand over his. Not to stop him. To take the thing. He let her. She switched it off, and the red light went out, and she set the recorder on the table in front of the officer and kept her fingers on it a moment longer than she needed to, because she had something to say and wanted to say it with her hand still there.</w:t>
+        <w:t xml:space="preserve">Nora put her hand over his. Not to stop him. To take the thing. His fingers opened. She switched it off, and the red light went out, and she set the recorder on the table in front of the officer and kept her fingers on it a moment longer than she needed to, because she had something to say and wanted to say it with her hand still there.</w:t>
       </w:r>
     </w:p>
     <w:p>
@@ -23043,7 +23043,7 @@
           <w:color w:val="2B2B2B"/>
           <w:sz w:val="26"/>
         </w:rPr>
-        <w:t xml:space="preserve">The Escort translated. It took longer than four sentences should.</w:t>
+        <w:t xml:space="preserve">The Escort put it into English. It took longer than four sentences should.</w:t>
       </w:r>
     </w:p>
     <w:p>
@@ -23143,7 +23143,7 @@
           <w:color w:val="2B2B2B"/>
           <w:sz w:val="26"/>
         </w:rPr>
-        <w:t xml:space="preserve">The man in the windbreaker laughed, pleasantly. “She’s good,” he said. “I told you she was good. She did that face in a coffee shop to a woman from the liaison office.” He spread his hands. “It changes nothing. Sample them both.”</w:t>
+        <w:t xml:space="preserve">The man in the windbreaker laughed, pleasantly. “She’s good,” he said. “I told you she was good. She did that face in a coffee shop to a woman from the liaison office.” He shrugged. “It changes nothing. Sample them both.”</w:t>
       </w:r>
     </w:p>
     <w:p>
@@ -23462,7 +23462,7 @@
           <w:color w:val="2B2B2B"/>
           <w:sz w:val="26"/>
         </w:rPr>
-        <w:t xml:space="preserve">“Are you hurt?”</w:t>
+        <w:t xml:space="preserve">“Is anyone hurt?”</w:t>
       </w:r>
     </w:p>
     <w:p>
@@ -23502,7 +23502,7 @@
           <w:color w:val="2B2B2B"/>
           <w:sz w:val="26"/>
         </w:rPr>
-        <w:t xml:space="preserve">There was a silence on the line. Then Dana said, very carefully, “How do you know that name?”</w:t>
+        <w:t xml:space="preserve">The line went quiet. Then Dana said, very carefully, “How do you know that name?”</w:t>
       </w:r>
     </w:p>
     <w:p>
@@ -23651,7 +23651,7 @@
           <w:color w:val="2B2B2B"/>
           <w:sz w:val="26"/>
         </w:rPr>
-        <w:t xml:space="preserve">A man with no wallet and no coat walked into the emergency department of a hospital there at two in the morning and put an orderly through a supply cart when the orderly asked him to sit. It took four people to get him on the floor. He did not swear. He did not speak. He bit. The psychiatrist on call, a man named Carl Daniels, came in from home with his shirt buttoned wrong and found the patient already in restraints, staring at the ceiling tiles as if reading a language printed on them. In the hallway a security guard was wrapping his own hand and saying, to nobody, that the guy had looked at him first like he was a piece of furniture that had started talking.</w:t>
+        <w:t xml:space="preserve">A man with no wallet and no coat walked into the emergency department of a hospital there at two in the morning and put an orderly through a supply cart when the orderly asked him to sit. It took four people to get him on the floor. He did not swear. He did not say a word. He bit. The psychiatrist on call, a man named Carl Daniels, came in from home with his shirt buttoned wrong and found the patient already in restraints, staring at the ceiling tiles as if reading a language printed on them. In the hallway a security guard was wrapping his own hand and saying, to nobody, that the guy had looked at him first like he was a piece of furniture that had started talking.</w:t>
       </w:r>
     </w:p>
     <w:p>
@@ -23751,7 +23751,7 @@
           <w:color w:val="2B2B2B"/>
           <w:sz w:val="26"/>
         </w:rPr>
-        <w:t xml:space="preserve">“They transferred him at six,” said Daniels. “I don’t know where. Nobody will tell me. The transfer order came from an office I’ve never heard of, signed by a doctor who doesn’t work here.”</w:t>
+        <w:t xml:space="preserve">“They transferred him at six,” said Daniels. “Where to, nobody will say. The transfer order came from an office I’ve never heard of, signed by a doctor who doesn’t work here.”</w:t>
       </w:r>
     </w:p>
     <w:p>
@@ -24030,7 +24030,7 @@
           <w:color w:val="2B2B2B"/>
           <w:sz w:val="26"/>
         </w:rPr>
-        <w:t xml:space="preserve">“No,” said Kade. “That’s for somebody else.”</w:t>
+        <w:t xml:space="preserve">“Not you,” said Kade. “That’s for somebody else.”</w:t>
       </w:r>
     </w:p>
     <w:p>
@@ -24309,7 +24309,7 @@
           <w:color w:val="2B2B2B"/>
           <w:sz w:val="26"/>
         </w:rPr>
-        <w:t xml:space="preserve">There was a pause.</w:t>
+        <w:t xml:space="preserve">A beat went by.</w:t>
       </w:r>
     </w:p>
     <w:p>
@@ -24648,7 +24648,7 @@
           <w:color w:val="2B2B2B"/>
           <w:sz w:val="26"/>
         </w:rPr>
-        <w:t xml:space="preserve">“Yes,” said Gladys. “But Sacramento is not very far from Reno. I looked at the map in the atrium. It is perhaps one hundred and thirty miles. The airplane flies from Reno to Sacramento, it picks up the medicine for your boy, it flies back to Reno, it picks up Mr. Feld, and it flies to Denver. Mr. Feld does not need to go to Brussels tonight. Mr. Feld can sit in Denver and eat toast. Brussels will still be there in the morning.” She picked up a coffee and held it out to him. “It is one plane. It goes the long way round. Airplanes do not mind.”</w:t>
+        <w:t xml:space="preserve">“Yes,” said Gladys. “But Sacramento is not very far from Reno. I looked at the map in the atrium. It is perhaps one hundred and thirty miles. The airplane flies from Reno to Sacramento, it picks up the medicine for your boy, it flies back to Reno, it picks up Mr. Feld, and it flies to Denver. Mr. Feld does not need to go to Brussels tonight. Mr. Feld can sit in Denver and eat toast. Brussels will still be there in the morning.” She picked up a coffee and held it out to him. “One plane, yes. It goes the long way round. Airplanes do not mind.”</w:t>
       </w:r>
     </w:p>
     <w:p>
@@ -24847,27 +24847,27 @@
           <w:color w:val="2B2B2B"/>
           <w:sz w:val="26"/>
         </w:rPr>
-        <w:t xml:space="preserve">“You’ve been up,” he said. It was not a question.</w:t>
-      </w:r>
-    </w:p>
-    <w:p>
-      <w:pPr>
-        <w:spacing w:line="400" w:lineRule="auto"/>
-        <w:ind w:firstLine="440"/>
-        <w:jc w:val="both"/>
-        <w:rPr>
-          <w:rFonts w:ascii="Georgia" w:hAnsi="Georgia"/>
-          <w:color w:val="2B2B2B"/>
-          <w:sz w:val="26"/>
-        </w:rPr>
-      </w:pPr>
-      <w:r>
-        <w:rPr>
-          <w:rFonts w:ascii="Georgia" w:hAnsi="Georgia"/>
-          <w:color w:val="2B2B2B"/>
-          <w:sz w:val="26"/>
-        </w:rPr>
-        <w:t xml:space="preserve">“How can you tell?”</w:t>
+        <w:t xml:space="preserve">“You’ve been up,” he said. He did not wait for an answer.</w:t>
+      </w:r>
+    </w:p>
+    <w:p>
+      <w:pPr>
+        <w:spacing w:line="400" w:lineRule="auto"/>
+        <w:ind w:firstLine="440"/>
+        <w:jc w:val="both"/>
+        <w:rPr>
+          <w:rFonts w:ascii="Georgia" w:hAnsi="Georgia"/>
+          <w:color w:val="2B2B2B"/>
+          <w:sz w:val="26"/>
+        </w:rPr>
+      </w:pPr>
+      <w:r>
+        <w:rPr>
+          <w:rFonts w:ascii="Georgia" w:hAnsi="Georgia"/>
+          <w:color w:val="2B2B2B"/>
+          <w:sz w:val="26"/>
+        </w:rPr>
+        <w:t xml:space="preserve">“How do you know that?”</w:t>
       </w:r>
     </w:p>
     <w:p>
@@ -25026,47 +25026,47 @@
           <w:color w:val="2B2B2B"/>
           <w:sz w:val="26"/>
         </w:rPr>
-        <w:t xml:space="preserve">“Six months ago,” he said, “a woman I respect very much sat me down in a room in Brussels and showed me an X-ray of my own skull, taken when I was nine, after I fell off a bicycle in Zanesville. There was a shadow on it the size of a grain of rice. She told me what it was. She told me what I was. She told me what my mother —” he stopped. “What the woman who raised me had lost. She did it very kindly. And then she asked me to work for her, because I am the only person anyone has found who can understand the ship from the inside. When I let myself, I can. It’s like a second language you learned as a child and forgot. It comes back in dreams. I wake up and I know the word for things that don’t exist down here.” He looked at his hands. “Every day since then, someone has asked me what they are going to do. Every day I have told them. And every day they have decided what to do about it without asking me what I think we should do. I’m a dictionary. Not a delegate.” He picked up the bus ticket. “I’d like to be one person for a while. Just one. In Salt Lake, or wherever. Before Starfall decides what I am.”</w:t>
-      </w:r>
-    </w:p>
-    <w:p>
-      <w:pPr>
-        <w:spacing w:line="400" w:lineRule="auto"/>
-        <w:ind w:firstLine="440"/>
-        <w:jc w:val="both"/>
-        <w:rPr>
-          <w:rFonts w:ascii="Georgia" w:hAnsi="Georgia"/>
-          <w:color w:val="2B2B2B"/>
-          <w:sz w:val="26"/>
-        </w:rPr>
-      </w:pPr>
-      <w:r>
-        <w:rPr>
-          <w:rFonts w:ascii="Georgia" w:hAnsi="Georgia"/>
-          <w:color w:val="2B2B2B"/>
-          <w:sz w:val="26"/>
-        </w:rPr>
-        <w:t xml:space="preserve">Nora looked at him. She thought of Rosa’s candle, and the Reader’s Digest clipping, and four sentences from a woman in Zanesville that nobody had ever answered.</w:t>
-      </w:r>
-    </w:p>
-    <w:p>
-      <w:pPr>
-        <w:spacing w:line="400" w:lineRule="auto"/>
-        <w:ind w:firstLine="440"/>
-        <w:jc w:val="both"/>
-        <w:rPr>
-          <w:rFonts w:ascii="Georgia" w:hAnsi="Georgia"/>
-          <w:color w:val="2B2B2B"/>
-          <w:sz w:val="26"/>
-        </w:rPr>
-      </w:pPr>
-      <w:r>
-        <w:rPr>
-          <w:rFonts w:ascii="Georgia" w:hAnsi="Georgia"/>
-          <w:color w:val="2B2B2B"/>
-          <w:sz w:val="26"/>
-        </w:rPr>
-        <w:t xml:space="preserve">“Your mother wrote a letter to a magazine,” she said. “In 1998. She said she lost three hours on a drive to the grocery store when she was pregnant with you, and woke up with a bruise on her arm, and that when you were born they took you away for observation. She asked if anyone else had a story like that.”</w:t>
+        <w:t xml:space="preserve">“Six months ago,” he said, “a woman I respect very much sat me down in a room in Brussels and showed me an X-ray of my own skull, taken when I was nine, after I fell off a bicycle in Zanesville. There was a shadow on it the size of a grain of rice. She told me what it was. She told me what I was. She told me what my mother —” he stopped. “What the woman who raised me had lost. She did it very kindly. And then she asked me to work for her, because I am the only person anyone has found who can understand the ship from the inside. When I let myself, I can. It’s like a second language you learned as a child and forgot. It comes back in dreams. I wake up and I know the word for things that don’t exist down here.” He turned his hands over. “Every day since then, someone has asked me what they are going to do. Every day I have told them. And every day they have decided what to do about it without asking me what I think we should do. I’m a dictionary. Not a delegate.” He picked up the bus ticket. “I’d like to be one person for a while. Just one. In Salt Lake, or wherever. Before Starfall decides what I am.”</w:t>
+      </w:r>
+    </w:p>
+    <w:p>
+      <w:pPr>
+        <w:spacing w:line="400" w:lineRule="auto"/>
+        <w:ind w:firstLine="440"/>
+        <w:jc w:val="both"/>
+        <w:rPr>
+          <w:rFonts w:ascii="Georgia" w:hAnsi="Georgia"/>
+          <w:color w:val="2B2B2B"/>
+          <w:sz w:val="26"/>
+        </w:rPr>
+      </w:pPr>
+      <w:r>
+        <w:rPr>
+          <w:rFonts w:ascii="Georgia" w:hAnsi="Georgia"/>
+          <w:color w:val="2B2B2B"/>
+          <w:sz w:val="26"/>
+        </w:rPr>
+        <w:t xml:space="preserve">Nora held his gaze. She thought of Rosa’s candle, and the Reader’s Digest clipping, and four sentences from a woman in Zanesville that nobody had ever answered.</w:t>
+      </w:r>
+    </w:p>
+    <w:p>
+      <w:pPr>
+        <w:spacing w:line="400" w:lineRule="auto"/>
+        <w:ind w:firstLine="440"/>
+        <w:jc w:val="both"/>
+        <w:rPr>
+          <w:rFonts w:ascii="Georgia" w:hAnsi="Georgia"/>
+          <w:color w:val="2B2B2B"/>
+          <w:sz w:val="26"/>
+        </w:rPr>
+      </w:pPr>
+      <w:r>
+        <w:rPr>
+          <w:rFonts w:ascii="Georgia" w:hAnsi="Georgia"/>
+          <w:color w:val="2B2B2B"/>
+          <w:sz w:val="26"/>
+        </w:rPr>
+        <w:t xml:space="preserve">“Your mother wrote a letter to a magazine,” she said. “In 1998. She said that while she was carrying you she lost three hours somewhere between her house and the grocery store, and came to with a bruise on her arm, and that after you were born they took you away for observation. She asked if anyone else had a story like that.”</w:t>
       </w:r>
     </w:p>
     <w:p>
@@ -25146,7 +25146,7 @@
           <w:color w:val="2B2B2B"/>
           <w:sz w:val="26"/>
         </w:rPr>
-        <w:t xml:space="preserve">“And on the ship,” Nora said, “there’s a man on the council. Third seat, harvest committee. He’s been trying to get the asking clause onto the agenda for nine years and losing by a smaller margin every time. He was taken from a hospital in Zanesville in 1984.”</w:t>
+        <w:t xml:space="preserve">“And on the ship,” Nora said, “there’s a man on the council. Third seat, harvest committee. He’s been trying to get the asking clause onto the agenda for nine years and losing by a smaller margin every time. His hospital was in Zanesville. The year was 1984.”</w:t>
       </w:r>
     </w:p>
     <w:p>
@@ -25206,7 +25206,7 @@
           <w:color w:val="2B2B2B"/>
           <w:sz w:val="26"/>
         </w:rPr>
-        <w:t xml:space="preserve">“Yes,” said Nora. “And I think he’s going to need somebody down here who isn’t a dictionary.”</w:t>
+        <w:t xml:space="preserve">“Yes.” Nora nodded. “And I think he’s going to need somebody down here who isn’t a dictionary.”</w:t>
       </w:r>
     </w:p>
     <w:p>
@@ -25584,7 +25584,7 @@
           <w:color w:val="2B2B2B"/>
           <w:sz w:val="26"/>
         </w:rPr>
-        <w:t xml:space="preserve">“I don’t know yet,” she said. “But his mother says he gets told, and he decides. I’d like to try it her way first.”</w:t>
+        <w:t xml:space="preserve">“I haven’t decided,” she said. “But his mother says he gets told, and he decides. I’d like to try it her way first.”</w:t>
       </w:r>
     </w:p>
     <w:p>
@@ -26012,7 +26012,7 @@
           <w:color w:val="2B2B2B"/>
           <w:sz w:val="26"/>
         </w:rPr>
-        <w:t xml:space="preserve">Feld spread his hands. “I don’t know. Nobody knows. Nobody on the ship knows either. That animal is the single most unexplained thing in this entire story, and I include the forty-thousand-year-old generation ship.” He almost smiled. “My best guess is that alpacas have a very good nose and very strong opinions, and it walked out of a field two roads over because it smelled something it didn’t like, and then it found Mabs and decided she needed a chaperone. Sometimes an animal is just an animal. That’s the most frightening thing I’ve said all afternoon, and nobody believes me.”</w:t>
+        <w:t xml:space="preserve">Feld spread his hands. “Nobody knows. Nobody on the ship knows either. That animal is the single most unexplained thing in this entire story, and I include the forty-thousand-year-old generation ship.” He almost smiled. “My best guess is that alpacas have a very good nose and very strong opinions, and it walked out of a field two roads over because it smelled something it didn’t like, and then it found Mabs and decided she needed a chaperone. Sometimes an animal is just an animal. That’s the most frightening thing I’ve said all afternoon, and nobody believes me.”</w:t>
       </w:r>
     </w:p>
     <w:p>
@@ -26191,7 +26191,7 @@
           <w:color w:val="2B2B2B"/>
           <w:sz w:val="26"/>
         </w:rPr>
-        <w:t xml:space="preserve">The X-ray from Zanesville, taken when he was nine, showed a shadow the size of a grain of rice at the base of the skull. A new one, taken in Brussels in March, showed nothing there at all.</w:t>
+        <w:t xml:space="preserve">The X-ray from Zanesville, taken when he was nine, showed a fleck where the skull meets the spine, no bigger than a grain of rice. A new one, taken in Brussels in March, showed nothing there at all.</w:t>
       </w:r>
     </w:p>
     <w:p>
@@ -26610,7 +26610,7 @@
           <w:color w:val="2B2B2B"/>
           <w:sz w:val="26"/>
         </w:rPr>
-        <w:t xml:space="preserve">“There is a clause,” said Feld. “In their own law. Ms. Calder heard it on the tender from a man who spent everything he had to tell her. An ask, and a yes. It is the one thing in forty thousand years of their committees that anyone wrote down for the people who were already living somewhere.” He looked at the flags. “You have been handed a question, and you have reached for a weapon, and you have tested the weapon on the only person in this room who could have told you what it would do.”</w:t>
+        <w:t xml:space="preserve">“There is a clause,” said Feld. “In their own law. Ms. Calder heard it on the tender from a man who spent everything he had to tell her. A request, and a consent. It is the one thing in forty thousand years of their committees that anyone wrote down for the people who were already living somewhere.” He looked at the flags. “You have been handed a question, and you have reached for a weapon, and you have tested the weapon on the only person in this room who could have told you what it would do.”</w:t>
       </w:r>
     </w:p>
     <w:p>
@@ -26789,7 +26789,7 @@
           <w:color w:val="2B2B2B"/>
           <w:sz w:val="26"/>
         </w:rPr>
-        <w:t xml:space="preserve">“No,” said Nora. “He was very clear. It has to come through one of them. Someone who heard it in person, and chose to carry it, while the channel is open.”</w:t>
+        <w:t xml:space="preserve">“It doesn’t,” said Nora. “He was very clear. It has to come through one of them. Somebody who was there, and agreed to carry it, while the channel is open.”</w:t>
       </w:r>
     </w:p>
     <w:p>
@@ -27486,7 +27486,7 @@
           <w:color w:val="2B2B2B"/>
           <w:sz w:val="26"/>
         </w:rPr>
-        <w:t xml:space="preserve">Dana sat in the dark of the pretzel room after the call ended, alone, with the mural looming over her. She had spent a career trusting a checklist over a feeling, and had once turned a satellite into confetti because of it. She thought of Dominic Reyes at his barbecue, explaining the Maillard reaction to children, saying it’s a conversation. She thought of Rosa’s rule. He gets told, and he decides.</w:t>
+        <w:t xml:space="preserve">Dana sat in the dark of the pretzel room after the call ended, alone, with the mural looming over her. She had spent a career trusting a checklist over a feeling, and had once turned a satellite into confetti because of it. She thought of Dominic Reyes at his barbecue, explaining the Maillard reaction to children, saying it’s a conversation. She thought of Rosa’s rule. First he is told. After that it is his.</w:t>
       </w:r>
     </w:p>
     <w:p>
@@ -27795,7 +27795,7 @@
           <w:color w:val="2B2B2B"/>
           <w:sz w:val="26"/>
         </w:rPr>
-        <w:t xml:space="preserve">He looked at the vending machine as if it might help. It did not. “The bad version,” he said, “is that I’ve spent seven years doing an impression of my father’s voice so that people will feel safe, and I didn’t know I was doing it until you made me listen to myself in a car in Utah. And that when that kid came at you in the corridor I didn’t think about anything. I just moved. I have never once in my life just moved. I think about everything. I narrate everything. I narrate my own breakfast.” He stopped. “And I don’t want to narrate this. That’s the speech. It’s very short. It’s a bad speech.”</w:t>
+        <w:t xml:space="preserve">He looked at the vending machine as if it might help. It had nothing to offer. “The bad version,” he said, “is that I’ve spent seven years doing an impression of my father’s voice so that people will feel safe, and I didn’t know I was doing it until you made me listen to myself in a car in Utah. And that when that kid came at you in the corridor I didn’t think about anything. I just moved. I have never once in my life just moved. I think about everything. I narrate everything. I narrate my own breakfast.” He stopped. “And I don’t want to narrate this. That’s the speech. It’s very short. It’s a bad speech.”</w:t>
       </w:r>
     </w:p>
     <w:p>
@@ -28253,7 +28253,7 @@
           <w:color w:val="2B2B2B"/>
           <w:sz w:val="26"/>
         </w:rPr>
-        <w:t xml:space="preserve">His recorder was on a table thirty-six thousand kilometers up. He had recorded the memo on his phone instead, in the gas station lot outside Hawthorne on Saturday morning, while she was inside buying coffee and the moth was hammering the light over the ice freezer. A voice memo, four minutes, to his producer, because he had just been taken out of the sky and put back on a highway, and because he had narrated everything in his life since he was nineteen and did not know how to stop. He had done it twelve hours after a man in a smock had held out his hand for the last machine that did it for him. It had her brother-in-law’s first name in it. It had Lissome. It had the eleven seconds.</w:t>
+        <w:t xml:space="preserve">His recorder was on a table thirty-six thousand kilometers up. He had recorded the memo on his phone instead, in the gas station lot outside Hawthorne on Saturday morning, while she was inside buying coffee and the moth was hammering the light over the ice freezer. A voice memo, four minutes, to his producer, because he had just been set back down on a highway after a trip he could not describe, and because he had narrated everything in his life since he was nineteen and did not know how to stop. He had done it twelve hours after a man in a smock had held out his hand for the last machine that did it for him. It had her brother-in-law’s first name in it. It had Lissome. It had the eleven seconds.</w:t>
       </w:r>
     </w:p>
     <w:p>
@@ -28552,7 +28552,7 @@
           <w:color w:val="2B2B2B"/>
           <w:sz w:val="26"/>
         </w:rPr>
-        <w:t xml:space="preserve">He did not answer.</w:t>
+        <w:t xml:space="preserve">He had no answer to that.</w:t>
       </w:r>
     </w:p>
     <w:p>
@@ -28712,7 +28712,7 @@
           <w:color w:val="2B2B2B"/>
           <w:sz w:val="26"/>
         </w:rPr>
-        <w:t xml:space="preserve">Nora looked at him.</w:t>
+        <w:t xml:space="preserve">Nora watched him.</w:t>
       </w:r>
     </w:p>
     <w:p>
@@ -28990,7 +28990,7 @@
           <w:color w:val="2B2B2B"/>
           <w:sz w:val="26"/>
         </w:rPr>
-        <w:t xml:space="preserve">He told her. Not the ship; he could not have told her the ship, and found he did not want to. The memo. Kyle. A town in Indiana whose name had gone out to eleven thousand strangers in his voice. A woman on a staircase who had said </w:t>
+        <w:t xml:space="preserve">He told her the rest. Not the ship; he could not have told her the ship, and found he did not want to. The memo. Kyle. A town in Indiana whose name had gone out to eleven thousand strangers in his voice. A woman on a staircase who had said </w:t>
       </w:r>
       <w:r>
         <w:rPr>
@@ -29107,7 +29107,7 @@
           <w:color w:val="2B2B2B"/>
           <w:sz w:val="26"/>
         </w:rPr>
-        <w:t xml:space="preserve">There was a silence on the line, long enough for a truck to back into the far bay and stop beeping.</w:t>
+        <w:t xml:space="preserve">Nothing came down the line for as long as it takes a truck to back into the far bay and stop beeping.</w:t>
       </w:r>
     </w:p>
     <w:p>
@@ -29486,7 +29486,7 @@
           <w:color w:val="2B2B2B"/>
           <w:sz w:val="26"/>
         </w:rPr>
-        <w:t xml:space="preserve">“No,” she said.</w:t>
+        <w:t xml:space="preserve">“Not since breakfast,” she said.</w:t>
       </w:r>
     </w:p>
     <w:p>
@@ -29526,7 +29526,7 @@
           <w:color w:val="2B2B2B"/>
           <w:sz w:val="26"/>
         </w:rPr>
-        <w:t xml:space="preserve">Elena put the folio on the table. Inside was a photocopy of Buchanan’s authorization, with the Directorate header and the paragraph in Buchanan’s compact prose: in the event of an active Feed broadcast coincident with the Halo consumer event, Halo Systems is directed to transmit the prepared counter-signal at full constellation power. No other signal is authorized. Deviation will be treated as an operational breach. Two signature boxes. Buchanan’s signature in one. Cole’s initials in the other: per emergency provision, acting for D-G.</w:t>
+        <w:t xml:space="preserve">Elena put the folio on the table. Inside was a photocopy of Buchanan’s authorization, with the Directorate header and the paragraph in Buchanan’s compact prose: in the event of an active Feed broadcast coincident with the Halo consumer event, Halo Systems is directed to transmit the prepared counter-signal at full constellation power. No other signal is authorized. Deviation will be treated as an operational breach. Two signature boxes. Buchanan’s signature in one. Cole’s initials in the other, with a note that he signed for the D-G under the emergency provision.</w:t>
       </w:r>
     </w:p>
     <w:p>
@@ -29686,7 +29686,7 @@
           <w:color w:val="2B2B2B"/>
           <w:sz w:val="26"/>
         </w:rPr>
-        <w:t xml:space="preserve">“Because you’ll be in the trailer,” she said. “Halvorsen told me. And you’ll have a question about the second signature at the moment it matters. And I’ll be sitting at the back of the trailer with a legal pad, because Cole has sent me to make sure the authorization is executed. And you’ll ask me. And I will answer you. Technically.” “It’s the only way I know how to do the right thing anymore.”</w:t>
+        <w:t xml:space="preserve">“Because you’ll be in the trailer,” she said. “Halvorsen told me. And you’ll have a question about the second signature at the moment it matters. And I’ll be sitting at the back of the trailer with a legal pad, because Cole has sent me to make sure the authorization is executed. And you’ll ask me. And I will answer you. Technically.” “It’s the only way I have left of doing the right thing.”</w:t>
       </w:r>
     </w:p>
     <w:p>
@@ -29866,7 +29866,7 @@
           <w:color w:val="2B2B2B"/>
           <w:sz w:val="26"/>
         </w:rPr>
-        <w:t xml:space="preserve">“Warren’s system,” said Elena. “The pen is what we tell them. The pencil is what we know. I stole it. Don’t tell him.”</w:t>
+        <w:t xml:space="preserve">“Warren’s system,” said Elena. “Pen for what we tell them, pencil for what we know. I stole it. Don’t tell him.”</w:t>
       </w:r>
     </w:p>
     <w:p>
@@ -30185,7 +30185,7 @@
           <w:color w:val="2B2B2B"/>
           <w:sz w:val="26"/>
         </w:rPr>
-        <w:t xml:space="preserve">Nora looked at the pennies in the fountain. She thought about Feld on the video call, not looking up, listing what it would take: a hybrid, in the footprint, with a live implant, who has been told what he is, and has heard someone ask, and chooses to carry it. Feld’s plan, whatever it was worth, needed someone in the bowl who had been told by someone he trusted. The bowl would be full of strangers. It would contain exactly one person who would listen to her.</w:t>
+        <w:t xml:space="preserve">Nora looked at the pennies in the fountain. She thought about Feld on the video call, not looking up, listing what it would take: a hybrid, in the footprint, with a live implant, informed, asked, and willing. Feld’s plan, whatever it was worth, needed someone in the bowl who had been told by someone he trusted. The bowl would be full of strangers. It would contain exactly one person who would listen to her.</w:t>
       </w:r>
     </w:p>
     <w:p>
@@ -30265,7 +30265,7 @@
           <w:color w:val="2B2B2B"/>
           <w:sz w:val="26"/>
         </w:rPr>
-        <w:t xml:space="preserve">“It isn’t mine to sell,” said Nora. “It’s his. He gets told, and he decides. His mother made that rule before either of us was involved, and she’s scarier than you.”</w:t>
+        <w:t xml:space="preserve">“It isn’t mine to sell,” said Nora. “It’s his. You tell him, and then it’s his choice. His mother made that rule before either of us was involved, and she’s scarier than you.”</w:t>
       </w:r>
     </w:p>
     <w:p>
@@ -30305,7 +30305,7 @@
           <w:color w:val="2B2B2B"/>
           <w:sz w:val="26"/>
         </w:rPr>
-        <w:t xml:space="preserve">“I know,” said Nora. “Neither does the ship. That’s the whole problem. You keep thinking you’re the opposite of them.”</w:t>
+        <w:t xml:space="preserve">“I know,” said Nora, “and neither does the ship. That’s the whole problem. You keep thinking you’re the opposite of them.”</w:t>
       </w:r>
     </w:p>
     <w:p>
@@ -31005,7 +31005,7 @@
           <w:color w:val="2B2B2B"/>
           <w:sz w:val="26"/>
         </w:rPr>
-        <w:t xml:space="preserve">“Ms. Calder,” she said. “You did not call my number.”</w:t>
+        <w:t xml:space="preserve">“You did not call my number, Ms. Calder.”</w:t>
       </w:r>
     </w:p>
     <w:p>
@@ -31065,7 +31065,7 @@
           <w:color w:val="2B2B2B"/>
           <w:sz w:val="26"/>
         </w:rPr>
-        <w:t xml:space="preserve">Nora thought about it.</w:t>
+        <w:t xml:space="preserve">Nora weighed that.</w:t>
       </w:r>
     </w:p>
     <w:p>
@@ -31723,7 +31723,7 @@
           <w:color w:val="2B2B2B"/>
           <w:sz w:val="26"/>
         </w:rPr>
-        <w:t xml:space="preserve">“His mother knew,” she said at last. “Rosa knew. She’s been lighting candles. For the other one. For thirty-four years.”</w:t>
+        <w:t xml:space="preserve">“His mother knew,” she said at last. “Rosa knew. She’s been lighting candles for the other one. Thirty-four years.”</w:t>
       </w:r>
     </w:p>
     <w:p>
@@ -31823,7 +31823,7 @@
           <w:color w:val="2B2B2B"/>
           <w:sz w:val="26"/>
         </w:rPr>
-        <w:t xml:space="preserve">“Yes,” said Nora. “Unless.”</w:t>
+        <w:t xml:space="preserve">“Yes. Unless.”</w:t>
       </w:r>
     </w:p>
     <w:p>
@@ -32063,7 +32063,7 @@
           <w:color w:val="2B2B2B"/>
           <w:sz w:val="26"/>
         </w:rPr>
-        <w:t xml:space="preserve">“Then let me tell him. Tomorrow. Before. Not during. Before. With you there. Holding his hand. And if he says no, then he says no, and I’ll walk away, and I’ll let Kade do whatever Kade does, and you can hate me forever, and I’ll deserve it.” Nora’s voice did not shake, quite. “But I won’t make the choice for him. Nobody gets to make it for him. Not the ship. Not the colonel. Not you. Not me. That’s the only thing I know for certain that’s right in this whole thing. He gets told, and he decides.”</w:t>
+        <w:t xml:space="preserve">“Then let me tell him. Tomorrow. Before. Not during. Before. With you there. Holding his hand. And if he says no, then he says no, and I’ll walk away, and I’ll let Kade do whatever Kade does, and you can hate me forever, and I’ll deserve it.” Nora’s voice did not shake, quite. “But I won’t make the choice for him. Nobody gets to make it for him. Not the visitors. Not the colonel. Not you. Not me. That’s the only thing I know for certain that’s right in this whole thing. Tell him, and let him decide.”</w:t>
       </w:r>
     </w:p>
     <w:p>
@@ -32143,7 +32143,7 @@
           <w:color w:val="2B2B2B"/>
           <w:sz w:val="26"/>
         </w:rPr>
-        <w:t xml:space="preserve">“Don’t okay me.”</w:t>
+        <w:t xml:space="preserve">“You don’t get to okay me.”</w:t>
       </w:r>
     </w:p>
     <w:p>
@@ -32203,7 +32203,7 @@
           <w:color w:val="2B2B2B"/>
           <w:sz w:val="26"/>
         </w:rPr>
-        <w:t xml:space="preserve">“God,” she said. “I bought this because a kid was watching. What is wrong with me.”</w:t>
+        <w:t xml:space="preserve">She pressed the heel of her hand to one eye. “I bought this because a kid was watching. What is wrong with me.”</w:t>
       </w:r>
     </w:p>
     <w:p>
@@ -32243,27 +32243,27 @@
           <w:color w:val="2B2B2B"/>
           <w:sz w:val="26"/>
         </w:rPr>
-        <w:t xml:space="preserve">They sat together in the plaza until the light went, two sisters looking at the same sky from opposite sides of the same man, and when Nora walked her back to the hotel, at the door, Mabs turned and hugged her hard, and said into her ear, as she had said at the Fourth, “Not today,” and Nora said, “Not today,” and then Mabs said something she had not said at the Fourth.</w:t>
-      </w:r>
-    </w:p>
-    <w:p>
-      <w:pPr>
-        <w:spacing w:line="400" w:lineRule="auto"/>
-        <w:ind w:firstLine="440"/>
-        <w:jc w:val="both"/>
-        <w:rPr>
-          <w:rFonts w:ascii="Georgia" w:hAnsi="Georgia"/>
-          <w:color w:val="2B2B2B"/>
-          <w:sz w:val="26"/>
-        </w:rPr>
-      </w:pPr>
-      <w:r>
-        <w:rPr>
-          <w:rFonts w:ascii="Georgia" w:hAnsi="Georgia"/>
-          <w:color w:val="2B2B2B"/>
-          <w:sz w:val="26"/>
-        </w:rPr>
-        <w:t xml:space="preserve">“Tomorrow,” she said. “Tomorrow, you tell him. And I hold his hand. That’s the deal.”</w:t>
+        <w:t xml:space="preserve">They sat together in the plaza until the light went, two sisters on either side of the same man, watching the same sky, and when Nora walked her back to the hotel, at the door, Mabs turned and hugged her hard, and said into her ear, as she had said at the Fourth, “Not today,” and Nora said, “Not today,” and then Mabs said something she had not said at the Fourth.</w:t>
+      </w:r>
+    </w:p>
+    <w:p>
+      <w:pPr>
+        <w:spacing w:line="400" w:lineRule="auto"/>
+        <w:ind w:firstLine="440"/>
+        <w:jc w:val="both"/>
+        <w:rPr>
+          <w:rFonts w:ascii="Georgia" w:hAnsi="Georgia"/>
+          <w:color w:val="2B2B2B"/>
+          <w:sz w:val="26"/>
+        </w:rPr>
+      </w:pPr>
+      <w:r>
+        <w:rPr>
+          <w:rFonts w:ascii="Georgia" w:hAnsi="Georgia"/>
+          <w:color w:val="2B2B2B"/>
+          <w:sz w:val="26"/>
+        </w:rPr>
+        <w:t xml:space="preserve">“Tomorrow,” she said. “Tomorrow, you tell him. And I hold his hand. Those are my terms.”</w:t>
       </w:r>
     </w:p>
     <w:p>
@@ -32751,7 +32751,7 @@
           <w:color w:val="2B2B2B"/>
           <w:sz w:val="26"/>
         </w:rPr>
-        <w:t xml:space="preserve">“In the event of an active Feed broadcast coincident with the Halo consumer event,” Kade read aloud, in his low level voice, to the room, “Halo Systems is directed to transmit the prepared counter-signal at full constellation power. No other signal is authorized. Deviation will be treated as an operational breach.” He set the tablet face up on the console. “Signed, Buchanan. Second signature, initialed by Cole, per emergency provision, acting for D-G.”</w:t>
+        <w:t xml:space="preserve">“It says directed,” Kade said, in his low level voice, to the room. “Not requested. The prepared counter-signal, at full constellation power, and anything else I send is a breach.” He set the tablet face up on the console. “Buchanan signed. Cole initialed the second box, on the emergency provision.”</w:t>
       </w:r>
     </w:p>
     <w:p>
@@ -33209,7 +33209,7 @@
           <w:color w:val="2B2B2B"/>
           <w:sz w:val="26"/>
         </w:rPr>
-        <w:t xml:space="preserve">“And if he says no?”</w:t>
+        <w:t xml:space="preserve">“And if he refuses?”</w:t>
       </w:r>
     </w:p>
     <w:p>
@@ -33308,7 +33308,7 @@
           <w:color w:val="2B2B2B"/>
           <w:sz w:val="26"/>
         </w:rPr>
-        <w:t xml:space="preserve">“The emergency provision,” said Cole, “is a matter of interpretation.”</w:t>
+        <w:t xml:space="preserve">“That provision,” said Cole, “is a matter of interpretation.”</w:t>
       </w:r>
     </w:p>
     <w:p>
@@ -33448,7 +33448,7 @@
           <w:color w:val="2B2B2B"/>
           <w:sz w:val="26"/>
         </w:rPr>
-        <w:t xml:space="preserve">“The Directorate charter, article nine, paragraph four,” she said, “permits a deputy to sign in the Director-General’s place under an emergency provision when the Director-General is incapacitated, unreachable, or deceased. It does not provide for a deputy to sign when the Director-General is reachable and has declined. The Director-General declined on the record, on an internal line, on the fourth of August, a little after five in the morning, Brussels time.” She glanced, very briefly, at Dana. “A transcript exists. In my professional opinion, the second signature on this authorization is open to substantial legal question. An operational partner that declined to execute it would have a defensible position.”</w:t>
+        <w:t xml:space="preserve">“The Directorate charter, article nine, paragraph four,” she said, “permits a deputy to sign in the Director-General’s place under an emergency provision when the Director-General is incapacitated, unreachable, or deceased. A deputy may not sign for a Director-General who is reachable and has said no. The Director-General declined on the record, on an internal line, on the fourth of August, a little after five in the morning, Brussels time.” She glanced, very briefly, at Dana. “A transcript exists. In my professional opinion, the second signature on this authorization is open to substantial legal question. An operational partner that declined to execute it would have a defensible position.”</w:t>
       </w:r>
     </w:p>
     <w:p>
@@ -33488,7 +33488,7 @@
           <w:color w:val="2B2B2B"/>
           <w:sz w:val="26"/>
         </w:rPr>
-        <w:t xml:space="preserve">“Not a winning one,” said Elena. “A defensible one.” She sat down. “That is my advice to my office. I have given it. Technically.”</w:t>
+        <w:t xml:space="preserve">“Nobody said winning,” said Elena. “Only one I could stand behind.” She sat down. “That is my advice to my office. I have given it. Technically.”</w:t>
       </w:r>
     </w:p>
     <w:p>
@@ -33647,27 +33647,27 @@
           <w:color w:val="2B2B2B"/>
           <w:sz w:val="26"/>
         </w:rPr>
-        <w:t xml:space="preserve">He looked at Feld. At Priya. At Dana behind him. At Nora at the back of the trailer, with her camera in its bag at her feet.</w:t>
-      </w:r>
-    </w:p>
-    <w:p>
-      <w:pPr>
-        <w:spacing w:line="400" w:lineRule="auto"/>
-        <w:ind w:firstLine="440"/>
-        <w:jc w:val="both"/>
-        <w:rPr>
-          <w:rFonts w:ascii="Georgia" w:hAnsi="Georgia"/>
-          <w:color w:val="2B2B2B"/>
-          <w:sz w:val="26"/>
-        </w:rPr>
-      </w:pPr>
-      <w:r>
-        <w:rPr>
-          <w:rFonts w:ascii="Georgia" w:hAnsi="Georgia"/>
-          <w:color w:val="2B2B2B"/>
-          <w:sz w:val="26"/>
-        </w:rPr>
-        <w:t xml:space="preserve">“Totality begins at twenty-eight fifty-eight,” he said. “Third contact is thirty twenty-two. Eighty-four seconds. The channel opens at second contact and closes at third.” He looked at the monitor where the bowl was filling. “Ms. Calder. If you go to section 114, and if you tell him, and if he says yes, and if the clause works, Ms. Chen will see it. A reply from the tender. It’s thirty-six thousand kilometers up; the light takes an eighth of a second each way. We’ll know before third contact.”</w:t>
+        <w:t xml:space="preserve">He looked at Feld. At Priya. At Dana behind him. At Nora, at the back, with the camera still zipped at her feet.</w:t>
+      </w:r>
+    </w:p>
+    <w:p>
+      <w:pPr>
+        <w:spacing w:line="400" w:lineRule="auto"/>
+        <w:ind w:firstLine="440"/>
+        <w:jc w:val="both"/>
+        <w:rPr>
+          <w:rFonts w:ascii="Georgia" w:hAnsi="Georgia"/>
+          <w:color w:val="2B2B2B"/>
+          <w:sz w:val="26"/>
+        </w:rPr>
+      </w:pPr>
+      <w:r>
+        <w:rPr>
+          <w:rFonts w:ascii="Georgia" w:hAnsi="Georgia"/>
+          <w:color w:val="2B2B2B"/>
+          <w:sz w:val="26"/>
+        </w:rPr>
+        <w:t xml:space="preserve">“Totality begins at twenty-eight fifty-eight,” he said. “Third contact is thirty twenty-two. A minute twenty-four, start to finish. The channel opens at second contact and closes at third.” He looked at the monitor where the bowl was filling. “Ms. Calder. If you go to section 114, and if you tell him, and if he says yes, and if the clause works, Ms. Chen will see it. A reply from the tender. It’s thirty-six thousand kilometers up; the light takes an eighth of a second each way. We’ll know before third contact.”</w:t>
       </w:r>
     </w:p>
     <w:p>
@@ -33826,7 +33826,7 @@
           <w:color w:val="2B2B2B"/>
           <w:sz w:val="26"/>
         </w:rPr>
-        <w:t xml:space="preserve">“I would like you to know,” she said quietly, “that if this works, nobody will ever know it was you. There will be no press conference. The authorization will be filed as executed during a technical anomaly at a consumer event. You will go home to Indianapolis and film weddings. That is the best possible outcome. Do you understand?”</w:t>
+        <w:t xml:space="preserve">“I would like you to know,” she said quietly, “that if this works, nobody will ever know it was you. There will be no press conference. The authorization will be filed as executed during a technical anomaly at a consumer event. You will go home to Indianapolis and film weddings. That is the best possible outcome. Have I made myself understood?”</w:t>
       </w:r>
     </w:p>
     <w:p>
@@ -33906,7 +33906,7 @@
           <w:color w:val="2B2B2B"/>
           <w:sz w:val="26"/>
         </w:rPr>
-        <w:t xml:space="preserve">Halvorsen looked at her with the scientist’s patience.</w:t>
+        <w:t xml:space="preserve">Halvorsen waited, the way she waited on a result.</w:t>
       </w:r>
     </w:p>
     <w:p>
@@ -34045,27 +34045,27 @@
           <w:color w:val="2B2B2B"/>
           <w:sz w:val="26"/>
         </w:rPr>
-        <w:t xml:space="preserve">“No,” said Nora. “Mabs asked for it to be family.”</w:t>
-      </w:r>
-    </w:p>
-    <w:p>
-      <w:pPr>
-        <w:spacing w:line="400" w:lineRule="auto"/>
-        <w:ind w:firstLine="440"/>
-        <w:jc w:val="both"/>
-        <w:rPr>
-          <w:rFonts w:ascii="Georgia" w:hAnsi="Georgia"/>
-          <w:color w:val="2B2B2B"/>
-          <w:sz w:val="26"/>
-        </w:rPr>
-      </w:pPr>
-      <w:r>
-        <w:rPr>
-          <w:rFonts w:ascii="Georgia" w:hAnsi="Georgia"/>
-          <w:color w:val="2B2B2B"/>
-          <w:sz w:val="26"/>
-        </w:rPr>
-        <w:t xml:space="preserve">He nodded. He did not argue. He took a step toward her and then stopped, the way he had stopped his hand above the recorder in the diner, and she saw him decide not to narrate this, and decide not to say any of the things he wanted to say, and she loved him for it, and did not tell him so, because there was not time and because she wanted to have the chance later.</w:t>
+        <w:t xml:space="preserve">“Better not,” said Nora. “Mabs asked for it to be family.”</w:t>
+      </w:r>
+    </w:p>
+    <w:p>
+      <w:pPr>
+        <w:spacing w:line="400" w:lineRule="auto"/>
+        <w:ind w:firstLine="440"/>
+        <w:jc w:val="both"/>
+        <w:rPr>
+          <w:rFonts w:ascii="Georgia" w:hAnsi="Georgia"/>
+          <w:color w:val="2B2B2B"/>
+          <w:sz w:val="26"/>
+        </w:rPr>
+      </w:pPr>
+      <w:r>
+        <w:rPr>
+          <w:rFonts w:ascii="Georgia" w:hAnsi="Georgia"/>
+          <w:color w:val="2B2B2B"/>
+          <w:sz w:val="26"/>
+        </w:rPr>
+        <w:t xml:space="preserve">He nodded without arguing. He took a step toward her and then stopped, the way he had stopped his hand above the recorder in the diner, and she saw him decide not to narrate this, and decide not to say any of the things he wanted to say, and she loved him for it, and did not tell him so, because there was not time and because she wanted to have the chance later.</w:t>
       </w:r>
     </w:p>
     <w:p>
@@ -34285,7 +34285,7 @@
           <w:color w:val="2B2B2B"/>
           <w:sz w:val="26"/>
         </w:rPr>
-        <w:t xml:space="preserve">“Nobody went to the gate at O’Hare,” he said. “I want you to know that. You’d told your sister what to say. I don’t spend people on a scene.”</w:t>
+        <w:t xml:space="preserve">“Nobody went to the gate at O’Hare,” he said. “You’d told your sister what to say. I don’t spend people on a scene.”</w:t>
       </w:r>
     </w:p>
     <w:p>
@@ -34972,7 +34972,7 @@
           <w:color w:val="2B2B2B"/>
           <w:sz w:val="26"/>
         </w:rPr>
-        <w:t xml:space="preserve">“I know,” said Warren. “I’m restricting it.”</w:t>
+        <w:t xml:space="preserve">“Noted,” said Warren. “I’m restricting it.”</w:t>
       </w:r>
     </w:p>
     <w:p>
@@ -35370,7 +35370,7 @@
           <w:color w:val="2B2B2B"/>
           <w:sz w:val="26"/>
         </w:rPr>
-        <w:t xml:space="preserve">She wrote them down, all of them, in her neat print, on a map of the bowl. The man in 120 got a small square instead of a dot, because he was the only one who had looked at a watch. By 20:20 there were forty-one marks. By 20:24 there were seventy. Jesse’s four hundred, spread through the stands with their phones, were doing what he had asked them to do: they were not touching, and not confronting, and not filming. They were calling. And Gladys was answering every call the way you would answer a relative who might be about to say something sad.</w:t>
+        <w:t xml:space="preserve">She wrote them down, all of them, in her neat print, on a map of the bowl. The man in 120 got a small square instead of a dot, because he was the only one who had looked at a watch. By 20:20 there were forty-one marks. By 20:24 there were seventy. Jesse’s four hundred, spread through the stands with their phones, were doing what he had asked them to do: they were not touching, and not confronting, and not filming. They were calling. And Gladys was still picking up every ring in the same gentle voice, braced for sad news.</w:t>
       </w:r>
     </w:p>
     <w:p>
@@ -35874,7 +35874,7 @@
           <w:color w:val="2B2B2B"/>
           <w:sz w:val="26"/>
         </w:rPr>
-        <w:t xml:space="preserve">Mabs was in seat 8, on the aisle side. Dominic was in seat 7. They were both wearing cardboard eclipse glasses from the gift shop with the Halo logo on the arm. Mabs had a bottle of water in her lap and the fan from the shop that had been selling fans since 1876 in her hand, and she was not fanning herself with it. She was holding it the way you hold a rosary.</w:t>
+        <w:t xml:space="preserve">Mabs was in seat 8, on the aisle side. Dominic was in seat 7. They were both wearing cardboard eclipse glasses from the gift shop with the Halo logo on the arm. Mabs had a bottle of water in her lap and the fan Dominic had bought her in her hand, and she was not fanning herself with it. She was holding it the way you hold a rosary.</w:t>
       </w:r>
     </w:p>
     <w:p>
@@ -36014,7 +36014,7 @@
           <w:color w:val="2B2B2B"/>
           <w:sz w:val="26"/>
         </w:rPr>
-        <w:t xml:space="preserve">He turned his head. It took him a second. It took him, Nora saw, a second longer than it should have; the news had to come down a long hallway.</w:t>
+        <w:t xml:space="preserve">He turned his head. It took him a second. It took him, Nora saw, a second longer than it should have, as if the news were coming from far away.</w:t>
       </w:r>
     </w:p>
     <w:p>
@@ -36094,7 +36094,7 @@
           <w:color w:val="2B2B2B"/>
           <w:sz w:val="26"/>
         </w:rPr>
-        <w:t xml:space="preserve">“Okay,” he said.</w:t>
+        <w:t xml:space="preserve">“Okay.” He breathed out.</w:t>
       </w:r>
     </w:p>
     <w:p>
@@ -36153,27 +36153,27 @@
           <w:color w:val="2B2B2B"/>
           <w:sz w:val="26"/>
         </w:rPr>
-        <w:t xml:space="preserve">She told him that his mother had lost three hours on a drive to the Kroger when she was six months pregnant, and that when he was born they had taken him away for four hours. She told him that what came back was him: grown from his mother’s blood, a twin of the baby she carried, human in every cell, with one addition at the base of his skull, about the size of a grain of rice. She told him that the baby his mother carried was alive, on a ship, thirty-four years old, and spoke no English, and had never seen a sky. She told him what the ship was, and why it was dying, and what it wanted. She told him about the weather behind his eyes, and the afternoons that went missing, and the morning in Columbus, and the tickets that faced the screen, and the eleven shapes on the whiteboard. She told him what was going to happen in seven minutes. She told him about the colonel, and the key under the flip cover, and that nobody knew the percentage.</w:t>
-      </w:r>
-    </w:p>
-    <w:p>
-      <w:pPr>
-        <w:spacing w:line="400" w:lineRule="auto"/>
-        <w:ind w:firstLine="440"/>
-        <w:jc w:val="both"/>
-        <w:rPr>
-          <w:rFonts w:ascii="Georgia" w:hAnsi="Georgia"/>
-          <w:color w:val="2B2B2B"/>
-          <w:sz w:val="26"/>
-        </w:rPr>
-      </w:pPr>
-      <w:r>
-        <w:rPr>
-          <w:rFonts w:ascii="Georgia" w:hAnsi="Georgia"/>
-          <w:color w:val="2B2B2B"/>
-          <w:sz w:val="26"/>
-        </w:rPr>
-        <w:t xml:space="preserve">And then she told him about the clause. An ask, and a yes.</w:t>
+        <w:t xml:space="preserve">She told him about the Kroger, and the three hours that went missing on the way, and the four hours in the nursery after he was born. She told him that what came back was him: grown from his mother’s blood, a twin of the baby she carried, human in every cell, and carrying a receiver at the base of his skull. She told him that the baby his mother carried was alive, on a ship, thirty-four years old, and spoke no English, and had never seen a sky. She told him what the ship was, and why it was dying, and what it wanted. She told him about the weather behind his eyes, and the afternoons that went missing, and the morning in Columbus, and the tickets that faced the screen, and the eleven shapes on the whiteboard. She told him what was going to happen in seven minutes. She told him about the colonel, and the key under the flip cover, and that nobody knew the percentage.</w:t>
+      </w:r>
+    </w:p>
+    <w:p>
+      <w:pPr>
+        <w:spacing w:line="400" w:lineRule="auto"/>
+        <w:ind w:firstLine="440"/>
+        <w:jc w:val="both"/>
+        <w:rPr>
+          <w:rFonts w:ascii="Georgia" w:hAnsi="Georgia"/>
+          <w:color w:val="2B2B2B"/>
+          <w:sz w:val="26"/>
+        </w:rPr>
+      </w:pPr>
+      <w:r>
+        <w:rPr>
+          <w:rFonts w:ascii="Georgia" w:hAnsi="Georgia"/>
+          <w:color w:val="2B2B2B"/>
+          <w:sz w:val="26"/>
+        </w:rPr>
+        <w:t xml:space="preserve">And then she told him about the clause. Ask first, and wait for the answer.</w:t>
       </w:r>
     </w:p>
     <w:p>
@@ -36253,7 +36253,7 @@
           <w:color w:val="2B2B2B"/>
           <w:sz w:val="26"/>
         </w:rPr>
-        <w:t xml:space="preserve">“She’s been lighting a candle,” said Mabs. “Every March. At St. Lawrence. For the other one.”</w:t>
+        <w:t xml:space="preserve">“She’s been lighting a candle,” said Mabs. “Every March. At St. Lawrence. For the boy who went up.”</w:t>
       </w:r>
     </w:p>
     <w:p>
@@ -36333,7 +36333,7 @@
           <w:color w:val="2B2B2B"/>
           <w:sz w:val="26"/>
         </w:rPr>
-        <w:t xml:space="preserve">“About your mom? Since the Tuesday before,” said Nora. “It was hers to tell. I thought it was hers to tell.” She did not look away. “I lied to you about it, and you let me, and I’ve hated it every day since.”</w:t>
+        <w:t xml:space="preserve">“About your mom? Since the Tuesday before,” said Nora. “It was hers to tell. I thought it was hers to tell.” Her gaze stayed steady. “I lied to you about it, and you let me, and I’ve hated it every day since.”</w:t>
       </w:r>
     </w:p>
     <w:p>
@@ -36432,7 +36432,7 @@
           <w:color w:val="2B2B2B"/>
           <w:sz w:val="26"/>
         </w:rPr>
-        <w:t xml:space="preserve">He opened his eyes. He looked at Nora, and there was something in his face she had never seen there before, not at the wedding, not at the Fourth, not in all the hours of footage she had watched at half speed in her kitchen. It was anger. Rosa had said you could not make him angry. Rosa had tried. Rosa was wrong.</w:t>
+        <w:t xml:space="preserve">His eyes came open. He looked at Nora, and there was something in his face she had never seen there before, not at the wedding, not at the Fourth, not in all the hours of footage she had watched at half speed in her kitchen. It was anger. Rosa had said you could not make him angry. Rosa had tried. Rosa was wrong.</w:t>
       </w:r>
     </w:p>
     <w:p>
@@ -36492,7 +36492,7 @@
           <w:color w:val="2B2B2B"/>
           <w:sz w:val="26"/>
         </w:rPr>
-        <w:t xml:space="preserve">Nora sat on the step with her sister’s hand crushing hers and looked at her brother-in-law, and understood, with perfect clarity, the choice she was being handed. It was the choice she had promised in the plaza. He gets told, and he decides. He had been told. He had decided. All she had to do was stand up, and walk down the stairs of section 114, and radio the trailer, and say no, and let Kade lift the cover at third contact, and go home to Indianapolis and film weddings. She had promised. Nobody would ever know.</w:t>
+        <w:t xml:space="preserve">Nora sat on the step with her sister’s hand crushing hers and looked at her brother-in-law, and understood, with perfect clarity, the choice she was being handed. It was the choice she had promised in the plaza. The rule was Rosa’s. He had been told. He had decided. All she had to do was stand up, and walk down the stairs of section 114, and radio the trailer, and say no, and let Kade lift the cover at third contact, and go home to Indianapolis and film weddings. She had promised. Nobody would ever know.</w:t>
       </w:r>
     </w:p>
     <w:p>
@@ -36572,47 +36572,47 @@
           <w:color w:val="2B2B2B"/>
           <w:sz w:val="26"/>
         </w:rPr>
-        <w:t xml:space="preserve">“Okay,” she said. “If that’s your answer, I’ll take it to them. I promised Mabs I would. And I promised myself. But you need to know what no costs, the same as I told you what yes costs. Otherwise I’ve done the same thing they did. I’ve made you decide in the dark.”</w:t>
-      </w:r>
-    </w:p>
-    <w:p>
-      <w:pPr>
-        <w:spacing w:line="400" w:lineRule="auto"/>
-        <w:ind w:firstLine="440"/>
-        <w:jc w:val="both"/>
-        <w:rPr>
-          <w:rFonts w:ascii="Georgia" w:hAnsi="Georgia"/>
-          <w:color w:val="2B2B2B"/>
-          <w:sz w:val="26"/>
-        </w:rPr>
-      </w:pPr>
-      <w:r>
-        <w:rPr>
-          <w:rFonts w:ascii="Georgia" w:hAnsi="Georgia"/>
-          <w:color w:val="2B2B2B"/>
-          <w:sz w:val="26"/>
-        </w:rPr>
-        <w:t xml:space="preserve">He looked at her.</w:t>
-      </w:r>
-    </w:p>
-    <w:p>
-      <w:pPr>
-        <w:spacing w:line="400" w:lineRule="auto"/>
-        <w:ind w:firstLine="440"/>
-        <w:jc w:val="both"/>
-        <w:rPr>
-          <w:rFonts w:ascii="Georgia" w:hAnsi="Georgia"/>
-          <w:color w:val="2B2B2B"/>
-          <w:sz w:val="26"/>
-        </w:rPr>
-      </w:pPr>
-      <w:r>
-        <w:rPr>
-          <w:rFonts w:ascii="Georgia" w:hAnsi="Georgia"/>
-          <w:color w:val="2B2B2B"/>
-          <w:sz w:val="26"/>
-        </w:rPr>
-        <w:t xml:space="preserve">“Curtis,” she said. “Your best man. He’s one of you. He’s probably in a bar in Fort Wayne right now, watching this on TV. The man on the tender who walked me back out — he spent everything he had so I could sit on this step. Anders Feld, in that trailer, who could have got on a bus. Kim, the caterer, from your wedding. Mr. Price from table nine, your mom’s neighbor. Seventy-three people in this bowl who Gladys has on a map right now. Nine thousand of you. All over the world. Standing next to doors. And the overload doesn’t ask any of them. It doesn’t ask Curtis if he wants it burned out. It just burns. And nobody knows how many of them it kills.” She took a breath. “And your brother. Up there. If the ship takes, he comes down to open doors he didn’t choose. If we burn, he never comes down at all, and he dies on a ship that’s dying, and he never sees a sky. And if somebody asks, and somebody carries it — he gets to ask us. Him. Not you. Him. For a seat at a table.” She held his eyes. “That’s what you’d be carrying. Not their message. Ours. Mine. Mabs’s. It doesn’t make you theirs. It makes you the one who said yes.”</w:t>
+        <w:t xml:space="preserve">“All right,” she said. “If that’s your answer, I’ll take it to them. I promised Mabs I would. And I promised myself. But you need to know what no costs, the same as I told you what yes costs. Otherwise I’ve done the same thing they did. I’ve made you decide in the dark.”</w:t>
+      </w:r>
+    </w:p>
+    <w:p>
+      <w:pPr>
+        <w:spacing w:line="400" w:lineRule="auto"/>
+        <w:ind w:firstLine="440"/>
+        <w:jc w:val="both"/>
+        <w:rPr>
+          <w:rFonts w:ascii="Georgia" w:hAnsi="Georgia"/>
+          <w:color w:val="2B2B2B"/>
+          <w:sz w:val="26"/>
+        </w:rPr>
+      </w:pPr>
+      <w:r>
+        <w:rPr>
+          <w:rFonts w:ascii="Georgia" w:hAnsi="Georgia"/>
+          <w:color w:val="2B2B2B"/>
+          <w:sz w:val="26"/>
+        </w:rPr>
+        <w:t xml:space="preserve">He met her eyes.</w:t>
+      </w:r>
+    </w:p>
+    <w:p>
+      <w:pPr>
+        <w:spacing w:line="400" w:lineRule="auto"/>
+        <w:ind w:firstLine="440"/>
+        <w:jc w:val="both"/>
+        <w:rPr>
+          <w:rFonts w:ascii="Georgia" w:hAnsi="Georgia"/>
+          <w:color w:val="2B2B2B"/>
+          <w:sz w:val="26"/>
+        </w:rPr>
+      </w:pPr>
+      <w:r>
+        <w:rPr>
+          <w:rFonts w:ascii="Georgia" w:hAnsi="Georgia"/>
+          <w:color w:val="2B2B2B"/>
+          <w:sz w:val="26"/>
+        </w:rPr>
+        <w:t xml:space="preserve">“Curtis,” she said. “Your best man. He’s one of you. He’s probably in a bar in Fort Wayne right now, watching this on TV. The man on the tender who walked me back out — he spent everything he had so I could sit on this step. Anders Feld, in that trailer, who could have got on a bus. Kim, the caterer, from your wedding. Mr. Price from table nine, your mom’s neighbor. Seventy-three people in this bowl who Gladys has on a map right now. Nine thousand of you. All over the world. Standing next to doors. And the overload doesn’t ask any of them. It doesn’t ask Curtis if he wants it burned out. It just burns. And nobody knows how many of them it kills.” She breathed in. “And your brother. Up there. If the ship takes, he comes down to open doors he didn’t choose. If we burn, he never comes down at all, and he dies on a ship that’s dying, and he never sees a sky. And if somebody asks, and somebody carries it — he gets to ask us. Him. Not you. Him. For a seat at a table.” She held his eyes. “That’s what you’d be carrying. Not their message. Ours. Mine. Mabs’s. It doesn’t make you theirs. It makes you the one who said yes.”</w:t>
       </w:r>
     </w:p>
     <w:p>
@@ -36672,27 +36672,27 @@
           <w:color w:val="2B2B2B"/>
           <w:sz w:val="26"/>
         </w:rPr>
-        <w:t xml:space="preserve">“Whatever you say,” Nora said, “you’re still yours. That’s the deal. That’s the deal you married. Mabs told me.”</w:t>
-      </w:r>
-    </w:p>
-    <w:p>
-      <w:pPr>
-        <w:spacing w:line="400" w:lineRule="auto"/>
-        <w:ind w:firstLine="440"/>
-        <w:jc w:val="both"/>
-        <w:rPr>
-          <w:rFonts w:ascii="Georgia" w:hAnsi="Georgia"/>
-          <w:color w:val="2B2B2B"/>
-          <w:sz w:val="26"/>
-        </w:rPr>
-      </w:pPr>
-      <w:r>
-        <w:rPr>
-          <w:rFonts w:ascii="Georgia" w:hAnsi="Georgia"/>
-          <w:color w:val="2B2B2B"/>
-          <w:sz w:val="26"/>
-        </w:rPr>
-        <w:t xml:space="preserve">Dominic looked at his wife.</w:t>
+        <w:t xml:space="preserve">“Whatever you say,” Nora said, “you’re still yours. That’s the deal you married. Mabs told me.”</w:t>
+      </w:r>
+    </w:p>
+    <w:p>
+      <w:pPr>
+        <w:spacing w:line="400" w:lineRule="auto"/>
+        <w:ind w:firstLine="440"/>
+        <w:jc w:val="both"/>
+        <w:rPr>
+          <w:rFonts w:ascii="Georgia" w:hAnsi="Georgia"/>
+          <w:color w:val="2B2B2B"/>
+          <w:sz w:val="26"/>
+        </w:rPr>
+      </w:pPr>
+      <w:r>
+        <w:rPr>
+          <w:rFonts w:ascii="Georgia" w:hAnsi="Georgia"/>
+          <w:color w:val="2B2B2B"/>
+          <w:sz w:val="26"/>
+        </w:rPr>
+        <w:t xml:space="preserve">Dominic found his wife’s face.</w:t>
       </w:r>
     </w:p>
     <w:p>
@@ -36732,7 +36732,7 @@
           <w:color w:val="2B2B2B"/>
           <w:sz w:val="26"/>
         </w:rPr>
-        <w:t xml:space="preserve">“I’ll be here,” she said. “Either way. I’m in the next seat. That’s all I know how to do. Your mom told me. Not fixing. Sitting next to.”</w:t>
+        <w:t xml:space="preserve">“I’ll be here,” she said. “Either way. I’m in the next seat. That’s all I know how to do. Your mom taught me that.”</w:t>
       </w:r>
     </w:p>
     <w:p>
@@ -36771,7 +36771,7 @@
           <w:color w:val="2B2B2B"/>
           <w:sz w:val="26"/>
         </w:rPr>
-        <w:t xml:space="preserve">In the master feed closet under the north stand, the sound technician had not moved for twelve minutes. Neither had Warren. Neither had Steve, sitting in the corridor three feet from the door like a chaperone at a dance.</w:t>
+        <w:t xml:space="preserve">Under the north stand, the sound technician had not moved for twelve minutes. Neither had Warren. Neither had Steve, sitting in the corridor three feet from the door like a chaperone at a dance.</w:t>
       </w:r>
     </w:p>
     <w:p>
@@ -36891,7 +36891,7 @@
           <w:color w:val="2B2B2B"/>
           <w:sz w:val="26"/>
         </w:rPr>
-        <w:t xml:space="preserve">“So was I,” said Warren. “I was born for a basement in Chicago. It turned out to be the right basement.” He did not move. “Nobody asked you, did they. Whether you wanted to be born for this.”</w:t>
+        <w:t xml:space="preserve">“So was I,” said Warren. “I was born for a basement in Chicago. It turned out to be the right basement.” He held his ground. “Nobody asked you, did they. Whether you wanted to be born for this.”</w:t>
       </w:r>
     </w:p>
     <w:p>
@@ -36971,7 +36971,7 @@
           <w:color w:val="2B2B2B"/>
           <w:sz w:val="26"/>
         </w:rPr>
-        <w:t xml:space="preserve">The technician looked at the breakers. He looked at Warren. Behind Warren, in the corridor, Steve stood up, slowly, with great dignity and some hay, and took one step forward — the first step he had taken toward any of them in six weeks — and stopped, and looked at the man in the closet with an expression that, on a person, would have been something very close to pity.</w:t>
+        <w:t xml:space="preserve">The technician looked at the breakers, then at Warren. Behind Warren, in the corridor, Steve stood up, slowly, with great dignity and some hay, and took one step forward — the first step he had taken toward any of them in six weeks — and stopped, and looked at the man in the closet with what would have been, on a person, something very close to pity.</w:t>
       </w:r>
     </w:p>
     <w:p>
@@ -37070,7 +37070,7 @@
           <w:color w:val="2B2B2B"/>
           <w:sz w:val="26"/>
         </w:rPr>
-        <w:t xml:space="preserve">“Nothing,” said Nora. “You don’t have to do anything. You just have to have heard it. And mean it. When the light goes, it opens. Whatever you’ve heard, whatever you mean, it takes it up. That’s what it’s always done. This time you’ll know.”</w:t>
+        <w:t xml:space="preserve">“Nothing at all,” said Nora. “You don’t have to do anything. You just have to have heard it. And mean it. When the light goes, it opens. Whatever you’ve heard, whatever you mean, it takes it up. That’s what it’s always done. This time you’ll know.”</w:t>
       </w:r>
     </w:p>
     <w:p>
@@ -37110,7 +37110,7 @@
           <w:color w:val="2B2B2B"/>
           <w:sz w:val="26"/>
         </w:rPr>
-        <w:t xml:space="preserve">Nora looked at him. Around them the light was going. The fat crescent was a fingernail now, low in the west over the stubble, and the sky above the bowl had turned a deep, impossible blue, and Venus had come out, bright, well to the left of the sun, and somebody in the next section had seen it and was pointing, and the temperature had dropped so fast that the hairs on Nora’s arms were standing up, the way they had in the barn, the way they had at the very beginning.</w:t>
+        <w:t xml:space="preserve">Nora kept her eyes on him. Around them the light was going. The fat crescent was a fingernail now, low in the west over the stubble, and the sky above the bowl had turned a deep, impossible blue, and Venus had come out, bright, well to the left of the sun, and somebody in the next section had seen it and was pointing, and the temperature had dropped so fast that the hairs on Nora’s arms were standing up, the way they had in the barn, the way they had at the very beginning.</w:t>
       </w:r>
     </w:p>
     <w:p>
@@ -37598,7 +37598,7 @@
           <w:color w:val="2B2B2B"/>
           <w:sz w:val="26"/>
         </w:rPr>
-        <w:t xml:space="preserve">Kade’s hand lay flat on the plastic flip cover over the key. He did not lift it. He did not look up.</w:t>
+        <w:t xml:space="preserve">Kade’s palm still rested on the cover over the key. He did not lift it. He kept his eyes on the console.</w:t>
       </w:r>
     </w:p>
     <w:p>
@@ -37737,7 +37737,7 @@
           <w:color w:val="2B2B2B"/>
           <w:sz w:val="26"/>
         </w:rPr>
-        <w:t xml:space="preserve">“You don’t have to,” he said again, at library volume. “Nobody asked you. I’m asking.”</w:t>
+        <w:t xml:space="preserve">“You don’t have to do this,” he said again, at library volume. “Nobody asked you. I’m asking.”</w:t>
       </w:r>
     </w:p>
     <w:p>
@@ -37917,7 +37917,7 @@
           <w:color w:val="2B2B2B"/>
           <w:sz w:val="26"/>
         </w:rPr>
-        <w:t xml:space="preserve">Warren did not move. It was the only thing he had ever been good at. The man hit him with his whole shoulder, and Warren went back into the steel door frame with a sound he felt in his teeth, and something in his side gave like a stick under snow. He kept hold of the polo shirt. He would not remember deciding to. His left hand had a fistful of it and would not open, and when the man wrenched free, Warren’s wrist went the wrong way with the cloth, and he heard that too.</w:t>
+        <w:t xml:space="preserve">Warren held still. It was the only thing he had ever been good at. The man hit him with his whole shoulder, and Warren went back into the steel door frame with a sound he felt in his teeth, and something in his side gave like a stick under snow. He kept hold of the polo shirt. He would not remember deciding to. His left hand had a fistful of it and would not open, and when the man wrenched free, Warren’s wrist went the wrong way with the cloth, and he heard that too.</w:t>
       </w:r>
     </w:p>
     <w:p>
@@ -38017,7 +38017,7 @@
           <w:color w:val="2B2B2B"/>
           <w:sz w:val="26"/>
         </w:rPr>
-        <w:t xml:space="preserve">He came off the rack without a sound, between the man and the panel, and took the reaching wrist in both hands, the way he had taken his own wrist a minute before, and held it. The two of them stood locked against the rack with the breaker an inch from both their hands and the red clock behind them counting nothing at all. The man in the cap hit him in the face with his free hand. The technician did not let go. He had been raised in a third of a gravity and had no business being strong enough. He held on anyway, the way people hold on to the one decision they have ever made for themselves.</w:t>
+        <w:t xml:space="preserve">He came off the rack without a sound, between the man and the panel, and took the reaching wrist in both hands, the way he had taken his own wrist a minute before, and held it. The two of them stood locked against the rack with the breaker an inch from both their hands and the red clock behind them counting nothing at all. The man in the cap hit him in the face with his free hand. The technician did not let go. He had been raised on a lighter world and had no business being strong enough. He held on anyway, the way people hold on to the one decision they have ever made for themselves.</w:t>
       </w:r>
     </w:p>
     <w:p>
@@ -38236,27 +38236,27 @@
           <w:color w:val="2B2B2B"/>
           <w:sz w:val="26"/>
         </w:rPr>
-        <w:t xml:space="preserve">All around them, in the dark, under the black sun and the silver streamers of the corona, eighty thousand people were looking up. And across the bowl, in section after section, a hundred-odd were standing, and turning, and starting toward the aisles. Not running. Walking. With the unhurried economy of people who had been doing the same task since before they were born.</w:t>
-      </w:r>
-    </w:p>
-    <w:p>
-      <w:pPr>
-        <w:spacing w:line="400" w:lineRule="auto"/>
-        <w:ind w:firstLine="440"/>
-        <w:jc w:val="both"/>
-        <w:rPr>
-          <w:rFonts w:ascii="Georgia" w:hAnsi="Georgia"/>
-          <w:color w:val="2B2B2B"/>
-          <w:sz w:val="26"/>
-        </w:rPr>
-      </w:pPr>
-      <w:r>
-        <w:rPr>
-          <w:rFonts w:ascii="Georgia" w:hAnsi="Georgia"/>
-          <w:color w:val="2B2B2B"/>
-          <w:sz w:val="26"/>
-        </w:rPr>
-        <w:t xml:space="preserve">Jesse’s voice came out of eight hundred speakers, warm and slow, the voice of a man talking a plane down through ice.</w:t>
+        <w:t xml:space="preserve">All around them, in the dark, under the black sun and the silver streamers of the corona, eighty thousand people were looking up. And across the bowl, in section after section, a hundred-odd were standing, and turning, and starting toward the aisles. Not running. Walking. Moving without hurry, as people do who have done the same task since before they were born.</w:t>
+      </w:r>
+    </w:p>
+    <w:p>
+      <w:pPr>
+        <w:spacing w:line="400" w:lineRule="auto"/>
+        <w:ind w:firstLine="440"/>
+        <w:jc w:val="both"/>
+        <w:rPr>
+          <w:rFonts w:ascii="Georgia" w:hAnsi="Georgia"/>
+          <w:color w:val="2B2B2B"/>
+          <w:sz w:val="26"/>
+        </w:rPr>
+      </w:pPr>
+      <w:r>
+        <w:rPr>
+          <w:rFonts w:ascii="Georgia" w:hAnsi="Georgia"/>
+          <w:color w:val="2B2B2B"/>
+          <w:sz w:val="26"/>
+        </w:rPr>
+        <w:t xml:space="preserve">Out of the speakers came Jesse again, warm and slow, the voice of a man talking a plane down through ice.</w:t>
       </w:r>
     </w:p>
     <w:p>
@@ -38496,7 +38496,7 @@
           <w:color w:val="2B2B2B"/>
           <w:sz w:val="26"/>
         </w:rPr>
-        <w:t xml:space="preserve">“Dominic,” she said. “It’s Nora. Your sister-in-law. I filmed your wedding. You brought me water when my hands were sweating. Mabs is holding your hand. You’re in Spain. It’s your honeymoon. You’re seeing an eclipse. You told the kids in your class it’s the most beautiful thing in the universe, that the shadows line up.”</w:t>
+        <w:t xml:space="preserve">“Dominic.” She kept her voice level. “It’s Nora. Your sister-in-law. I filmed your wedding. You brought me water when my hands were sweating. Mabs is holding your hand. You’re in Spain. It’s your honeymoon. You’re seeing an eclipse. You told the kids in your class it’s the most beautiful thing in the universe, that the shadows line up.”</w:t>
       </w:r>
     </w:p>
     <w:p>
@@ -38556,7 +38556,7 @@
           <w:color w:val="2B2B2B"/>
           <w:sz w:val="26"/>
         </w:rPr>
-        <w:t xml:space="preserve">She took a breath. Around her, the bowl was dark and silent and enormous, and the corona hung over the plain like a white flower, and the orange ring of sunset burned all the way around the world.</w:t>
+        <w:t xml:space="preserve">She breathed. Around her, the bowl was dark and silent and enormous, and the corona hung over the plain like a white flower, and the orange ring of sunset burned all the way around the world.</w:t>
       </w:r>
     </w:p>
     <w:p>
@@ -38616,7 +38616,7 @@
           <w:color w:val="2B2B2B"/>
           <w:sz w:val="26"/>
         </w:rPr>
-        <w:t xml:space="preserve">“Come and ask,” she said. “That’s all. Come and ask us. Ask for passage for your children — they’re our children too; they were ours first. Ask for what you need. Blood. Cells. Whatever it is. Ask, and we’ll answer. Not all of us will say yes. Some of us will be afraid. Some of us will be cruel. I can’t promise you we’ll be kind. Nobody can promise that about anybody. But we’ll answer. And you won’t have to steal anything ever again, and nobody down here will have to burn anything out of anybody’s head.” Her voice broke, finally, and she let it. “I’m asking you to ask. That’s the whole thing. That’s the only thing I’ve got.”</w:t>
+        <w:t xml:space="preserve">“Come and ask,” she said. “That’s all. Come and ask us. Ask for passage for your children — they’re our children too; they were ours first. Ask for what you need. Blood. Cells. Whatever the need turns out to be. Ask, and we’ll answer. Not all of us will say yes. Some of us will be afraid. Some of us will be cruel. I can’t promise you we’ll be kind. Nobody can promise that about anybody. But we’ll answer. And you won’t have to steal anything ever again, and nobody down here will have to burn anything out of anybody’s head.” Her voice broke, finally, and she let it. “I’m asking you to ask. That’s the whole thing. That’s the only thing I’ve got.”</w:t>
       </w:r>
     </w:p>
     <w:p>
@@ -38795,7 +38795,7 @@
           <w:color w:val="2B2B2B"/>
           <w:sz w:val="26"/>
         </w:rPr>
-        <w:t xml:space="preserve">Priya saw it go. A tiny spike, against the vast rolling wave of the muster, going the wrong way. Up. To the tender. An eighth of a second to get there.</w:t>
+        <w:t xml:space="preserve">Priya saw it go. A tiny spike, against the vast rolling wave of the muster, going the wrong way. Up. Toward the tender, an eighth of a second away.</w:t>
       </w:r>
     </w:p>
     <w:p>
@@ -39175,7 +39175,7 @@
           <w:color w:val="2B2B2B"/>
           <w:sz w:val="26"/>
         </w:rPr>
-        <w:t xml:space="preserve">“No,” said Halvorsen, from behind them. “Mine. I have declined once. If it comes to it, I will sign in front of everyone and take it to The Hague myself. But not before third contact. Not one second before.” She did not raise her voice. “Colonel. Wait.”</w:t>
+        <w:t xml:space="preserve">“No,” said Halvorsen, from behind them. “Mine. I have declined once. If it comes to it, I will sign in front of everyone and take it to The Hague myself. But not before third contact. Not one second before.” Her voice stayed level. “Colonel. Wait.”</w:t>
       </w:r>
     </w:p>
     <w:p>
@@ -39753,7 +39753,7 @@
           <w:color w:val="2B2B2B"/>
           <w:sz w:val="26"/>
         </w:rPr>
-        <w:t xml:space="preserve">Dominic did not look at the ring. He looked at his wife.</w:t>
+        <w:t xml:space="preserve">Dominic did not look at the ring. His eyes went to his wife.</w:t>
       </w:r>
     </w:p>
     <w:p>
@@ -39813,7 +39813,7 @@
           <w:color w:val="2B2B2B"/>
           <w:sz w:val="26"/>
         </w:rPr>
-        <w:t xml:space="preserve">“It was perfect,” said Mabs. “Everybody said so.”</w:t>
+        <w:t xml:space="preserve">“It was perfect,” said Mabs. “People went back for thirds.”</w:t>
       </w:r>
     </w:p>
     <w:p>
@@ -40461,7 +40461,7 @@
           <w:color w:val="2B2B2B"/>
           <w:sz w:val="26"/>
         </w:rPr>
-        <w:t xml:space="preserve">It did not fade. It simply was not there. The ham in Valencia came back in, loud and clear, shouting something in Spanish that Huff did not need to speak Spanish to understand: the light was back, the diamond, the diamond, Madre de Dios, the diamond.</w:t>
+        <w:t xml:space="preserve">It did not taper off. It was just gone. The ham in Valencia came back in, loud and clear, shouting something in Spanish that Huff did not need to speak Spanish to understand: the light was back, the diamond, the diamond, Madre de Dios, the diamond.</w:t>
       </w:r>
     </w:p>
     <w:p>
@@ -40601,7 +40601,7 @@
           <w:color w:val="2B2B2B"/>
           <w:sz w:val="26"/>
         </w:rPr>
-        <w:t xml:space="preserve">“You heard something,” said Cobb. It was not a question. She had known him for forty years.</w:t>
+        <w:t xml:space="preserve">“You heard something,” said Cobb. She did not need an answer; she had known him for forty years.</w:t>
       </w:r>
     </w:p>
     <w:p>
@@ -40661,27 +40661,27 @@
           <w:color w:val="2B2B2B"/>
           <w:sz w:val="26"/>
         </w:rPr>
-        <w:t xml:space="preserve">Huff thought about it.</w:t>
-      </w:r>
-    </w:p>
-    <w:p>
-      <w:pPr>
-        <w:spacing w:line="400" w:lineRule="auto"/>
-        <w:ind w:firstLine="440"/>
-        <w:jc w:val="both"/>
-        <w:rPr>
-          <w:rFonts w:ascii="Georgia" w:hAnsi="Georgia"/>
-          <w:color w:val="2B2B2B"/>
-          <w:sz w:val="26"/>
-        </w:rPr>
-      </w:pPr>
-      <w:r>
-        <w:rPr>
-          <w:rFonts w:ascii="Georgia" w:hAnsi="Georgia"/>
-          <w:color w:val="2B2B2B"/>
-          <w:sz w:val="26"/>
-        </w:rPr>
-        <w:t xml:space="preserve">“I think somebody asked a question,” he said. “And I think somebody answered it.” He looked at her. “I always thought it would be a Tuesday. And it would be bombs. And I’d be the only one ready.” He shook his head. “I had the day wrong and the thing wrong. All I had right was the radio.”</w:t>
+        <w:t xml:space="preserve">Huff took his time.</w:t>
+      </w:r>
+    </w:p>
+    <w:p>
+      <w:pPr>
+        <w:spacing w:line="400" w:lineRule="auto"/>
+        <w:ind w:firstLine="440"/>
+        <w:jc w:val="both"/>
+        <w:rPr>
+          <w:rFonts w:ascii="Georgia" w:hAnsi="Georgia"/>
+          <w:color w:val="2B2B2B"/>
+          <w:sz w:val="26"/>
+        </w:rPr>
+      </w:pPr>
+      <w:r>
+        <w:rPr>
+          <w:rFonts w:ascii="Georgia" w:hAnsi="Georgia"/>
+          <w:color w:val="2B2B2B"/>
+          <w:sz w:val="26"/>
+        </w:rPr>
+        <w:t xml:space="preserve">“I think somebody asked a question,” he said. “And I think somebody answered it.” He glanced across at her. “I always thought it would be a Tuesday. And it would be bombs. And I’d be the only one ready.” He rubbed his jaw. “I had the day wrong and the thing wrong. All I had right was the radio.”</w:t>
       </w:r>
     </w:p>
     <w:p>
@@ -40741,7 +40741,7 @@
           <w:color w:val="2B2B2B"/>
           <w:sz w:val="26"/>
         </w:rPr>
-        <w:t xml:space="preserve">“Gary,” said Cobb, “I have been sheriff of this county for twenty-two years, and that is the first time I have ever heard you say you were wrong about anything.” She got out of the cruiser and stood beside him in the yard and looked up at the same empty sky. “Write it up.”</w:t>
+        <w:t xml:space="preserve">“Gary,” said Cobb, “I have been sheriff of this county for twenty-two years, and that is the first time I have ever heard you say you were wrong about anything.” She got out of the cruiser and stood beside him in the yard and looked up at the same empty sky. “Go home and write up what you saw.”</w:t>
       </w:r>
     </w:p>
     <w:p>
@@ -41519,7 +41519,7 @@
           <w:color w:val="2B2B2B"/>
           <w:sz w:val="26"/>
         </w:rPr>
-        <w:t xml:space="preserve">She was just sitting next to them. That was all. The way she had told her daughter-in-law. Not fixing. Sitting next to.</w:t>
+        <w:t xml:space="preserve">She was just sitting next to them. That was all. The way she had told her daughter-in-law it was done.</w:t>
       </w:r>
     </w:p>
     <w:p>
@@ -41748,7 +41748,7 @@
           <w:color w:val="2B2B2B"/>
           <w:sz w:val="26"/>
         </w:rPr>
-        <w:t xml:space="preserve">The retired astronomers from Utrecht said afterward that it was the most beautiful thing they had ever seen. Nobody in the bowl disagreed with them. Eighty thousand people stood in the long red light and watched the horned sun sink into the haze over the distant hills, and nobody left until it was gone, and then the PA said, in four languages, that the event had concluded and thanked everyone for being part of history, and the stadium emptied the way stadiums empty: slowly, then all at once. Cups rolled. A lost pair of eclipse glasses hung on a rail. The mariachi band, for reasons no one could explain, started playing again on the north concourse, and a hundred people danced.</w:t>
+        <w:t xml:space="preserve">The retired astronomers from Utrecht said afterward that it was the most beautiful thing they had ever seen. Nobody in the bowl disagreed with them. Eighty thousand people stood in the long red light and watched the horned sun sink into the haze over the distant hills, and nobody left until it was gone, and then the PA said, in four languages, that the event had concluded and thanked everyone for being part of history, and the stadium emptied the way stadiums empty: slowly, then all at once. Cups rolled. A lost pair of eclipse glasses hung on a rail. The mariachi band started up again on the north concourse, no more explicable than before, and a hundred people danced.</w:t>
       </w:r>
     </w:p>
     <w:p>
@@ -42186,7 +42186,7 @@
           <w:color w:val="2B2B2B"/>
           <w:sz w:val="26"/>
         </w:rPr>
-        <w:t xml:space="preserve">“I don’t know what that means,” said Warren gently.</w:t>
+        <w:t xml:space="preserve">“I’m sorry. I don’t speak it,” said Warren gently.</w:t>
       </w:r>
     </w:p>
     <w:p>
@@ -42326,7 +42326,7 @@
           <w:color w:val="2B2B2B"/>
           <w:sz w:val="26"/>
         </w:rPr>
-        <w:t xml:space="preserve">“Find them,” said Buchanan, to her people, and then, after a pause, to the technician, slowly and clearly, as if to a child or a foreign dignitary: “You are safe. Do you understand? Safe.”</w:t>
+        <w:t xml:space="preserve">“Find them,” said Buchanan, to her people, and then, after a pause, to the technician, slowly and clearly, as if to a child or a foreign dignitary: “You are safe. Safe.”</w:t>
       </w:r>
     </w:p>
     <w:p>
@@ -42425,27 +42425,27 @@
           <w:color w:val="2B2B2B"/>
           <w:sz w:val="26"/>
         </w:rPr>
-        <w:t xml:space="preserve">Dominic sat in seat 7 with his wife’s hand in both of his. Mabs sat in seat 8 with her head on his shoulder. Nora sat on the step in the aisle with a butterfly plaster over her eyebrow and her right wrist in a splint that a Red Cross volunteer had made from a rolled-up Starfall program and two bandages. Nobody had asked them to leave. The ushers had looked at them and decided, as the usher had decided earlier, that the evening was too important to make a fuss.</w:t>
-      </w:r>
-    </w:p>
-    <w:p>
-      <w:pPr>
-        <w:spacing w:line="400" w:lineRule="auto"/>
-        <w:ind w:firstLine="440"/>
-        <w:jc w:val="both"/>
-        <w:rPr>
-          <w:rFonts w:ascii="Georgia" w:hAnsi="Georgia"/>
-          <w:color w:val="2B2B2B"/>
-          <w:sz w:val="26"/>
-        </w:rPr>
-      </w:pPr>
-      <w:r>
-        <w:rPr>
-          <w:rFonts w:ascii="Georgia" w:hAnsi="Georgia"/>
-          <w:color w:val="2B2B2B"/>
-          <w:sz w:val="26"/>
-        </w:rPr>
-        <w:t xml:space="preserve">Overhead the stars were coming out over the plain, the ordinary stars, in a sky that had gone back to being a sky.</w:t>
+        <w:t xml:space="preserve">Dominic sat in seat 7 with his wife’s hand in both of his. Mabs sat in seat 8 with her head on his shoulder. Nora sat on the step in the aisle with a butterfly plaster over her eyebrow and her right wrist in a splint that a Red Cross volunteer had made from a rolled-up Starfall program and two bandages. Nobody had asked them to leave. The ushers had looked at them and reached the same verdict as the usher before: tonight was not the night for a fuss.</w:t>
+      </w:r>
+    </w:p>
+    <w:p>
+      <w:pPr>
+        <w:spacing w:line="400" w:lineRule="auto"/>
+        <w:ind w:firstLine="440"/>
+        <w:jc w:val="both"/>
+        <w:rPr>
+          <w:rFonts w:ascii="Georgia" w:hAnsi="Georgia"/>
+          <w:color w:val="2B2B2B"/>
+          <w:sz w:val="26"/>
+        </w:rPr>
+      </w:pPr>
+      <w:r>
+        <w:rPr>
+          <w:rFonts w:ascii="Georgia" w:hAnsi="Georgia"/>
+          <w:color w:val="2B2B2B"/>
+          <w:sz w:val="26"/>
+        </w:rPr>
+        <w:t xml:space="preserve">Overhead the stars were coming out over the plain, the ordinary stars, in a sky that was only a sky again.</w:t>
       </w:r>
     </w:p>
     <w:p>
@@ -42545,7 +42545,7 @@
           <w:color w:val="2B2B2B"/>
           <w:sz w:val="26"/>
         </w:rPr>
-        <w:t xml:space="preserve">“I remember it,” Dominic said at last. “I want you to know that. Both of you. I remember all of it.” He was looking at the place in the west where the sun had gone down. “I remember standing up. I remember the floor. It wasn’t this floor. It was soft. And there was a corridor, and a lot of people in it, all walking the same way, and I was one of them. And I was looking for a door.” He swallowed. “And then I heard you. Nora. I heard you say my name. And Mabs. And pancakes.” He almost laughed. “I heard you say pancakes, and I thought: that’s not in the plan. And everybody in the corridor stopped.”</w:t>
+        <w:t xml:space="preserve">“I remember it,” Dominic said at last. “I want you both to know that. I remember all of it.” He was looking at the place in the west where the sun had gone down. “I remember standing up. I remember the floor. It wasn’t this floor. It was soft. And there was a corridor, and a lot of people in it, all walking the same way, and I was one of them. And I was looking for a door.” He swallowed. “And then I heard you. Nora. I heard you say my name. And Mabs. And pancakes.” A short, startled laugh got out of him. “I heard you say pancakes, and I thought: that’s not in the plan. And everybody in the corridor stopped.”</w:t>
       </w:r>
     </w:p>
     <w:p>
@@ -42625,7 +42625,7 @@
           <w:color w:val="2B2B2B"/>
           <w:sz w:val="26"/>
         </w:rPr>
-        <w:t xml:space="preserve">“And your brother?” she said.</w:t>
+        <w:t xml:space="preserve">“What about your brother?” she said.</w:t>
       </w:r>
     </w:p>
     <w:p>
@@ -42665,7 +42665,7 @@
           <w:color w:val="2B2B2B"/>
           <w:sz w:val="26"/>
         </w:rPr>
-        <w:t xml:space="preserve">“I think he was there,” he said. “I think he was one of the ones in the corridor. Coming the other way. I don’t know. I didn’t see his face. But somebody went past me, and they were — they were looking at me. The way you look at somebody in a crowd you think you know.” He closed his eyes. “He doesn’t speak English. I don’t speak whatever he speaks. But I think he knew who I was.”</w:t>
+        <w:t xml:space="preserve">“I think he was there,” he said. “I think he was one of the ones in the corridor. Coming the other way. I couldn’t swear to it. I didn’t see his face. But somebody went past me, and they were — they were looking at me. The way you look at somebody in a crowd you think you know.” His eyes closed. “He doesn’t speak English. I don’t speak whatever he speaks. But I think he knew who I was.”</w:t>
       </w:r>
     </w:p>
     <w:p>
@@ -42705,7 +42705,685 @@
           <w:color w:val="2B2B2B"/>
           <w:sz w:val="26"/>
         </w:rPr>
-        <w:t xml:space="preserve">“Is it gone?” said Mabs finally. “The weather. Is it gone?”</w:t>
+        <w:t xml:space="preserve">“Is it gone?” said Mabs finally. “The weather. Is it really gone?”</w:t>
+      </w:r>
+    </w:p>
+    <w:p>
+      <w:pPr>
+        <w:spacing w:line="400" w:lineRule="auto"/>
+        <w:ind w:firstLine="440"/>
+        <w:jc w:val="both"/>
+        <w:rPr>
+          <w:rFonts w:ascii="Georgia" w:hAnsi="Georgia"/>
+          <w:color w:val="2B2B2B"/>
+          <w:sz w:val="26"/>
+        </w:rPr>
+      </w:pPr>
+      <w:r>
+        <w:rPr>
+          <w:rFonts w:ascii="Georgia" w:hAnsi="Georgia"/>
+          <w:color w:val="2B2B2B"/>
+          <w:sz w:val="26"/>
+        </w:rPr>
+        <w:t xml:space="preserve">He took a moment with that.</w:t>
+      </w:r>
+    </w:p>
+    <w:p>
+      <w:pPr>
+        <w:spacing w:line="400" w:lineRule="auto"/>
+        <w:ind w:firstLine="440"/>
+        <w:jc w:val="both"/>
+        <w:rPr>
+          <w:rFonts w:ascii="Georgia" w:hAnsi="Georgia"/>
+          <w:color w:val="2B2B2B"/>
+          <w:sz w:val="26"/>
+        </w:rPr>
+      </w:pPr>
+      <w:r>
+        <w:rPr>
+          <w:rFonts w:ascii="Georgia" w:hAnsi="Georgia"/>
+          <w:color w:val="2B2B2B"/>
+          <w:sz w:val="26"/>
+        </w:rPr>
+        <w:t xml:space="preserve">“The weather’s gone,” he said. “The thing isn’t. I can feel it. It’s still there. But it’s quiet. It’s not — it’s not waiting anymore. It’s like a phone on a table.” He touched the base of his skull, lightly, the way the Escort had. “I don’t know if I want it out. I thought I did. Three hours ago I wanted it out more than I have ever wanted anything. Now I —” He stopped. “It’s the only line to him. Isn’t it. If they ever ask. If he ever comes down. It’s the only phone.”</w:t>
+      </w:r>
+    </w:p>
+    <w:p>
+      <w:pPr>
+        <w:spacing w:line="400" w:lineRule="auto"/>
+        <w:ind w:firstLine="440"/>
+        <w:jc w:val="both"/>
+        <w:rPr>
+          <w:rFonts w:ascii="Georgia" w:hAnsi="Georgia"/>
+          <w:color w:val="2B2B2B"/>
+          <w:sz w:val="26"/>
+        </w:rPr>
+      </w:pPr>
+      <w:r>
+        <w:rPr>
+          <w:rFonts w:ascii="Georgia" w:hAnsi="Georgia"/>
+          <w:color w:val="2B2B2B"/>
+          <w:sz w:val="26"/>
+        </w:rPr>
+        <w:t xml:space="preserve">“You don’t have to decide tonight,” said Nora.</w:t>
+      </w:r>
+    </w:p>
+    <w:p>
+      <w:pPr>
+        <w:spacing w:line="400" w:lineRule="auto"/>
+        <w:ind w:firstLine="440"/>
+        <w:jc w:val="both"/>
+        <w:rPr>
+          <w:rFonts w:ascii="Georgia" w:hAnsi="Georgia"/>
+          <w:color w:val="2B2B2B"/>
+          <w:sz w:val="26"/>
+        </w:rPr>
+      </w:pPr>
+      <w:r>
+        <w:rPr>
+          <w:rFonts w:ascii="Georgia" w:hAnsi="Georgia"/>
+          <w:color w:val="2B2B2B"/>
+          <w:sz w:val="26"/>
+        </w:rPr>
+        <w:t xml:space="preserve">“No,” said Dominic. His eyes came up. “But I get to decide. Right?”</w:t>
+      </w:r>
+    </w:p>
+    <w:p>
+      <w:pPr>
+        <w:spacing w:line="400" w:lineRule="auto"/>
+        <w:ind w:firstLine="440"/>
+        <w:jc w:val="both"/>
+        <w:rPr>
+          <w:rFonts w:ascii="Georgia" w:hAnsi="Georgia"/>
+          <w:color w:val="2B2B2B"/>
+          <w:sz w:val="26"/>
+        </w:rPr>
+      </w:pPr>
+      <w:r>
+        <w:rPr>
+          <w:rFonts w:ascii="Georgia" w:hAnsi="Georgia"/>
+          <w:color w:val="2B2B2B"/>
+          <w:sz w:val="26"/>
+        </w:rPr>
+        <w:t xml:space="preserve">“That’s the deal,” said Nora.</w:t>
+      </w:r>
+    </w:p>
+    <w:p>
+      <w:pPr>
+        <w:spacing w:line="400" w:lineRule="auto"/>
+        <w:ind w:firstLine="440"/>
+        <w:jc w:val="both"/>
+        <w:rPr>
+          <w:rFonts w:ascii="Georgia" w:hAnsi="Georgia"/>
+          <w:color w:val="2B2B2B"/>
+          <w:sz w:val="26"/>
+        </w:rPr>
+      </w:pPr>
+      <w:r>
+        <w:rPr>
+          <w:rFonts w:ascii="Georgia" w:hAnsi="Georgia"/>
+          <w:color w:val="2B2B2B"/>
+          <w:sz w:val="26"/>
+        </w:rPr>
+        <w:t xml:space="preserve">He nodded. Then he turned to his wife.</w:t>
+      </w:r>
+    </w:p>
+    <w:p>
+      <w:pPr>
+        <w:spacing w:line="400" w:lineRule="auto"/>
+        <w:ind w:firstLine="440"/>
+        <w:jc w:val="both"/>
+        <w:rPr>
+          <w:rFonts w:ascii="Georgia" w:hAnsi="Georgia"/>
+          <w:color w:val="2B2B2B"/>
+          <w:sz w:val="26"/>
+        </w:rPr>
+      </w:pPr>
+      <w:r>
+        <w:rPr>
+          <w:rFonts w:ascii="Georgia" w:hAnsi="Georgia"/>
+          <w:color w:val="2B2B2B"/>
+          <w:sz w:val="26"/>
+        </w:rPr>
+        <w:t xml:space="preserve">“Can we call my mom?” he said.</w:t>
+      </w:r>
+    </w:p>
+    <w:p>
+      <w:pPr>
+        <w:spacing w:line="400" w:lineRule="auto"/>
+        <w:ind w:firstLine="440"/>
+        <w:jc w:val="both"/>
+        <w:rPr>
+          <w:rFonts w:ascii="Georgia" w:hAnsi="Georgia"/>
+          <w:color w:val="2B2B2B"/>
+          <w:sz w:val="26"/>
+        </w:rPr>
+      </w:pPr>
+      <w:r>
+        <w:rPr>
+          <w:rFonts w:ascii="Georgia" w:hAnsi="Georgia"/>
+          <w:color w:val="2B2B2B"/>
+          <w:sz w:val="26"/>
+        </w:rPr>
+        <w:t xml:space="preserve">Mabs had already texted Rosa. She did not say so. She took out her phone and dialed and handed it to him, and he held it to his ear, and it rang once, and Rosa Reyes, in a church in Muncie, Indiana, at 3:20 on a Wednesday afternoon, picked up before the second ring.</w:t>
+      </w:r>
+    </w:p>
+    <w:p>
+      <w:pPr>
+        <w:spacing w:line="400" w:lineRule="auto"/>
+        <w:ind w:firstLine="440"/>
+        <w:jc w:val="both"/>
+        <w:rPr>
+          <w:rFonts w:ascii="Georgia" w:hAnsi="Georgia"/>
+          <w:color w:val="2B2B2B"/>
+          <w:sz w:val="26"/>
+        </w:rPr>
+      </w:pPr>
+      <w:r>
+        <w:rPr>
+          <w:rFonts w:ascii="Georgia" w:hAnsi="Georgia"/>
+          <w:color w:val="2B2B2B"/>
+          <w:sz w:val="26"/>
+        </w:rPr>
+        <w:t xml:space="preserve">Nora got up off the step and walked down the stairs of section 114 and left them there, because some things you do not film, and some things you do not even watch.</w:t>
+      </w:r>
+    </w:p>
+    <w:p>
+      <w:pPr>
+        <w:spacing w:line="400" w:lineRule="auto"/>
+        <w:jc w:val="center"/>
+        <w:rPr>
+          <w:rFonts w:ascii="Georgia" w:hAnsi="Georgia"/>
+          <w:color w:val="2B2B2B"/>
+          <w:sz w:val="26"/>
+        </w:rPr>
+      </w:pPr>
+      <w:r>
+        <w:rPr>
+          <w:rFonts w:ascii="Georgia" w:hAnsi="Georgia"/>
+          <w:color w:val="2B2B2B"/>
+          <w:sz w:val="26"/>
+        </w:rPr>
+        <w:t xml:space="preserve">∗</w:t>
+      </w:r>
+    </w:p>
+    <w:p>
+      <w:pPr>
+        <w:spacing w:line="400" w:lineRule="auto"/>
+        <w:ind w:firstLine="440"/>
+        <w:jc w:val="both"/>
+        <w:rPr>
+          <w:rFonts w:ascii="Georgia" w:hAnsi="Georgia"/>
+          <w:color w:val="2B2B2B"/>
+          <w:sz w:val="26"/>
+        </w:rPr>
+      </w:pPr>
+      <w:r>
+        <w:rPr>
+          <w:rFonts w:ascii="Georgia" w:hAnsi="Georgia"/>
+          <w:color w:val="2B2B2B"/>
+          <w:sz w:val="26"/>
+        </w:rPr>
+        <w:t xml:space="preserve">Jesse was waiting at the bottom of the stairs by gate four, in the empty concourse, with her camera bag over his shoulder.</w:t>
+      </w:r>
+    </w:p>
+    <w:p>
+      <w:pPr>
+        <w:spacing w:line="400" w:lineRule="auto"/>
+        <w:ind w:firstLine="440"/>
+        <w:jc w:val="both"/>
+        <w:rPr>
+          <w:rFonts w:ascii="Georgia" w:hAnsi="Georgia"/>
+          <w:color w:val="2B2B2B"/>
+          <w:sz w:val="26"/>
+        </w:rPr>
+      </w:pPr>
+      <w:r>
+        <w:rPr>
+          <w:rFonts w:ascii="Georgia" w:hAnsi="Georgia"/>
+          <w:color w:val="2B2B2B"/>
+          <w:sz w:val="26"/>
+        </w:rPr>
+        <w:t xml:space="preserve">He had been on the PA for forty minutes. His voice was gone. He had a bottle of water in his hand and a Halo radio on his belt that he had switched off, and when he saw her coming down the stairs he did not say anything, because he could not, and because, she thought, he had decided not to narrate this either.</w:t>
+      </w:r>
+    </w:p>
+    <w:p>
+      <w:pPr>
+        <w:spacing w:line="400" w:lineRule="auto"/>
+        <w:ind w:firstLine="440"/>
+        <w:jc w:val="both"/>
+        <w:rPr>
+          <w:rFonts w:ascii="Georgia" w:hAnsi="Georgia"/>
+          <w:color w:val="2B2B2B"/>
+          <w:sz w:val="26"/>
+        </w:rPr>
+      </w:pPr>
+      <w:r>
+        <w:rPr>
+          <w:rFonts w:ascii="Georgia" w:hAnsi="Georgia"/>
+          <w:color w:val="2B2B2B"/>
+          <w:sz w:val="26"/>
+        </w:rPr>
+        <w:t xml:space="preserve">She stopped in front of him.</w:t>
+      </w:r>
+    </w:p>
+    <w:p>
+      <w:pPr>
+        <w:spacing w:line="400" w:lineRule="auto"/>
+        <w:ind w:firstLine="440"/>
+        <w:jc w:val="both"/>
+        <w:rPr>
+          <w:rFonts w:ascii="Georgia" w:hAnsi="Georgia"/>
+          <w:color w:val="2B2B2B"/>
+          <w:sz w:val="26"/>
+        </w:rPr>
+      </w:pPr>
+      <w:r>
+        <w:rPr>
+          <w:rFonts w:ascii="Georgia" w:hAnsi="Georgia"/>
+          <w:color w:val="2B2B2B"/>
+          <w:sz w:val="26"/>
+        </w:rPr>
+        <w:t xml:space="preserve">“You never said Lissome,” she said. “On the PA. You didn’t say anything except what helped.”</w:t>
+      </w:r>
+    </w:p>
+    <w:p>
+      <w:pPr>
+        <w:spacing w:line="400" w:lineRule="auto"/>
+        <w:ind w:firstLine="440"/>
+        <w:jc w:val="both"/>
+        <w:rPr>
+          <w:rFonts w:ascii="Georgia" w:hAnsi="Georgia"/>
+          <w:color w:val="2B2B2B"/>
+          <w:sz w:val="26"/>
+        </w:rPr>
+      </w:pPr>
+      <w:r>
+        <w:rPr>
+          <w:rFonts w:ascii="Georgia" w:hAnsi="Georgia"/>
+          <w:color w:val="2B2B2B"/>
+          <w:sz w:val="26"/>
+        </w:rPr>
+        <w:t xml:space="preserve">Jesse waved that off.</w:t>
+      </w:r>
+    </w:p>
+    <w:p>
+      <w:pPr>
+        <w:spacing w:line="400" w:lineRule="auto"/>
+        <w:ind w:firstLine="440"/>
+        <w:jc w:val="both"/>
+        <w:rPr>
+          <w:rFonts w:ascii="Georgia" w:hAnsi="Georgia"/>
+          <w:color w:val="2B2B2B"/>
+          <w:sz w:val="26"/>
+        </w:rPr>
+      </w:pPr>
+      <w:r>
+        <w:rPr>
+          <w:rFonts w:ascii="Georgia" w:hAnsi="Georgia"/>
+          <w:color w:val="2B2B2B"/>
+          <w:sz w:val="26"/>
+        </w:rPr>
+        <w:t xml:space="preserve">“Thank you,” said Nora.</w:t>
+      </w:r>
+    </w:p>
+    <w:p>
+      <w:pPr>
+        <w:spacing w:line="400" w:lineRule="auto"/>
+        <w:ind w:firstLine="440"/>
+        <w:jc w:val="both"/>
+        <w:rPr>
+          <w:rFonts w:ascii="Georgia" w:hAnsi="Georgia"/>
+          <w:color w:val="2B2B2B"/>
+          <w:sz w:val="26"/>
+        </w:rPr>
+      </w:pPr>
+      <w:r>
+        <w:rPr>
+          <w:rFonts w:ascii="Georgia" w:hAnsi="Georgia"/>
+          <w:color w:val="2B2B2B"/>
+          <w:sz w:val="26"/>
+        </w:rPr>
+        <w:t xml:space="preserve">He studied her for a moment. Then he held out the camera bag.</w:t>
+      </w:r>
+    </w:p>
+    <w:p>
+      <w:pPr>
+        <w:spacing w:line="400" w:lineRule="auto"/>
+        <w:ind w:firstLine="440"/>
+        <w:jc w:val="both"/>
+        <w:rPr>
+          <w:rFonts w:ascii="Georgia" w:hAnsi="Georgia"/>
+          <w:color w:val="2B2B2B"/>
+          <w:sz w:val="26"/>
+        </w:rPr>
+      </w:pPr>
+      <w:r>
+        <w:rPr>
+          <w:rFonts w:ascii="Georgia" w:hAnsi="Georgia"/>
+          <w:color w:val="2B2B2B"/>
+          <w:sz w:val="26"/>
+        </w:rPr>
+        <w:t xml:space="preserve">She took it. She did not open it. She put it over her own shoulder, and then she put her arms around him, there in the empty concourse among the rolling cups and the lost eclipse glasses, and held on, and after a moment, very carefully, because of his shoulder and her wrist, he held on too.</w:t>
+      </w:r>
+    </w:p>
+    <w:p>
+      <w:pPr>
+        <w:spacing w:line="400" w:lineRule="auto"/>
+        <w:ind w:firstLine="440"/>
+        <w:jc w:val="both"/>
+        <w:rPr>
+          <w:rFonts w:ascii="Georgia" w:hAnsi="Georgia"/>
+          <w:color w:val="2B2B2B"/>
+          <w:sz w:val="26"/>
+        </w:rPr>
+      </w:pPr>
+      <w:r>
+        <w:rPr>
+          <w:rFonts w:ascii="Georgia" w:hAnsi="Georgia"/>
+          <w:color w:val="2B2B2B"/>
+          <w:sz w:val="26"/>
+        </w:rPr>
+        <w:t xml:space="preserve">“Biology,” he croaked into her hair, eventually. It was all the voice he had left.</w:t>
+      </w:r>
+    </w:p>
+    <w:p>
+      <w:pPr>
+        <w:spacing w:line="400" w:lineRule="auto"/>
+        <w:ind w:firstLine="440"/>
+        <w:jc w:val="both"/>
+        <w:rPr>
+          <w:rFonts w:ascii="Georgia" w:hAnsi="Georgia"/>
+          <w:color w:val="2B2B2B"/>
+          <w:sz w:val="26"/>
+        </w:rPr>
+      </w:pPr>
+      <w:r>
+        <w:rPr>
+          <w:rFonts w:ascii="Georgia" w:hAnsi="Georgia"/>
+          <w:color w:val="2B2B2B"/>
+          <w:sz w:val="26"/>
+        </w:rPr>
+        <w:t xml:space="preserve">“What?”</w:t>
+      </w:r>
+    </w:p>
+    <w:p>
+      <w:pPr>
+        <w:spacing w:line="400" w:lineRule="auto"/>
+        <w:ind w:firstLine="440"/>
+        <w:jc w:val="both"/>
+        <w:rPr>
+          <w:rFonts w:ascii="Georgia" w:hAnsi="Georgia"/>
+          <w:color w:val="2B2B2B"/>
+          <w:sz w:val="26"/>
+        </w:rPr>
+      </w:pPr>
+      <w:r>
+        <w:rPr>
+          <w:rFonts w:ascii="Georgia" w:hAnsi="Georgia"/>
+          <w:color w:val="2B2B2B"/>
+          <w:sz w:val="26"/>
+        </w:rPr>
+        <w:t xml:space="preserve">“I had a line. For the break room. In Colorado. I didn’t use it. I was going to say: we could talk it through like adults, or —” he coughed — “biology.”</w:t>
+      </w:r>
+    </w:p>
+    <w:p>
+      <w:pPr>
+        <w:spacing w:line="400" w:lineRule="auto"/>
+        <w:ind w:firstLine="440"/>
+        <w:jc w:val="both"/>
+        <w:rPr>
+          <w:rFonts w:ascii="Georgia" w:hAnsi="Georgia"/>
+          <w:color w:val="2B2B2B"/>
+          <w:sz w:val="26"/>
+        </w:rPr>
+      </w:pPr>
+      <w:r>
+        <w:rPr>
+          <w:rFonts w:ascii="Georgia" w:hAnsi="Georgia"/>
+          <w:color w:val="2B2B2B"/>
+          <w:sz w:val="26"/>
+        </w:rPr>
+        <w:t xml:space="preserve">Nora pulled back and looked at him.</w:t>
+      </w:r>
+    </w:p>
+    <w:p>
+      <w:pPr>
+        <w:spacing w:line="400" w:lineRule="auto"/>
+        <w:ind w:firstLine="440"/>
+        <w:jc w:val="both"/>
+        <w:rPr>
+          <w:rFonts w:ascii="Georgia" w:hAnsi="Georgia"/>
+          <w:color w:val="2B2B2B"/>
+          <w:sz w:val="26"/>
+        </w:rPr>
+      </w:pPr>
+      <w:r>
+        <w:rPr>
+          <w:rFonts w:ascii="Georgia" w:hAnsi="Georgia"/>
+          <w:color w:val="2B2B2B"/>
+          <w:sz w:val="26"/>
+        </w:rPr>
+        <w:t xml:space="preserve">“That’s a terrible line,” she said.</w:t>
+      </w:r>
+    </w:p>
+    <w:p>
+      <w:pPr>
+        <w:spacing w:line="400" w:lineRule="auto"/>
+        <w:ind w:firstLine="440"/>
+        <w:jc w:val="both"/>
+        <w:rPr>
+          <w:rFonts w:ascii="Georgia" w:hAnsi="Georgia"/>
+          <w:color w:val="2B2B2B"/>
+          <w:sz w:val="26"/>
+        </w:rPr>
+      </w:pPr>
+      <w:r>
+        <w:rPr>
+          <w:rFonts w:ascii="Georgia" w:hAnsi="Georgia"/>
+          <w:color w:val="2B2B2B"/>
+          <w:sz w:val="26"/>
+        </w:rPr>
+        <w:t xml:space="preserve">“I know. That’s why I didn’t use it.”</w:t>
+      </w:r>
+    </w:p>
+    <w:p>
+      <w:pPr>
+        <w:spacing w:line="400" w:lineRule="auto"/>
+        <w:ind w:firstLine="440"/>
+        <w:jc w:val="both"/>
+        <w:rPr>
+          <w:rFonts w:ascii="Georgia" w:hAnsi="Georgia"/>
+          <w:color w:val="2B2B2B"/>
+          <w:sz w:val="26"/>
+        </w:rPr>
+      </w:pPr>
+      <w:r>
+        <w:rPr>
+          <w:rFonts w:ascii="Georgia" w:hAnsi="Georgia"/>
+          <w:color w:val="2B2B2B"/>
+          <w:sz w:val="26"/>
+        </w:rPr>
+        <w:t xml:space="preserve">“Good,” said Nora. “Never use it.” And she kissed him, in the empty concourse, under the sodium lights, while a mariachi band played on the north side of the bowl for a hundred people dancing, and she thought, for the first time since the barn, that she would like very much to film something again. Not this. Something ordinary. A wedding. Anybody’s.</w:t>
+      </w:r>
+    </w:p>
+    <w:p>
+      <w:pPr>
+        <w:spacing w:line="400" w:lineRule="auto"/>
+        <w:jc w:val="center"/>
+        <w:rPr>
+          <w:rFonts w:ascii="Georgia" w:hAnsi="Georgia"/>
+          <w:color w:val="2B2B2B"/>
+          <w:sz w:val="26"/>
+        </w:rPr>
+      </w:pPr>
+      <w:r>
+        <w:rPr>
+          <w:rFonts w:ascii="Georgia" w:hAnsi="Georgia"/>
+          <w:color w:val="2B2B2B"/>
+          <w:sz w:val="26"/>
+        </w:rPr>
+        <w:t xml:space="preserve">∗</w:t>
+      </w:r>
+    </w:p>
+    <w:p>
+      <w:pPr>
+        <w:spacing w:line="400" w:lineRule="auto"/>
+        <w:ind w:firstLine="440"/>
+        <w:jc w:val="both"/>
+        <w:rPr>
+          <w:rFonts w:ascii="Georgia" w:hAnsi="Georgia"/>
+          <w:color w:val="2B2B2B"/>
+          <w:sz w:val="26"/>
+        </w:rPr>
+      </w:pPr>
+      <w:r>
+        <w:rPr>
+          <w:rFonts w:ascii="Georgia" w:hAnsi="Georgia"/>
+          <w:color w:val="2B2B2B"/>
+          <w:sz w:val="26"/>
+        </w:rPr>
+        <w:t xml:space="preserve">Kade was standing on the top row of the western stand when Dana found him, at half past ten, with his hands in his pockets, looking out at the dark plain where the sun had gone down.</w:t>
+      </w:r>
+    </w:p>
+    <w:p>
+      <w:pPr>
+        <w:spacing w:line="400" w:lineRule="auto"/>
+        <w:ind w:firstLine="440"/>
+        <w:jc w:val="both"/>
+        <w:rPr>
+          <w:rFonts w:ascii="Georgia" w:hAnsi="Georgia"/>
+          <w:color w:val="2B2B2B"/>
+          <w:sz w:val="26"/>
+        </w:rPr>
+      </w:pPr>
+      <w:r>
+        <w:rPr>
+          <w:rFonts w:ascii="Georgia" w:hAnsi="Georgia"/>
+          <w:color w:val="2B2B2B"/>
+          <w:sz w:val="26"/>
+        </w:rPr>
+        <w:t xml:space="preserve">Above them, faint and fading, a few of his sails still caught the last of the light from below the horizon, high enough up to be lit while the ground was dark: small slow points, folding, like a trick he was tired of explaining.</w:t>
+      </w:r>
+    </w:p>
+    <w:p>
+      <w:pPr>
+        <w:spacing w:line="400" w:lineRule="auto"/>
+        <w:ind w:firstLine="440"/>
+        <w:jc w:val="both"/>
+        <w:rPr>
+          <w:rFonts w:ascii="Georgia" w:hAnsi="Georgia"/>
+          <w:color w:val="2B2B2B"/>
+          <w:sz w:val="26"/>
+        </w:rPr>
+      </w:pPr>
+      <w:r>
+        <w:rPr>
+          <w:rFonts w:ascii="Georgia" w:hAnsi="Georgia"/>
+          <w:color w:val="2B2B2B"/>
+          <w:sz w:val="26"/>
+        </w:rPr>
+        <w:t xml:space="preserve">“Milo watched it,” he said, without turning around. “On the TV in the hospital in Denver. He texted me. He said the hospital gravy was still a crime, the commentator had not improved, and the ring, he allowed, had been cool.” Something that was nearly a smile went across Kade’s face and did not stay. “He has no idea.”</w:t>
+      </w:r>
+    </w:p>
+    <w:p>
+      <w:pPr>
+        <w:spacing w:line="400" w:lineRule="auto"/>
+        <w:ind w:firstLine="440"/>
+        <w:jc w:val="both"/>
+        <w:rPr>
+          <w:rFonts w:ascii="Georgia" w:hAnsi="Georgia"/>
+          <w:color w:val="2B2B2B"/>
+          <w:sz w:val="26"/>
+        </w:rPr>
+      </w:pPr>
+      <w:r>
+        <w:rPr>
+          <w:rFonts w:ascii="Georgia" w:hAnsi="Georgia"/>
+          <w:color w:val="2B2B2B"/>
+          <w:sz w:val="26"/>
+        </w:rPr>
+        <w:t xml:space="preserve">“That’s the best outcome,” said Dana. “Halvorsen said so.”</w:t>
+      </w:r>
+    </w:p>
+    <w:p>
+      <w:pPr>
+        <w:spacing w:line="400" w:lineRule="auto"/>
+        <w:ind w:firstLine="440"/>
+        <w:jc w:val="both"/>
+        <w:rPr>
+          <w:rFonts w:ascii="Georgia" w:hAnsi="Georgia"/>
+          <w:color w:val="2B2B2B"/>
+          <w:sz w:val="26"/>
+        </w:rPr>
+      </w:pPr>
+      <w:r>
+        <w:rPr>
+          <w:rFonts w:ascii="Georgia" w:hAnsi="Georgia"/>
+          <w:color w:val="2B2B2B"/>
+          <w:sz w:val="26"/>
+        </w:rPr>
+        <w:t xml:space="preserve">“Halvorsen is usually right.” A sail winked out overhead. “Buchanan will want my license. My board will want my head. I disobeyed a written instruction from a government that owns a third of my launch contracts, in front of witnesses.” He did not sound sorry. “One of them is going to get what they want.”</w:t>
+      </w:r>
+    </w:p>
+    <w:p>
+      <w:pPr>
+        <w:spacing w:line="400" w:lineRule="auto"/>
+        <w:ind w:firstLine="440"/>
+        <w:jc w:val="both"/>
+        <w:rPr>
+          <w:rFonts w:ascii="Georgia" w:hAnsi="Georgia"/>
+          <w:color w:val="2B2B2B"/>
+          <w:sz w:val="26"/>
+        </w:rPr>
+      </w:pPr>
+      <w:r>
+        <w:rPr>
+          <w:rFonts w:ascii="Georgia" w:hAnsi="Georgia"/>
+          <w:color w:val="2B2B2B"/>
+          <w:sz w:val="26"/>
+        </w:rPr>
+        <w:t xml:space="preserve">“Buchanan stood at attention,” said Dana. “In the trailer. In front of nobody. I saw her.”</w:t>
+      </w:r>
+    </w:p>
+    <w:p>
+      <w:pPr>
+        <w:spacing w:line="400" w:lineRule="auto"/>
+        <w:ind w:firstLine="440"/>
+        <w:jc w:val="both"/>
+        <w:rPr>
+          <w:rFonts w:ascii="Georgia" w:hAnsi="Georgia"/>
+          <w:color w:val="2B2B2B"/>
+          <w:sz w:val="26"/>
+        </w:rPr>
+      </w:pPr>
+      <w:r>
+        <w:rPr>
+          <w:rFonts w:ascii="Georgia" w:hAnsi="Georgia"/>
+          <w:color w:val="2B2B2B"/>
+          <w:sz w:val="26"/>
+        </w:rPr>
+        <w:t xml:space="preserve">“I saw her too.” Kade turned at last. “Will you do this again, Ms. Osei? Next August there’s another one. Spain again, the south coast this time, and six minutes of totality over Luxor. Buchanan will want a bigger broadcast. Somebody will want a bigger light show. And that thing will still be sitting out there sixty degrees ahead of Jupiter, waiting to see if we meant it.”</w:t>
+      </w:r>
+    </w:p>
+    <w:p>
+      <w:pPr>
+        <w:spacing w:line="400" w:lineRule="auto"/>
+        <w:ind w:firstLine="440"/>
+        <w:jc w:val="both"/>
+        <w:rPr>
+          <w:rFonts w:ascii="Georgia" w:hAnsi="Georgia"/>
+          <w:color w:val="2B2B2B"/>
+          <w:sz w:val="26"/>
+        </w:rPr>
+      </w:pPr>
+      <w:r>
+        <w:rPr>
+          <w:rFonts w:ascii="Georgia" w:hAnsi="Georgia"/>
+          <w:color w:val="2B2B2B"/>
+          <w:sz w:val="26"/>
+        </w:rPr>
+        <w:t xml:space="preserve">“Will you?”</w:t>
       </w:r>
     </w:p>
     <w:p>
@@ -42745,147 +43423,27 @@
           <w:color w:val="2B2B2B"/>
           <w:sz w:val="26"/>
         </w:rPr>
-        <w:t xml:space="preserve">“The weather’s gone,” he said. “The thing isn’t. I can feel it. It’s still there. But it’s quiet. It’s not — it’s not waiting anymore. It’s like a phone on a table.” He touched the base of his skull, lightly, the way the Escort had, the way a man knocks wood. “I don’t know if I want it out. I thought I did. Three hours ago I wanted it out more than I have ever wanted anything. Now I —” He stopped. “It’s the only line to him. Isn’t it. If they ever ask. If he ever comes down. It’s the only phone.”</w:t>
-      </w:r>
-    </w:p>
-    <w:p>
-      <w:pPr>
-        <w:spacing w:line="400" w:lineRule="auto"/>
-        <w:ind w:firstLine="440"/>
-        <w:jc w:val="both"/>
-        <w:rPr>
-          <w:rFonts w:ascii="Georgia" w:hAnsi="Georgia"/>
-          <w:color w:val="2B2B2B"/>
-          <w:sz w:val="26"/>
-        </w:rPr>
-      </w:pPr>
-      <w:r>
-        <w:rPr>
-          <w:rFonts w:ascii="Georgia" w:hAnsi="Georgia"/>
-          <w:color w:val="2B2B2B"/>
-          <w:sz w:val="26"/>
-        </w:rPr>
-        <w:t xml:space="preserve">“You don’t have to decide tonight,” said Nora.</w:t>
-      </w:r>
-    </w:p>
-    <w:p>
-      <w:pPr>
-        <w:spacing w:line="400" w:lineRule="auto"/>
-        <w:ind w:firstLine="440"/>
-        <w:jc w:val="both"/>
-        <w:rPr>
-          <w:rFonts w:ascii="Georgia" w:hAnsi="Georgia"/>
-          <w:color w:val="2B2B2B"/>
-          <w:sz w:val="26"/>
-        </w:rPr>
-      </w:pPr>
-      <w:r>
-        <w:rPr>
-          <w:rFonts w:ascii="Georgia" w:hAnsi="Georgia"/>
-          <w:color w:val="2B2B2B"/>
-          <w:sz w:val="26"/>
-        </w:rPr>
-        <w:t xml:space="preserve">“No,” said Dominic. He looked at her. “But I get to decide. Right? That’s the deal.”</w:t>
-      </w:r>
-    </w:p>
-    <w:p>
-      <w:pPr>
-        <w:spacing w:line="400" w:lineRule="auto"/>
-        <w:ind w:firstLine="440"/>
-        <w:jc w:val="both"/>
-        <w:rPr>
-          <w:rFonts w:ascii="Georgia" w:hAnsi="Georgia"/>
-          <w:color w:val="2B2B2B"/>
-          <w:sz w:val="26"/>
-        </w:rPr>
-      </w:pPr>
-      <w:r>
-        <w:rPr>
-          <w:rFonts w:ascii="Georgia" w:hAnsi="Georgia"/>
-          <w:color w:val="2B2B2B"/>
-          <w:sz w:val="26"/>
-        </w:rPr>
-        <w:t xml:space="preserve">“That’s the deal,” said Nora.</w:t>
-      </w:r>
-    </w:p>
-    <w:p>
-      <w:pPr>
-        <w:spacing w:line="400" w:lineRule="auto"/>
-        <w:ind w:firstLine="440"/>
-        <w:jc w:val="both"/>
-        <w:rPr>
-          <w:rFonts w:ascii="Georgia" w:hAnsi="Georgia"/>
-          <w:color w:val="2B2B2B"/>
-          <w:sz w:val="26"/>
-        </w:rPr>
-      </w:pPr>
-      <w:r>
-        <w:rPr>
-          <w:rFonts w:ascii="Georgia" w:hAnsi="Georgia"/>
-          <w:color w:val="2B2B2B"/>
-          <w:sz w:val="26"/>
-        </w:rPr>
-        <w:t xml:space="preserve">He nodded. He looked at his wife.</w:t>
-      </w:r>
-    </w:p>
-    <w:p>
-      <w:pPr>
-        <w:spacing w:line="400" w:lineRule="auto"/>
-        <w:ind w:firstLine="440"/>
-        <w:jc w:val="both"/>
-        <w:rPr>
-          <w:rFonts w:ascii="Georgia" w:hAnsi="Georgia"/>
-          <w:color w:val="2B2B2B"/>
-          <w:sz w:val="26"/>
-        </w:rPr>
-      </w:pPr>
-      <w:r>
-        <w:rPr>
-          <w:rFonts w:ascii="Georgia" w:hAnsi="Georgia"/>
-          <w:color w:val="2B2B2B"/>
-          <w:sz w:val="26"/>
-        </w:rPr>
-        <w:t xml:space="preserve">“Can we call my mom?” he said.</w:t>
-      </w:r>
-    </w:p>
-    <w:p>
-      <w:pPr>
-        <w:spacing w:line="400" w:lineRule="auto"/>
-        <w:ind w:firstLine="440"/>
-        <w:jc w:val="both"/>
-        <w:rPr>
-          <w:rFonts w:ascii="Georgia" w:hAnsi="Georgia"/>
-          <w:color w:val="2B2B2B"/>
-          <w:sz w:val="26"/>
-        </w:rPr>
-      </w:pPr>
-      <w:r>
-        <w:rPr>
-          <w:rFonts w:ascii="Georgia" w:hAnsi="Georgia"/>
-          <w:color w:val="2B2B2B"/>
-          <w:sz w:val="26"/>
-        </w:rPr>
-        <w:t xml:space="preserve">Mabs had already texted Rosa. She did not say so. She took out her phone and dialed and handed it to him, and he held it to his ear, and it rang once, and Rosa Reyes, in a church in Muncie, Indiana, at 3:20 on a Wednesday afternoon, picked up before the second ring.</w:t>
-      </w:r>
-    </w:p>
-    <w:p>
-      <w:pPr>
-        <w:spacing w:line="400" w:lineRule="auto"/>
-        <w:ind w:firstLine="440"/>
-        <w:jc w:val="both"/>
-        <w:rPr>
-          <w:rFonts w:ascii="Georgia" w:hAnsi="Georgia"/>
-          <w:color w:val="2B2B2B"/>
-          <w:sz w:val="26"/>
-        </w:rPr>
-      </w:pPr>
-      <w:r>
-        <w:rPr>
-          <w:rFonts w:ascii="Georgia" w:hAnsi="Georgia"/>
-          <w:color w:val="2B2B2B"/>
-          <w:sz w:val="26"/>
-        </w:rPr>
-        <w:t xml:space="preserve">Nora got up off the step and walked down the stairs of section 114 and left them there, because some things you do not film, and some things you do not even watch.</w:t>
+        <w:t xml:space="preserve">“I’ll build the stage,” he said, “and fight about the song.”</w:t>
+      </w:r>
+    </w:p>
+    <w:p>
+      <w:pPr>
+        <w:spacing w:line="400" w:lineRule="auto"/>
+        <w:ind w:firstLine="440"/>
+        <w:jc w:val="both"/>
+        <w:rPr>
+          <w:rFonts w:ascii="Georgia" w:hAnsi="Georgia"/>
+          <w:color w:val="2B2B2B"/>
+          <w:sz w:val="26"/>
+        </w:rPr>
+      </w:pPr>
+      <w:r>
+        <w:rPr>
+          <w:rFonts w:ascii="Georgia" w:hAnsi="Georgia"/>
+          <w:color w:val="2B2B2B"/>
+          <w:sz w:val="26"/>
+        </w:rPr>
+        <w:t xml:space="preserve">She took that for a yes that intended to stay complicated.</w:t>
       </w:r>
     </w:p>
     <w:p>
@@ -42924,564 +43482,6 @@
           <w:color w:val="2B2B2B"/>
           <w:sz w:val="26"/>
         </w:rPr>
-        <w:t xml:space="preserve">Jesse was waiting at the bottom of the stairs by gate four, in the empty concourse, with her camera bag over his shoulder.</w:t>
-      </w:r>
-    </w:p>
-    <w:p>
-      <w:pPr>
-        <w:spacing w:line="400" w:lineRule="auto"/>
-        <w:ind w:firstLine="440"/>
-        <w:jc w:val="both"/>
-        <w:rPr>
-          <w:rFonts w:ascii="Georgia" w:hAnsi="Georgia"/>
-          <w:color w:val="2B2B2B"/>
-          <w:sz w:val="26"/>
-        </w:rPr>
-      </w:pPr>
-      <w:r>
-        <w:rPr>
-          <w:rFonts w:ascii="Georgia" w:hAnsi="Georgia"/>
-          <w:color w:val="2B2B2B"/>
-          <w:sz w:val="26"/>
-        </w:rPr>
-        <w:t xml:space="preserve">He had been on the PA for forty minutes. His voice was gone. He had a bottle of water in his hand and a Halo radio on his belt that he had switched off, and when he saw her coming down the stairs he did not say anything, because he could not, and because, she thought, he had decided not to narrate this either.</w:t>
-      </w:r>
-    </w:p>
-    <w:p>
-      <w:pPr>
-        <w:spacing w:line="400" w:lineRule="auto"/>
-        <w:ind w:firstLine="440"/>
-        <w:jc w:val="both"/>
-        <w:rPr>
-          <w:rFonts w:ascii="Georgia" w:hAnsi="Georgia"/>
-          <w:color w:val="2B2B2B"/>
-          <w:sz w:val="26"/>
-        </w:rPr>
-      </w:pPr>
-      <w:r>
-        <w:rPr>
-          <w:rFonts w:ascii="Georgia" w:hAnsi="Georgia"/>
-          <w:color w:val="2B2B2B"/>
-          <w:sz w:val="26"/>
-        </w:rPr>
-        <w:t xml:space="preserve">She stopped in front of him.</w:t>
-      </w:r>
-    </w:p>
-    <w:p>
-      <w:pPr>
-        <w:spacing w:line="400" w:lineRule="auto"/>
-        <w:ind w:firstLine="440"/>
-        <w:jc w:val="both"/>
-        <w:rPr>
-          <w:rFonts w:ascii="Georgia" w:hAnsi="Georgia"/>
-          <w:color w:val="2B2B2B"/>
-          <w:sz w:val="26"/>
-        </w:rPr>
-      </w:pPr>
-      <w:r>
-        <w:rPr>
-          <w:rFonts w:ascii="Georgia" w:hAnsi="Georgia"/>
-          <w:color w:val="2B2B2B"/>
-          <w:sz w:val="26"/>
-        </w:rPr>
-        <w:t xml:space="preserve">“You didn’t say Lissome,” she said. “On the PA. You didn’t say anything except what helped.”</w:t>
-      </w:r>
-    </w:p>
-    <w:p>
-      <w:pPr>
-        <w:spacing w:line="400" w:lineRule="auto"/>
-        <w:ind w:firstLine="440"/>
-        <w:jc w:val="both"/>
-        <w:rPr>
-          <w:rFonts w:ascii="Georgia" w:hAnsi="Georgia"/>
-          <w:color w:val="2B2B2B"/>
-          <w:sz w:val="26"/>
-        </w:rPr>
-      </w:pPr>
-      <w:r>
-        <w:rPr>
-          <w:rFonts w:ascii="Georgia" w:hAnsi="Georgia"/>
-          <w:color w:val="2B2B2B"/>
-          <w:sz w:val="26"/>
-        </w:rPr>
-        <w:t xml:space="preserve">He shook his head.</w:t>
-      </w:r>
-    </w:p>
-    <w:p>
-      <w:pPr>
-        <w:spacing w:line="400" w:lineRule="auto"/>
-        <w:ind w:firstLine="440"/>
-        <w:jc w:val="both"/>
-        <w:rPr>
-          <w:rFonts w:ascii="Georgia" w:hAnsi="Georgia"/>
-          <w:color w:val="2B2B2B"/>
-          <w:sz w:val="26"/>
-        </w:rPr>
-      </w:pPr>
-      <w:r>
-        <w:rPr>
-          <w:rFonts w:ascii="Georgia" w:hAnsi="Georgia"/>
-          <w:color w:val="2B2B2B"/>
-          <w:sz w:val="26"/>
-        </w:rPr>
-        <w:t xml:space="preserve">“Thank you,” said Nora.</w:t>
-      </w:r>
-    </w:p>
-    <w:p>
-      <w:pPr>
-        <w:spacing w:line="400" w:lineRule="auto"/>
-        <w:ind w:firstLine="440"/>
-        <w:jc w:val="both"/>
-        <w:rPr>
-          <w:rFonts w:ascii="Georgia" w:hAnsi="Georgia"/>
-          <w:color w:val="2B2B2B"/>
-          <w:sz w:val="26"/>
-        </w:rPr>
-      </w:pPr>
-      <w:r>
-        <w:rPr>
-          <w:rFonts w:ascii="Georgia" w:hAnsi="Georgia"/>
-          <w:color w:val="2B2B2B"/>
-          <w:sz w:val="26"/>
-        </w:rPr>
-        <w:t xml:space="preserve">He looked at her. Then he held out the camera bag.</w:t>
-      </w:r>
-    </w:p>
-    <w:p>
-      <w:pPr>
-        <w:spacing w:line="400" w:lineRule="auto"/>
-        <w:ind w:firstLine="440"/>
-        <w:jc w:val="both"/>
-        <w:rPr>
-          <w:rFonts w:ascii="Georgia" w:hAnsi="Georgia"/>
-          <w:color w:val="2B2B2B"/>
-          <w:sz w:val="26"/>
-        </w:rPr>
-      </w:pPr>
-      <w:r>
-        <w:rPr>
-          <w:rFonts w:ascii="Georgia" w:hAnsi="Georgia"/>
-          <w:color w:val="2B2B2B"/>
-          <w:sz w:val="26"/>
-        </w:rPr>
-        <w:t xml:space="preserve">She took it. She did not open it. She put it over her own shoulder, and then she put her arms around him, there in the empty concourse among the rolling cups and the lost eclipse glasses, and held on, and after a moment, very carefully, because of his shoulder and her wrist, he held on too.</w:t>
-      </w:r>
-    </w:p>
-    <w:p>
-      <w:pPr>
-        <w:spacing w:line="400" w:lineRule="auto"/>
-        <w:ind w:firstLine="440"/>
-        <w:jc w:val="both"/>
-        <w:rPr>
-          <w:rFonts w:ascii="Georgia" w:hAnsi="Georgia"/>
-          <w:color w:val="2B2B2B"/>
-          <w:sz w:val="26"/>
-        </w:rPr>
-      </w:pPr>
-      <w:r>
-        <w:rPr>
-          <w:rFonts w:ascii="Georgia" w:hAnsi="Georgia"/>
-          <w:color w:val="2B2B2B"/>
-          <w:sz w:val="26"/>
-        </w:rPr>
-        <w:t xml:space="preserve">“Biology,” he croaked into her hair, eventually. It was all the voice he had left.</w:t>
-      </w:r>
-    </w:p>
-    <w:p>
-      <w:pPr>
-        <w:spacing w:line="400" w:lineRule="auto"/>
-        <w:ind w:firstLine="440"/>
-        <w:jc w:val="both"/>
-        <w:rPr>
-          <w:rFonts w:ascii="Georgia" w:hAnsi="Georgia"/>
-          <w:color w:val="2B2B2B"/>
-          <w:sz w:val="26"/>
-        </w:rPr>
-      </w:pPr>
-      <w:r>
-        <w:rPr>
-          <w:rFonts w:ascii="Georgia" w:hAnsi="Georgia"/>
-          <w:color w:val="2B2B2B"/>
-          <w:sz w:val="26"/>
-        </w:rPr>
-        <w:t xml:space="preserve">“What?”</w:t>
-      </w:r>
-    </w:p>
-    <w:p>
-      <w:pPr>
-        <w:spacing w:line="400" w:lineRule="auto"/>
-        <w:ind w:firstLine="440"/>
-        <w:jc w:val="both"/>
-        <w:rPr>
-          <w:rFonts w:ascii="Georgia" w:hAnsi="Georgia"/>
-          <w:color w:val="2B2B2B"/>
-          <w:sz w:val="26"/>
-        </w:rPr>
-      </w:pPr>
-      <w:r>
-        <w:rPr>
-          <w:rFonts w:ascii="Georgia" w:hAnsi="Georgia"/>
-          <w:color w:val="2B2B2B"/>
-          <w:sz w:val="26"/>
-        </w:rPr>
-        <w:t xml:space="preserve">“I had a line. For the break room. In Colorado. I didn’t use it. I was going to say: we could talk it through like adults, or —” he coughed — “biology.”</w:t>
-      </w:r>
-    </w:p>
-    <w:p>
-      <w:pPr>
-        <w:spacing w:line="400" w:lineRule="auto"/>
-        <w:ind w:firstLine="440"/>
-        <w:jc w:val="both"/>
-        <w:rPr>
-          <w:rFonts w:ascii="Georgia" w:hAnsi="Georgia"/>
-          <w:color w:val="2B2B2B"/>
-          <w:sz w:val="26"/>
-        </w:rPr>
-      </w:pPr>
-      <w:r>
-        <w:rPr>
-          <w:rFonts w:ascii="Georgia" w:hAnsi="Georgia"/>
-          <w:color w:val="2B2B2B"/>
-          <w:sz w:val="26"/>
-        </w:rPr>
-        <w:t xml:space="preserve">Nora pulled back and looked at him.</w:t>
-      </w:r>
-    </w:p>
-    <w:p>
-      <w:pPr>
-        <w:spacing w:line="400" w:lineRule="auto"/>
-        <w:ind w:firstLine="440"/>
-        <w:jc w:val="both"/>
-        <w:rPr>
-          <w:rFonts w:ascii="Georgia" w:hAnsi="Georgia"/>
-          <w:color w:val="2B2B2B"/>
-          <w:sz w:val="26"/>
-        </w:rPr>
-      </w:pPr>
-      <w:r>
-        <w:rPr>
-          <w:rFonts w:ascii="Georgia" w:hAnsi="Georgia"/>
-          <w:color w:val="2B2B2B"/>
-          <w:sz w:val="26"/>
-        </w:rPr>
-        <w:t xml:space="preserve">“That’s a terrible line,” she said.</w:t>
-      </w:r>
-    </w:p>
-    <w:p>
-      <w:pPr>
-        <w:spacing w:line="400" w:lineRule="auto"/>
-        <w:ind w:firstLine="440"/>
-        <w:jc w:val="both"/>
-        <w:rPr>
-          <w:rFonts w:ascii="Georgia" w:hAnsi="Georgia"/>
-          <w:color w:val="2B2B2B"/>
-          <w:sz w:val="26"/>
-        </w:rPr>
-      </w:pPr>
-      <w:r>
-        <w:rPr>
-          <w:rFonts w:ascii="Georgia" w:hAnsi="Georgia"/>
-          <w:color w:val="2B2B2B"/>
-          <w:sz w:val="26"/>
-        </w:rPr>
-        <w:t xml:space="preserve">“I know. That’s why I didn’t use it.”</w:t>
-      </w:r>
-    </w:p>
-    <w:p>
-      <w:pPr>
-        <w:spacing w:line="400" w:lineRule="auto"/>
-        <w:ind w:firstLine="440"/>
-        <w:jc w:val="both"/>
-        <w:rPr>
-          <w:rFonts w:ascii="Georgia" w:hAnsi="Georgia"/>
-          <w:color w:val="2B2B2B"/>
-          <w:sz w:val="26"/>
-        </w:rPr>
-      </w:pPr>
-      <w:r>
-        <w:rPr>
-          <w:rFonts w:ascii="Georgia" w:hAnsi="Georgia"/>
-          <w:color w:val="2B2B2B"/>
-          <w:sz w:val="26"/>
-        </w:rPr>
-        <w:t xml:space="preserve">“Good,” said Nora. “Never use it.” And she kissed him, in the empty concourse, under the sodium lights, while a mariachi band played on the north side of the bowl for a hundred people dancing, and she thought, for the first time since the barn, that she would like very much to film something again. Not this. Something ordinary. A wedding. Anybody’s.</w:t>
-      </w:r>
-    </w:p>
-    <w:p>
-      <w:pPr>
-        <w:spacing w:line="400" w:lineRule="auto"/>
-        <w:jc w:val="center"/>
-        <w:rPr>
-          <w:rFonts w:ascii="Georgia" w:hAnsi="Georgia"/>
-          <w:color w:val="2B2B2B"/>
-          <w:sz w:val="26"/>
-        </w:rPr>
-      </w:pPr>
-      <w:r>
-        <w:rPr>
-          <w:rFonts w:ascii="Georgia" w:hAnsi="Georgia"/>
-          <w:color w:val="2B2B2B"/>
-          <w:sz w:val="26"/>
-        </w:rPr>
-        <w:t xml:space="preserve">∗</w:t>
-      </w:r>
-    </w:p>
-    <w:p>
-      <w:pPr>
-        <w:spacing w:line="400" w:lineRule="auto"/>
-        <w:ind w:firstLine="440"/>
-        <w:jc w:val="both"/>
-        <w:rPr>
-          <w:rFonts w:ascii="Georgia" w:hAnsi="Georgia"/>
-          <w:color w:val="2B2B2B"/>
-          <w:sz w:val="26"/>
-        </w:rPr>
-      </w:pPr>
-      <w:r>
-        <w:rPr>
-          <w:rFonts w:ascii="Georgia" w:hAnsi="Georgia"/>
-          <w:color w:val="2B2B2B"/>
-          <w:sz w:val="26"/>
-        </w:rPr>
-        <w:t xml:space="preserve">Kade was standing on the top row of the western stand when Dana found him, at half past ten, with his hands in his pockets, looking out at the dark plain where the sun had gone down.</w:t>
-      </w:r>
-    </w:p>
-    <w:p>
-      <w:pPr>
-        <w:spacing w:line="400" w:lineRule="auto"/>
-        <w:ind w:firstLine="440"/>
-        <w:jc w:val="both"/>
-        <w:rPr>
-          <w:rFonts w:ascii="Georgia" w:hAnsi="Georgia"/>
-          <w:color w:val="2B2B2B"/>
-          <w:sz w:val="26"/>
-        </w:rPr>
-      </w:pPr>
-      <w:r>
-        <w:rPr>
-          <w:rFonts w:ascii="Georgia" w:hAnsi="Georgia"/>
-          <w:color w:val="2B2B2B"/>
-          <w:sz w:val="26"/>
-        </w:rPr>
-        <w:t xml:space="preserve">Above them, faint and fading, a few of his sails still caught the last of the light from below the horizon, high enough up to be lit while the ground was dark: small slow points, folding, like a trick he was tired of explaining.</w:t>
-      </w:r>
-    </w:p>
-    <w:p>
-      <w:pPr>
-        <w:spacing w:line="400" w:lineRule="auto"/>
-        <w:ind w:firstLine="440"/>
-        <w:jc w:val="both"/>
-        <w:rPr>
-          <w:rFonts w:ascii="Georgia" w:hAnsi="Georgia"/>
-          <w:color w:val="2B2B2B"/>
-          <w:sz w:val="26"/>
-        </w:rPr>
-      </w:pPr>
-      <w:r>
-        <w:rPr>
-          <w:rFonts w:ascii="Georgia" w:hAnsi="Georgia"/>
-          <w:color w:val="2B2B2B"/>
-          <w:sz w:val="26"/>
-        </w:rPr>
-        <w:t xml:space="preserve">“Milo watched it,” he said, without turning around. “On the TV in the hospital in Denver. He texted me. He said the ring was cool and the commentator was bad and the hospital gravy was still a crime.” Something that was nearly a smile went across Kade’s face and did not stay. “He has no idea.”</w:t>
-      </w:r>
-    </w:p>
-    <w:p>
-      <w:pPr>
-        <w:spacing w:line="400" w:lineRule="auto"/>
-        <w:ind w:firstLine="440"/>
-        <w:jc w:val="both"/>
-        <w:rPr>
-          <w:rFonts w:ascii="Georgia" w:hAnsi="Georgia"/>
-          <w:color w:val="2B2B2B"/>
-          <w:sz w:val="26"/>
-        </w:rPr>
-      </w:pPr>
-      <w:r>
-        <w:rPr>
-          <w:rFonts w:ascii="Georgia" w:hAnsi="Georgia"/>
-          <w:color w:val="2B2B2B"/>
-          <w:sz w:val="26"/>
-        </w:rPr>
-        <w:t xml:space="preserve">“That’s the best outcome,” said Dana. “Halvorsen said so.”</w:t>
-      </w:r>
-    </w:p>
-    <w:p>
-      <w:pPr>
-        <w:spacing w:line="400" w:lineRule="auto"/>
-        <w:ind w:firstLine="440"/>
-        <w:jc w:val="both"/>
-        <w:rPr>
-          <w:rFonts w:ascii="Georgia" w:hAnsi="Georgia"/>
-          <w:color w:val="2B2B2B"/>
-          <w:sz w:val="26"/>
-        </w:rPr>
-      </w:pPr>
-      <w:r>
-        <w:rPr>
-          <w:rFonts w:ascii="Georgia" w:hAnsi="Georgia"/>
-          <w:color w:val="2B2B2B"/>
-          <w:sz w:val="26"/>
-        </w:rPr>
-        <w:t xml:space="preserve">“Halvorsen is usually right.” A sail winked out overhead. “Buchanan will want my license. My board will want my head. I disobeyed a written instruction from a government that owns a third of my launch contracts, in front of witnesses.” He did not sound sorry. “One of them is going to get what they want.”</w:t>
-      </w:r>
-    </w:p>
-    <w:p>
-      <w:pPr>
-        <w:spacing w:line="400" w:lineRule="auto"/>
-        <w:ind w:firstLine="440"/>
-        <w:jc w:val="both"/>
-        <w:rPr>
-          <w:rFonts w:ascii="Georgia" w:hAnsi="Georgia"/>
-          <w:color w:val="2B2B2B"/>
-          <w:sz w:val="26"/>
-        </w:rPr>
-      </w:pPr>
-      <w:r>
-        <w:rPr>
-          <w:rFonts w:ascii="Georgia" w:hAnsi="Georgia"/>
-          <w:color w:val="2B2B2B"/>
-          <w:sz w:val="26"/>
-        </w:rPr>
-        <w:t xml:space="preserve">“Buchanan stood at attention,” said Dana. “In the trailer. In front of nobody. I saw her.”</w:t>
-      </w:r>
-    </w:p>
-    <w:p>
-      <w:pPr>
-        <w:spacing w:line="400" w:lineRule="auto"/>
-        <w:ind w:firstLine="440"/>
-        <w:jc w:val="both"/>
-        <w:rPr>
-          <w:rFonts w:ascii="Georgia" w:hAnsi="Georgia"/>
-          <w:color w:val="2B2B2B"/>
-          <w:sz w:val="26"/>
-        </w:rPr>
-      </w:pPr>
-      <w:r>
-        <w:rPr>
-          <w:rFonts w:ascii="Georgia" w:hAnsi="Georgia"/>
-          <w:color w:val="2B2B2B"/>
-          <w:sz w:val="26"/>
-        </w:rPr>
-        <w:t xml:space="preserve">“I saw her too.” Kade turned at last. “Will you do this again, Ms. Osei? Next August there’s another one. Spain again, the south coast this time, and six minutes of totality over Luxor. Buchanan will want a bigger broadcast. Somebody will want a bigger light show. And that thing will still be sitting out there sixty degrees ahead of Jupiter, waiting to see if we meant it.”</w:t>
-      </w:r>
-    </w:p>
-    <w:p>
-      <w:pPr>
-        <w:spacing w:line="400" w:lineRule="auto"/>
-        <w:ind w:firstLine="440"/>
-        <w:jc w:val="both"/>
-        <w:rPr>
-          <w:rFonts w:ascii="Georgia" w:hAnsi="Georgia"/>
-          <w:color w:val="2B2B2B"/>
-          <w:sz w:val="26"/>
-        </w:rPr>
-      </w:pPr>
-      <w:r>
-        <w:rPr>
-          <w:rFonts w:ascii="Georgia" w:hAnsi="Georgia"/>
-          <w:color w:val="2B2B2B"/>
-          <w:sz w:val="26"/>
-        </w:rPr>
-        <w:t xml:space="preserve">“Will you?”</w:t>
-      </w:r>
-    </w:p>
-    <w:p>
-      <w:pPr>
-        <w:spacing w:line="400" w:lineRule="auto"/>
-        <w:ind w:firstLine="440"/>
-        <w:jc w:val="both"/>
-        <w:rPr>
-          <w:rFonts w:ascii="Georgia" w:hAnsi="Georgia"/>
-          <w:color w:val="2B2B2B"/>
-          <w:sz w:val="26"/>
-        </w:rPr>
-      </w:pPr>
-      <w:r>
-        <w:rPr>
-          <w:rFonts w:ascii="Georgia" w:hAnsi="Georgia"/>
-          <w:color w:val="2B2B2B"/>
-          <w:sz w:val="26"/>
-        </w:rPr>
-        <w:t xml:space="preserve">He thought about it.</w:t>
-      </w:r>
-    </w:p>
-    <w:p>
-      <w:pPr>
-        <w:spacing w:line="400" w:lineRule="auto"/>
-        <w:ind w:firstLine="440"/>
-        <w:jc w:val="both"/>
-        <w:rPr>
-          <w:rFonts w:ascii="Georgia" w:hAnsi="Georgia"/>
-          <w:color w:val="2B2B2B"/>
-          <w:sz w:val="26"/>
-        </w:rPr>
-      </w:pPr>
-      <w:r>
-        <w:rPr>
-          <w:rFonts w:ascii="Georgia" w:hAnsi="Georgia"/>
-          <w:color w:val="2B2B2B"/>
-          <w:sz w:val="26"/>
-        </w:rPr>
-        <w:t xml:space="preserve">“I’ll build the stage,” he said, “and fight about the song.”</w:t>
-      </w:r>
-    </w:p>
-    <w:p>
-      <w:pPr>
-        <w:spacing w:line="400" w:lineRule="auto"/>
-        <w:ind w:firstLine="440"/>
-        <w:jc w:val="both"/>
-        <w:rPr>
-          <w:rFonts w:ascii="Georgia" w:hAnsi="Georgia"/>
-          <w:color w:val="2B2B2B"/>
-          <w:sz w:val="26"/>
-        </w:rPr>
-      </w:pPr>
-      <w:r>
-        <w:rPr>
-          <w:rFonts w:ascii="Georgia" w:hAnsi="Georgia"/>
-          <w:color w:val="2B2B2B"/>
-          <w:sz w:val="26"/>
-        </w:rPr>
-        <w:t xml:space="preserve">She took that for a yes that intended to stay complicated.</w:t>
-      </w:r>
-    </w:p>
-    <w:p>
-      <w:pPr>
-        <w:spacing w:line="400" w:lineRule="auto"/>
-        <w:jc w:val="center"/>
-        <w:rPr>
-          <w:rFonts w:ascii="Georgia" w:hAnsi="Georgia"/>
-          <w:color w:val="2B2B2B"/>
-          <w:sz w:val="26"/>
-        </w:rPr>
-      </w:pPr>
-      <w:r>
-        <w:rPr>
-          <w:rFonts w:ascii="Georgia" w:hAnsi="Georgia"/>
-          <w:color w:val="2B2B2B"/>
-          <w:sz w:val="26"/>
-        </w:rPr>
-        <w:t xml:space="preserve">∗</w:t>
-      </w:r>
-    </w:p>
-    <w:p>
-      <w:pPr>
-        <w:spacing w:line="400" w:lineRule="auto"/>
-        <w:ind w:firstLine="440"/>
-        <w:jc w:val="both"/>
-        <w:rPr>
-          <w:rFonts w:ascii="Georgia" w:hAnsi="Georgia"/>
-          <w:color w:val="2B2B2B"/>
-          <w:sz w:val="26"/>
-        </w:rPr>
-      </w:pPr>
-      <w:r>
-        <w:rPr>
-          <w:rFonts w:ascii="Georgia" w:hAnsi="Georgia"/>
-          <w:color w:val="2B2B2B"/>
-          <w:sz w:val="26"/>
-        </w:rPr>
         <w:t xml:space="preserve">At midnight, in the Halo compound, Feld sat alone on the steps of the operations trailer with a cup of tea and a piece of toast he had not eaten.</w:t>
       </w:r>
     </w:p>
@@ -43622,7 +43622,7 @@
           <w:color w:val="2B2B2B"/>
           <w:sz w:val="26"/>
         </w:rPr>
-        <w:t xml:space="preserve">Halvorsen said nothing. They sat together on the trailer steps, in the warm Spanish night, two people who had spent their lives listening to the sky, and above them the stars wheeled slowly past a place low in the west-south-west where, invisible, a small old craft hung over the curve of the world, and did not move.</w:t>
+        <w:t xml:space="preserve">Halvorsen said nothing. They sat together on the trailer steps, in the warm Spanish night, two people who had spent their lives listening to the sky, and above them the stars wheeled slowly past a place low in the west-south-west where the old tender still hung, unseen, above the curve of the world, and did not move.</w:t>
       </w:r>
     </w:p>
     <w:p>
@@ -43891,7 +43891,7 @@
           <w:color w:val="2B2B2B"/>
           <w:sz w:val="26"/>
         </w:rPr>
-        <w:t xml:space="preserve">Halo performed as directed during a technical anomaly at a consumer event.</w:t>
+        <w:t xml:space="preserve">Halo performed as directed, and the event is recorded as a technical anomaly at a consumer venue.</w:t>
       </w:r>
     </w:p>
     <w:p>
@@ -43971,7 +43971,7 @@
           <w:color w:val="2B2B2B"/>
           <w:sz w:val="26"/>
         </w:rPr>
-        <w:t xml:space="preserve">“Colonel,” said Halvorsen. “Who is it addressed to?”</w:t>
+        <w:t xml:space="preserve">“Colonel,” said Halvorsen, “who is it addressed to?”</w:t>
       </w:r>
     </w:p>
     <w:p>
@@ -44111,7 +44111,7 @@
           <w:color w:val="2B2B2B"/>
           <w:sz w:val="26"/>
         </w:rPr>
-        <w:t xml:space="preserve">“You don’t have to,” said Halvorsen quietly. “It’s a lie. A very good one. I helped to write it.”</w:t>
+        <w:t xml:space="preserve">“You needn’t,” said Halvorsen quietly. “It’s a lie. A very good one. I helped to write it.”</w:t>
       </w:r>
     </w:p>
     <w:p>
@@ -45969,7 +45969,7 @@
           <w:color w:val="2B2B2B"/>
           <w:sz w:val="26"/>
         </w:rPr>
-        <w:t xml:space="preserve">Rosa nodded once. She did not cry. She had done that in August, in front of the Virgin and a man with a duster, and had decided once was the whole of it.</w:t>
+        <w:t xml:space="preserve">Rosa nodded once. There were no tears. She had done that in August, in front of the Virgin and a man with a duster, and had decided once was the whole of it.</w:t>
       </w:r>
     </w:p>
     <w:p>
@@ -46331,7 +46331,7 @@
           <w:color w:val="2B2B2B"/>
           <w:sz w:val="26"/>
         </w:rPr>
-        <w:t xml:space="preserve">“I’m sorry to call so late,” he said. “I was told this is the number. You can call me whatever you like. Everyone does.”</w:t>
+        <w:t xml:space="preserve">“I’m sorry to call so late,” he said. “I was told this is the number. I’m afraid I don’t have a name to give you. Everyone calls me something different.”</w:t>
       </w:r>
     </w:p>
     <w:p>
@@ -46371,7 +46371,7 @@
           <w:color w:val="2B2B2B"/>
           <w:sz w:val="26"/>
         </w:rPr>
-        <w:t xml:space="preserve">“I walk people back out,” said the voice. “I’ve been asked to call. There is a committee up here, and it has a question, and it would like to know who on the ground it ought to ask.” A pause, with a quarter of a second of light in it. “Nobody here has done this before.”</w:t>
+        <w:t xml:space="preserve">“My job is walking people back out,” said the voice. “I’ve been asked to call. There is a committee up here, and it has a question, and it would like to know who on the ground it ought to ask.” A pause, with a quarter of a second of light in it. “Nobody here has done this before.”</w:t>
       </w:r>
     </w:p>
     <w:p>
@@ -46794,7 +46794,7 @@
           <w:sz w:val="26"/>
           <w:szCs w:val="26"/>
         </w:rPr>
-        <w:t xml:space="preserve">The Directorate. The Joint Sky Directorate, in a building three blocks from NATO headquarters whose directory says LOGISTICS.</w:t>
+        <w:t xml:space="preserve">The Directorate. The Joint Sky Directorate, housed three blocks from NATO headquarters behind a directory that says LOGISTICS.</w:t>
       </w:r>
     </w:p>
     <w:p>
@@ -46820,7 +46820,7 @@
           <w:sz w:val="26"/>
           <w:szCs w:val="26"/>
         </w:rPr>
-        <w:t xml:space="preserve">The Boat. The generation ship, parked since 1979 in the Trojan swarm sixty degrees ahead of Jupiter, dark and about four kilometers across. Its formal name is several committees long. The crew do not use it.</w:t>
+        <w:t xml:space="preserve">The Boat. The generation ship, parked since 1979 among the Jupiter Trojans, sixty degrees ahead of the planet, dark and about four kilometers across. Its formal name is several committees long. The crew do not use it.</w:t>
       </w:r>
     </w:p>
     <w:p>
@@ -46833,7 +46833,7 @@
           <w:sz w:val="26"/>
           <w:szCs w:val="26"/>
         </w:rPr>
-        <w:t xml:space="preserve">The shore boat. An old tender in geosynchronous orbit, thirty-six thousand kilometers above the equator over the Amazon, about sixty degrees west: low in the south-east from Nevada, low in the west-south-west from Zaragoza. A signal from the ground reaches it in an eighth of a second. The Boat, this August, is the better part of an hour away.</w:t>
+        <w:t xml:space="preserve">The shore boat. An old tender in geosynchronous orbit, thirty-six thousand kilometers up, over the Amazon, about sixty degrees west: low in the south-east from Nevada, low in the west-south-west from Zaragoza. A signal from the ground reaches it in an eighth of a second. The Boat, this August, is the better part of an hour away.</w:t>
       </w:r>
     </w:p>
     <w:p>
@@ -46911,7 +46911,7 @@
           <w:sz w:val="26"/>
           <w:szCs w:val="26"/>
         </w:rPr>
-        <w:t xml:space="preserve">The ground office. Hybrids who have been told what they are and have chosen to work for the ship. It was never one thing.</w:t>
+        <w:t xml:space="preserve">The ground office. Hybrids who know what they are and work for the ship on purpose. It was never one thing.</w:t>
       </w:r>
     </w:p>
     <w:p>
@@ -46937,7 +46937,7 @@
           <w:sz w:val="26"/>
           <w:szCs w:val="26"/>
         </w:rPr>
-        <w:t xml:space="preserve">The Asking Clause. The ship’s oldest law. A taking stands down if a resident of the world asks in good faith and one of the arriving party hears the request and consents to carry it. It must travel through an implant on an open channel. A broadcast never counts. Since Starfall it runs both ways: on the night the monthly letters come, the line to the one who carried stays open long enough for one sentence.</w:t>
+        <w:t xml:space="preserve">The Asking Clause. The ship’s oldest law. A taking stands down when someone who lives here asks sincerely, and one of the visitors hears the request and agrees to take it home. It must travel through an implant on an open channel. A broadcast never counts. Since Starfall it runs both ways: each month, on the night the letters come, the one who carried gets an open line for a single sentence.</w:t>
       </w:r>
     </w:p>
     <w:p>
@@ -48629,7 +48629,7 @@
           <w:color w:val="2B2B2B"/>
           <w:sz w:val="26"/>
         </w:rPr>
-        <w:t xml:space="preserve">The Dolphins' View of History</w:t>
+        <w:t xml:space="preserve">The Dolphins’ View of History</w:t>
       </w:r>
     </w:p>
     <w:p>
@@ -48661,7 +48661,7 @@
           <w:color w:val="2B2B2B"/>
           <w:sz w:val="26"/>
         </w:rPr>
-        <w:t xml:space="preserve">The Murder That Hadn't Happened Yet (The Relativistic Investigation Bureau, Book 1)</w:t>
+        <w:t xml:space="preserve">The Murder That Hadn’t Happened Yet (The Relativistic Investigation Bureau, Book 1)</w:t>
       </w:r>
     </w:p>
     <w:p>

</xml_diff>

<commit_message>
Protocol Flamingo: outside-review pass (mystery map, chapter 1 trimmed, Book One ending beat, Flamingo file label, line trims)
Checked the review against the live book first: no Book One thread is unpaid, Jesse already
arrives at the end of Book One, and the six longest chapters are tight, so only line-level
trims were made. Chapter 1 -205 words; Book One ending gains one paragraph (Nora sends Mabs's
plate photo to Jesse); the title now appears as the Desk's file name in Brussels and the
Finding; glossary fixed (Gladys said it, Warren wrote it). 76,908 -> 76,581 words. Repeated-
sentence scan clean. Pre-edit copy in bak/. Includes the Also by page edit already on this
branch (d04d777) so the book file is identical on the branch and on main.

Co-Authored-By: Claude Sonnet 5.5 <noreply@anthropic.com>
</commit_message>
<xml_diff>
--- a/Protocol Flamingo/Protocol_Flamingo_Rev2.docx
+++ b/Protocol Flamingo/Protocol_Flamingo_Rev2.docx
@@ -1114,7 +1114,7 @@
           <w:color w:val="2B2B2B"/>
           <w:sz w:val="26"/>
         </w:rPr>
-        <w:t xml:space="preserve">She had driven in that morning from Indianapolis with the second camera on the passenger seat and a paper cup of gas-station coffee going cold in the holder. Lissome announced itself the way small towns in Indiana do: a speed-limit sign, a grain co-op, a water tower with LISSOME painted on the tank in letters that had been fading since before Nora had a license. The rented barn sat at the end of a gravel drive that popped under the tires. Somebody had strung Edison bulbs across the rafters. Inside, the floorboards gave a little under a dance heel. Nora checked her batteries, taped a spare card into the lining of her jacket, and started working the room the way she always did: wide, then faces, then hands.</w:t>
+        <w:t xml:space="preserve">She had driven in that morning from Indianapolis with the second camera on the passenger seat. Lissome announced itself the way small towns in Indiana do: a speed-limit sign, a grain co-op, a water tower with LISSOME painted on the tank in letters that had been fading since before Nora had a license. The rented barn sat at the end of a gravel drive that popped under the tires. Somebody had strung Edison bulbs across the rafters. Nora checked her batteries, taped a spare card into the lining of her jacket, and started working the room the way she always did: wide, then faces, then hands.</w:t>
       </w:r>
     </w:p>
     <w:p>
@@ -1593,47 +1593,47 @@
           <w:color w:val="2B2B2B"/>
           <w:sz w:val="26"/>
         </w:rPr>
-        <w:t xml:space="preserve">By six the lot was a tangle of trucks and a single borrowed school bus from the church. Someone had put a hose on the side of the barn and children were already using it as a dare. Behind the barn a generator coughed and settled. The fields went on until they didn’t. A red-winged blackbird yelled from a ditch as if the whole county had offended it.</w:t>
-      </w:r>
-    </w:p>
-    <w:p>
-      <w:pPr>
-        <w:spacing w:line="400" w:lineRule="auto"/>
-        <w:ind w:firstLine="440"/>
-        <w:jc w:val="both"/>
-        <w:rPr>
-          <w:rFonts w:ascii="Georgia" w:hAnsi="Georgia"/>
-          <w:color w:val="2B2B2B"/>
-          <w:sz w:val="26"/>
-        </w:rPr>
-      </w:pPr>
-      <w:r>
-        <w:rPr>
-          <w:rFonts w:ascii="Georgia" w:hAnsi="Georgia"/>
-          <w:color w:val="2B2B2B"/>
-          <w:sz w:val="26"/>
-        </w:rPr>
-        <w:t xml:space="preserve">She shot the empty tables first. White cloth, mason jars with wildflowers already wilting in the heat that hadn’t left the wood. A cousin tested the microphone and produced a sound like a fork in a socket. Nora winced, laughed, told him to tap it, not slap it.</w:t>
-      </w:r>
-    </w:p>
-    <w:p>
-      <w:pPr>
-        <w:spacing w:line="400" w:lineRule="auto"/>
-        <w:ind w:firstLine="440"/>
-        <w:jc w:val="both"/>
-        <w:rPr>
-          <w:rFonts w:ascii="Georgia" w:hAnsi="Georgia"/>
-          <w:color w:val="2B2B2B"/>
-          <w:sz w:val="26"/>
-        </w:rPr>
-      </w:pPr>
-      <w:r>
-        <w:rPr>
-          <w:rFonts w:ascii="Georgia" w:hAnsi="Georgia"/>
-          <w:color w:val="2B2B2B"/>
-          <w:sz w:val="26"/>
-        </w:rPr>
-        <w:t xml:space="preserve">The vows were almost ordinary, which Nora would later be grateful for. Dominic said his lines without looking at the sky. Mabs cried in the efficient way of a person who had budgeted for it. A flower girl sat down in the aisle and had to be lifted like luggage. Nora moved when she needed to move and was still when she needed to be still. The light had not happened yet. The barn still felt like a good decision.</w:t>
+        <w:t xml:space="preserve">By six the lot was a tangle of trucks and a single borrowed school bus from the church. Behind the barn a generator coughed and settled. A red-winged blackbird yelled from a ditch as if the whole county had offended it.</w:t>
+      </w:r>
+    </w:p>
+    <w:p>
+      <w:pPr>
+        <w:spacing w:line="400" w:lineRule="auto"/>
+        <w:ind w:firstLine="440"/>
+        <w:jc w:val="both"/>
+        <w:rPr>
+          <w:rFonts w:ascii="Georgia" w:hAnsi="Georgia"/>
+          <w:color w:val="2B2B2B"/>
+          <w:sz w:val="26"/>
+        </w:rPr>
+      </w:pPr>
+      <w:r>
+        <w:rPr>
+          <w:rFonts w:ascii="Georgia" w:hAnsi="Georgia"/>
+          <w:color w:val="2B2B2B"/>
+          <w:sz w:val="26"/>
+        </w:rPr>
+        <w:t xml:space="preserve">She shot the empty tables first. White cloth, mason jars with wildflowers already wilting in the heat that hadn’t left the wood.</w:t>
+      </w:r>
+    </w:p>
+    <w:p>
+      <w:pPr>
+        <w:spacing w:line="400" w:lineRule="auto"/>
+        <w:ind w:firstLine="440"/>
+        <w:jc w:val="both"/>
+        <w:rPr>
+          <w:rFonts w:ascii="Georgia" w:hAnsi="Georgia"/>
+          <w:color w:val="2B2B2B"/>
+          <w:sz w:val="26"/>
+        </w:rPr>
+      </w:pPr>
+      <w:r>
+        <w:rPr>
+          <w:rFonts w:ascii="Georgia" w:hAnsi="Georgia"/>
+          <w:color w:val="2B2B2B"/>
+          <w:sz w:val="26"/>
+        </w:rPr>
+        <w:t xml:space="preserve">The vows were almost ordinary, which Nora would later be grateful for. Dominic said his lines without looking at the sky. Mabs cried in the efficient way of a person who had budgeted for it. A flower girl sat down in the aisle and had to be lifted like luggage. The light had not happened yet. The barn still felt like a good decision.</w:t>
       </w:r>
     </w:p>
     <w:p>
@@ -1872,7 +1872,7 @@
           <w:color w:val="2B2B2B"/>
           <w:sz w:val="26"/>
         </w:rPr>
-        <w:t xml:space="preserve">Nora lowered the camera a degree and found him in the frame without hunting: Curtis at the mic, mouth open, eyes not tracking the room. A woman in a mauve wrap reached for his elbow and then thought better of it. Dominic, three feet to Curtis’s left, had already dropped his own phone. It hit the runner, lit, went dark. Dominic bent, picked it up in one clean motion, and slid it into his jacket as if he were tidying a place setting. He did not glance at the glass. He did not glance at the sky. He smiled at Mabs, who had both hands over her mouth and was starting to laugh because the alternative was not laughing.</w:t>
+        <w:t xml:space="preserve">Nora lowered the camera a degree and found him in the frame without hunting: Curtis at the mic, mouth open, eyes not tracking the room. Dominic, three feet to Curtis’s left, had already dropped his own phone. It hit the runner, lit, went dark. Dominic bent, picked it up in one clean motion, and slid it into his jacket as if he were tidying a place setting. He did not glance at the glass. He did not glance at the sky. He smiled at Mabs, who had both hands over her mouth and was starting to laugh because the alternative was not laughing.</w:t>
       </w:r>
     </w:p>
     <w:p>
@@ -1932,87 +1932,87 @@
           <w:color w:val="2B2B2B"/>
           <w:sz w:val="26"/>
         </w:rPr>
-        <w:t xml:space="preserve">The alpaca took the gap between the gift table and the cousin from Fort Wayne as if it had rehearsed the aisle. A wine glass went. White wine ran along a crease in the tablecloth and dripped onto a pair of rented shoes. A child shouted that it was a llama. Steve — they would not have the name for another week — stopped at Dominic’s chair, considered the groom with the polite distaste of a creature who has been served something he did not order, and then went and stood at Mabs’s shoulder instead, chewing nothing, as if he had been hired as security and intended to do the job properly.</w:t>
-      </w:r>
-    </w:p>
-    <w:p>
-      <w:pPr>
-        <w:spacing w:line="400" w:lineRule="auto"/>
-        <w:ind w:firstLine="440"/>
-        <w:jc w:val="both"/>
-        <w:rPr>
-          <w:rFonts w:ascii="Georgia" w:hAnsi="Georgia"/>
-          <w:color w:val="2B2B2B"/>
-          <w:sz w:val="26"/>
-        </w:rPr>
-      </w:pPr>
-      <w:r>
-        <w:rPr>
-          <w:rFonts w:ascii="Georgia" w:hAnsi="Georgia"/>
-          <w:color w:val="2B2B2B"/>
-          <w:sz w:val="26"/>
-        </w:rPr>
-        <w:t xml:space="preserve">Nora got the whole approach on the B-camera. She got Dominic not looking at the animal. She got the aunt’s laugh starting high and catching on.</w:t>
-      </w:r>
-    </w:p>
-    <w:p>
-      <w:pPr>
-        <w:spacing w:line="400" w:lineRule="auto"/>
-        <w:ind w:firstLine="440"/>
-        <w:jc w:val="both"/>
-        <w:rPr>
-          <w:rFonts w:ascii="Georgia" w:hAnsi="Georgia"/>
-          <w:color w:val="2B2B2B"/>
-          <w:sz w:val="26"/>
-        </w:rPr>
-      </w:pPr>
-      <w:r>
-        <w:rPr>
-          <w:rFonts w:ascii="Georgia" w:hAnsi="Georgia"/>
-          <w:color w:val="2B2B2B"/>
-          <w:sz w:val="26"/>
-        </w:rPr>
-        <w:t xml:space="preserve">Gary Huff, three tables back, did not laugh. He was somewhere past sixty, built like a man who still did his own gutters, with a flat, carrying Midwestern baritone that had spent forty years being ignored at town meetings and had thickened accordingly. He had a bunker under his garage, a shortwave radio he serviced more lovingly than his marriage had survived, and forty years of telling anyone who would sit still that a Tuesday was coming. He stood up, announced with real satisfaction that he had, in fact, called it, and began distributing laminated cards with instructions for a scenario that did not remotely match the one presently unfolding. Nobody took a card. He kept three for himself, on principle.</w:t>
-      </w:r>
-    </w:p>
-    <w:p>
-      <w:pPr>
-        <w:spacing w:line="400" w:lineRule="auto"/>
-        <w:ind w:firstLine="440"/>
-        <w:jc w:val="both"/>
-        <w:rPr>
-          <w:rFonts w:ascii="Georgia" w:hAnsi="Georgia"/>
-          <w:color w:val="2B2B2B"/>
-          <w:sz w:val="26"/>
-        </w:rPr>
-      </w:pPr>
-      <w:r>
-        <w:rPr>
-          <w:rFonts w:ascii="Georgia" w:hAnsi="Georgia"/>
-          <w:color w:val="2B2B2B"/>
-          <w:sz w:val="26"/>
-        </w:rPr>
-        <w:t xml:space="preserve">He tried the head table first. Mabs took a card because she was that kind of hostess and set it under a salt shaker. Dominic thanked him without reading it. When Huff reached the barn door and pointed toward the tree line, where his own property began and where, he said, the bunker could take fourteen if they didn’t mind close quarters, the band started again on purpose. People sat. Huff stood in the doorway a minute longer with the night at his back, listening to a sky that had gone back to being a sky, and then he walked home alone across the gravel with his remaining cards tapping his thigh.</w:t>
-      </w:r>
-    </w:p>
-    <w:p>
-      <w:pPr>
-        <w:spacing w:line="400" w:lineRule="auto"/>
-        <w:ind w:firstLine="440"/>
-        <w:jc w:val="both"/>
-        <w:rPr>
-          <w:rFonts w:ascii="Georgia" w:hAnsi="Georgia"/>
-          <w:color w:val="2B2B2B"/>
-          <w:sz w:val="26"/>
-        </w:rPr>
-      </w:pPr>
-      <w:r>
-        <w:rPr>
-          <w:rFonts w:ascii="Georgia" w:hAnsi="Georgia"/>
-          <w:color w:val="2B2B2B"/>
-          <w:sz w:val="26"/>
-        </w:rPr>
-        <w:t xml:space="preserve">Nobody could find out whose alpaca it was. A farmer two roads over kept llamas and swore none of his were missing and that this one was not, in any case, a llama, a distinction he made with some heat. The alpaca would not leave Mabs. When the dancing started it stood at the edge of the floor like a chaperone. When Dominic came to dance with his wife it moved away exactly as far as he moved toward her, no more, no less, and then moved back when he left.</w:t>
+        <w:t xml:space="preserve">The alpaca took the gap between the gift table and the cousin from Fort Wayne as if it had rehearsed the aisle. A child shouted that it was a llama. Steve — they would not have the name for another week — stopped at Dominic’s chair, considered the groom with the polite distaste of a creature who has been served something he did not order, and then went and stood at Mabs’s shoulder instead, chewing nothing, as if he had been hired as security and intended to do the job properly.</w:t>
+      </w:r>
+    </w:p>
+    <w:p>
+      <w:pPr>
+        <w:spacing w:line="400" w:lineRule="auto"/>
+        <w:ind w:firstLine="440"/>
+        <w:jc w:val="both"/>
+        <w:rPr>
+          <w:rFonts w:ascii="Georgia" w:hAnsi="Georgia"/>
+          <w:color w:val="2B2B2B"/>
+          <w:sz w:val="26"/>
+        </w:rPr>
+      </w:pPr>
+      <w:r>
+        <w:rPr>
+          <w:rFonts w:ascii="Georgia" w:hAnsi="Georgia"/>
+          <w:color w:val="2B2B2B"/>
+          <w:sz w:val="26"/>
+        </w:rPr>
+        <w:t xml:space="preserve">Nora got the whole approach on the B-camera. She got Dominic not looking at the animal.</w:t>
+      </w:r>
+    </w:p>
+    <w:p>
+      <w:pPr>
+        <w:spacing w:line="400" w:lineRule="auto"/>
+        <w:ind w:firstLine="440"/>
+        <w:jc w:val="both"/>
+        <w:rPr>
+          <w:rFonts w:ascii="Georgia" w:hAnsi="Georgia"/>
+          <w:color w:val="2B2B2B"/>
+          <w:sz w:val="26"/>
+        </w:rPr>
+      </w:pPr>
+      <w:r>
+        <w:rPr>
+          <w:rFonts w:ascii="Georgia" w:hAnsi="Georgia"/>
+          <w:color w:val="2B2B2B"/>
+          <w:sz w:val="26"/>
+        </w:rPr>
+        <w:t xml:space="preserve">Gary Huff, three tables back, did not laugh. He was somewhere past sixty, built like a man who still did his own gutters, with a flat, carrying Midwestern baritone that had spent forty years being ignored at town meetings and had thickened accordingly. He had a bunker under his garage, a shortwave radio he serviced more lovingly than his marriage had survived, and a Tuesday he had been expecting since the Reagan administration. He stood up, announced with real satisfaction that he had, in fact, called it, and began distributing laminated cards with instructions for a scenario that did not remotely match the one presently unfolding. Nobody took a card. He kept three for himself, on principle.</w:t>
+      </w:r>
+    </w:p>
+    <w:p>
+      <w:pPr>
+        <w:spacing w:line="400" w:lineRule="auto"/>
+        <w:ind w:firstLine="440"/>
+        <w:jc w:val="both"/>
+        <w:rPr>
+          <w:rFonts w:ascii="Georgia" w:hAnsi="Georgia"/>
+          <w:color w:val="2B2B2B"/>
+          <w:sz w:val="26"/>
+        </w:rPr>
+      </w:pPr>
+      <w:r>
+        <w:rPr>
+          <w:rFonts w:ascii="Georgia" w:hAnsi="Georgia"/>
+          <w:color w:val="2B2B2B"/>
+          <w:sz w:val="26"/>
+        </w:rPr>
+        <w:t xml:space="preserve">He tried the head table first. Mabs took a card because she was that kind of hostess and set it under a salt shaker. Dominic thanked him without reading it. When Huff reached the barn door and pointed toward the tree line, where, he said, the bunker could take fourteen if they didn’t mind close quarters, the band started again on purpose. People sat. Huff stood in the doorway a minute longer with the night at his back, listening to a sky that had gone back to being a sky, and then he walked home alone across the gravel with his remaining cards tapping his thigh.</w:t>
+      </w:r>
+    </w:p>
+    <w:p>
+      <w:pPr>
+        <w:spacing w:line="400" w:lineRule="auto"/>
+        <w:ind w:firstLine="440"/>
+        <w:jc w:val="both"/>
+        <w:rPr>
+          <w:rFonts w:ascii="Georgia" w:hAnsi="Georgia"/>
+          <w:color w:val="2B2B2B"/>
+          <w:sz w:val="26"/>
+        </w:rPr>
+      </w:pPr>
+      <w:r>
+        <w:rPr>
+          <w:rFonts w:ascii="Georgia" w:hAnsi="Georgia"/>
+          <w:color w:val="2B2B2B"/>
+          <w:sz w:val="26"/>
+        </w:rPr>
+        <w:t xml:space="preserve">Nobody could find out whose alpaca it was. A farmer two roads over swore none of his llamas were missing, and that this one was not, in any case, a llama. The alpaca would not leave Mabs. When the dancing started it stood at the edge of the floor like a chaperone. When Dominic came to dance with his wife it moved away exactly as far as he moved toward her, no more, no less, and then moved back when he left.</w:t>
       </w:r>
     </w:p>
     <w:p>
@@ -2091,27 +2091,27 @@
           <w:color w:val="2B2B2B"/>
           <w:sz w:val="26"/>
         </w:rPr>
-        <w:t xml:space="preserve">After the last toast Nora packed in the order she always packed: cards, batteries, the A-camera last, because it had seen the thing and she did not want it rattling in the trunk like groceries. A groomsman asked if she’d gotten the alpaca. She said she had gotten everything. He wanted a selfie with the animal. The alpaca declined by simply not being where the groomsman was. On the county road a sheriff’s cruiser passed going the other way, no lights, in no hurry, which was how Lissome preferred its mysteries.</w:t>
-      </w:r>
-    </w:p>
-    <w:p>
-      <w:pPr>
-        <w:spacing w:line="400" w:lineRule="auto"/>
-        <w:ind w:firstLine="440"/>
-        <w:jc w:val="both"/>
-        <w:rPr>
-          <w:rFonts w:ascii="Georgia" w:hAnsi="Georgia"/>
-          <w:color w:val="2B2B2B"/>
-          <w:sz w:val="26"/>
-        </w:rPr>
-      </w:pPr>
-      <w:r>
-        <w:rPr>
-          <w:rFonts w:ascii="Georgia" w:hAnsi="Georgia"/>
-          <w:color w:val="2B2B2B"/>
-          <w:sz w:val="26"/>
-        </w:rPr>
-        <w:t xml:space="preserve">Under her wiper was a flyer the color of a drugstore receipt. STARFALL, in letters that had tried to look like a planet. The eclipse of the year. Zaragoza, Spain. Wednesday 12 August. Your sky, live — wherever you are. Halo Systems. There was a picture of the moon wearing a ring like a halo in a medieval painting, and a QR code. Every car in the lot had one. She balled it up and missed the can by the barn door. Somebody else’s tire went over it on the way out.</w:t>
+        <w:t xml:space="preserve">After the last toast Nora packed in the order she always packed: cards, batteries, the A-camera last, because it had seen the thing and she did not want it rattling in the trunk like groceries. A groomsman asked if she’d gotten the alpaca. She said she had gotten everything. On the county road a sheriff’s cruiser passed going the other way, no lights, in no hurry, which was how Lissome preferred its mysteries.</w:t>
+      </w:r>
+    </w:p>
+    <w:p>
+      <w:pPr>
+        <w:spacing w:line="400" w:lineRule="auto"/>
+        <w:ind w:firstLine="440"/>
+        <w:jc w:val="both"/>
+        <w:rPr>
+          <w:rFonts w:ascii="Georgia" w:hAnsi="Georgia"/>
+          <w:color w:val="2B2B2B"/>
+          <w:sz w:val="26"/>
+        </w:rPr>
+      </w:pPr>
+      <w:r>
+        <w:rPr>
+          <w:rFonts w:ascii="Georgia" w:hAnsi="Georgia"/>
+          <w:color w:val="2B2B2B"/>
+          <w:sz w:val="26"/>
+        </w:rPr>
+        <w:t xml:space="preserve">Under her wiper was a flyer the color of a drugstore receipt. STARFALL, in letters that had tried to look like a planet. The eclipse of the year. Zaragoza, Spain. Wednesday 12 August. Your sky, live — wherever you are. Halo Systems. There was a picture of the moon wearing a ring like a halo in a medieval painting, and a QR code. Every car in the lot had one. She balled it up and missed the can by the barn door.</w:t>
       </w:r>
     </w:p>
     <w:p>
@@ -2151,7 +2151,7 @@
           <w:color w:val="2B2B2B"/>
           <w:sz w:val="26"/>
         </w:rPr>
-        <w:t xml:space="preserve">When she got home to Indianapolis it was one in the morning. She should have gone to bed. Instead she sat on the floor with her laptop on a packing blanket and watched both cards back at half speed, the way she did every wedding, because the camera always saw things the guests were too busy having a nice time to notice.</w:t>
+        <w:t xml:space="preserve">When she got home to Indianapolis it was one in the morning. Instead of bed she sat on the floor with her laptop on a packing blanket and watched both cards back at half speed, the way she did every wedding, because the camera always saw things the guests were too busy having a nice time to notice.</w:t>
       </w:r>
     </w:p>
     <w:p>
@@ -2290,7 +2290,7 @@
           <w:color w:val="2B2B2B"/>
           <w:sz w:val="26"/>
         </w:rPr>
-        <w:t xml:space="preserve">For the rest of the night he kept waiting for the weather to come back. It did not. He danced with his wife and his mother and a great-aunt who told him about childbirth. He drove the rental van back to the motel at one, sober as a deacon, while Mabs slept against the window in her dress. At a red light with nobody else in the world, he took the phone out of his jacket and looked at the screen. It was not cracked. He had known it would not be. He did not know how he had known, and the not-knowing sat in his chest like a swallowed stone all the way to the motel, where he carried his wife over a threshold that smelled of carpet cleaner and decided, firmly, as she laughed into his neck, that it had been the open bar he had not used.</w:t>
+        <w:t xml:space="preserve">For the rest of the night he kept waiting for the weather to come back. It did not. He drove the rental van back to the motel at one, sober as a deacon, while Mabs slept against the window in her dress. At a red light with nobody else in the world, he took the phone out of his jacket and looked at the screen. It was not cracked. He had known it would not be. He did not know how he had known, and the not-knowing sat in his chest like a swallowed stone all the way to the motel, where he carried his wife over a threshold that smelled of carpet cleaner and decided, firmly, as she laughed into his neck, that it had been the open bar he had not used.</w:t>
       </w:r>
     </w:p>
     <w:p>
@@ -11795,6 +11795,26 @@
           <w:sz w:val="26"/>
         </w:rPr>
         <w:t xml:space="preserve">They agreed on very little that night except the next step: find whoever had pulled her video. Whoever could make eighty seconds of footage vanish from six platforms and a drive in Cincinnati, and then send a man without a face to say good night in a parking lot, had resources neither a wedding videographer nor a podcaster possessed. And resources, Jesse said, always led somewhere with a budget line, and a budget line always led somewhere with a building.</w:t>
+      </w:r>
+    </w:p>
+    <w:p>
+      <w:pPr>
+        <w:spacing w:line="400" w:lineRule="auto"/>
+        <w:ind w:firstLine="440"/>
+        <w:jc w:val="both"/>
+        <w:rPr>
+          <w:rFonts w:ascii="Georgia" w:hAnsi="Georgia"/>
+          <w:color w:val="2B2B2B"/>
+          <w:sz w:val="26"/>
+        </w:rPr>
+      </w:pPr>
+      <w:r>
+        <w:rPr>
+          <w:rFonts w:ascii="Georgia" w:hAnsi="Georgia"/>
+          <w:color w:val="2B2B2B"/>
+          <w:sz w:val="26"/>
+        </w:rPr>
+        <w:t xml:space="preserve">She sent him the photograph before she could talk herself out of it. It was Mabs’s picture, taken slowly so the man would see her taking it, and it was the first thing of her sister’s Nora had ever handed to a stranger. “Off the air,” Jesse said, reading her face. “All of it, until you say.” He meant it. Meaning it, she would learn, was not the same as keeping it.</w:t>
       </w:r>
     </w:p>
     <w:p>
@@ -12255,7 +12275,7 @@
           <w:color w:val="2B2B2B"/>
           <w:sz w:val="26"/>
         </w:rPr>
-        <w:t xml:space="preserve">Buchanan’s escalation lay at the center of the table: a wedding video that would not stay deleted, a Dipstick result the color of a lawn ornament, an alpaca with, in Whitcombe’s phrase, “apparently better clearance than several of the people in this room,” and a wave of similar sightings that Priya Chen’s pattern placed on a curve that had not looked this steep since 1947. In the paper it was called the Chen index. Priya’s name was not otherwise on it.</w:t>
+        <w:t xml:space="preserve">Buchanan’s escalation lay at the center of the table, its tab penciled Flamingo: a wedding video that would not stay deleted, a Dipstick result the color of a lawn ornament, an alpaca with, in Whitcombe’s phrase, “apparently better clearance than several of the people in this room,” and a wave of similar sightings that Priya Chen’s pattern placed on a curve that had not looked this steep since 1947. In the paper it was called the Chen index. Priya’s name was not otherwise on it.</w:t>
       </w:r>
     </w:p>
     <w:p>
@@ -19073,7 +19093,7 @@
           <w:color w:val="2B2B2B"/>
           <w:sz w:val="26"/>
         </w:rPr>
-        <w:t xml:space="preserve">“I’ll tell you something Mabs doesn’t know all of,” he said. “In college I woke up one morning in my car, in the parking lot of a hospital in Columbus. Ohio. I was at Ball State. I have no memory of the drive. Two hours, and nothing. I had a parking ticket on the windshield and a full tank of gas I don’t remember buying. I went inside, because I was at a hospital and it seemed rude not to, and a doctor said migraine aura and gave me a pamphlet.” He turned a peach over in his hand. “It happens. Twice a year, three times. A thing like weather comes in behind my eyes, and then it goes, and I’ve lost a piece of the afternoon. It’s been happening more. This spring I started thinking it was a tumor. I thought, I’ll get married, and then I’ll find out it’s a tumor, and Mabs will have had one good summer.”</w:t>
+        <w:t xml:space="preserve">“I’ll tell you something Mabs doesn’t know all of,” he said. “In college I woke up one morning in my car, in the parking lot of a hospital in Columbus. Ohio. I was at Ball State. Two hours gone, and a full tank of gas I don’t remember buying. I went inside, because I was at a hospital and it seemed rude not to, and a doctor said migraine aura.” He turned a peach over in his hand. “It happens. Twice a year, three times. A thing like weather comes in behind my eyes, and then it goes, and I’ve lost a piece of the afternoon. It’s been happening more. This spring I started thinking it was a tumor. I thought, I’ll get married, and then I’ll find out it’s a tumor, and Mabs will have had one good summer.”</w:t>
       </w:r>
     </w:p>
     <w:p>
@@ -19711,7 +19731,7 @@
           <w:color w:val="2B2B2B"/>
           <w:sz w:val="26"/>
         </w:rPr>
-        <w:t xml:space="preserve">In the hour before the fence, in a motel room that smelled of the ice machine and the Mexican food they had eaten out of foil containers on the bed, Jesse caught himself laughing at something Nora said — something about the Silver Queen’s carpet, which had a pattern of interlocking boomerangs that she said could only have been chosen by someone who had been told the motel would be visited by people who needed to find their way back — and he made a private note, filed immediately under problems for later, that he no longer found her remotely insufferable.</w:t>
+        <w:t xml:space="preserve">In the hour before the fence, Jesse caught himself laughing at something Nora said — something about the Silver Queen’s carpet, which had a pattern of interlocking boomerangs that she said could only have been chosen by someone who had been told the motel would be visited by people who needed to find their way back — and he made a private note, filed immediately under problems for later, that he no longer found her remotely insufferable.</w:t>
       </w:r>
     </w:p>
     <w:p>
@@ -21232,7 +21252,7 @@
           <w:color w:val="2B2B2B"/>
           <w:sz w:val="26"/>
         </w:rPr>
-        <w:t xml:space="preserve">It was old the way anything is old that has been patched more times than it was ever built. Handrails worn pale by hands. An air recycler doing its unglamorous and slightly asthmatic best. Corridors with the scuffed patience of a building that has never once been allowed to be replaced, only maintained. The floor gave a little underfoot, not carpet, not steel, something in between that took a footprint and gave it back. The air had a recycled sweetness like a plane at the end of a long flight, undercut by oil and the mineral taste of water that had been through too many filters.</w:t>
+        <w:t xml:space="preserve">It was old the way anything is old that has been patched more times than it was ever built. Handrails worn pale by hands. An air recycler doing its unglamorous and slightly asthmatic best. Corridors with the scuffed patience of a building that has never once been allowed to be replaced, only maintained. The floor gave a little underfoot, not carpet, not steel, something in between that took a footprint and gave it back.</w:t>
       </w:r>
     </w:p>
     <w:p>
@@ -21926,7 +21946,7 @@
           <w:color w:val="2B2B2B"/>
           <w:sz w:val="26"/>
         </w:rPr>
-        <w:t xml:space="preserve">What was in it had the color and approximate viscosity of a healing bruise. It smelled distantly of wet cardboard and, underneath that, something Nora’s brain insisted on filing next to low tide. It had been prepared, the Escort said with visible pride, according to a nutritional standard that had kept a closed population alive for two thousand generations without a single recorded case of scurvy. Jesse ate a spoonful out of a reporter’s reflexive fear of being rude to a source. He did not finish it, and did not, for the rest of the night, entirely trust his own stomach’s opinion of the matter. The Escort ate the rest of the bowl without comment, the way a person eats something they stopped tasting decades ago.</w:t>
+        <w:t xml:space="preserve">What was in it had the color and approximate viscosity of a healing bruise. It had been prepared, the Escort said with visible pride, according to a nutritional standard that had kept a closed population alive for two thousand generations without a single recorded case of scurvy. Jesse ate a spoonful out of a reporter’s reflexive fear of being rude to a source. He did not finish it. The Escort ate the rest of the bowl without comment, the way a person eats something they stopped tasting decades ago.</w:t>
       </w:r>
     </w:p>
     <w:p>
@@ -27635,7 +27655,7 @@
           <w:color w:val="2B2B2B"/>
           <w:sz w:val="26"/>
         </w:rPr>
-        <w:t xml:space="preserve">The break room sat one level below the old food court, a windowless box with a drop ceiling and a fluorescent tube that buzzed on the left side and stayed decently dead on the right. The vending machine dispensed only from the bottom row. A mini-fridge hosted someone else’s forgotten sandwich. The vinyl floor stuck slightly under a heel.</w:t>
+        <w:t xml:space="preserve">The break room sat one level below the old food court, a windowless box with a drop ceiling and a fluorescent tube that buzzed on the left side and stayed decently dead on the right. The vending machine dispensed only from the bottom row.</w:t>
       </w:r>
     </w:p>
     <w:p>
@@ -28253,7 +28273,7 @@
           <w:color w:val="2B2B2B"/>
           <w:sz w:val="26"/>
         </w:rPr>
-        <w:t xml:space="preserve">His recorder was on a table thirty-six thousand kilometers up. He had recorded the memo on his phone instead, in the gas station lot outside Hawthorne on Saturday morning, while she was inside buying coffee and the moth was hammering the light over the ice freezer. A voice memo, four minutes, to his producer, because he had just been set back down on a highway after a trip he could not describe, and because he had narrated everything in his life since he was nineteen and did not know how to stop. He had done it twelve hours after a man in a smock had held out his hand for the last machine that did it for him. It had her brother-in-law’s first name in it. It had Lissome. It had the eleven seconds.</w:t>
+        <w:t xml:space="preserve">His recorder was on a table thirty-six thousand kilometers up. He had recorded the memo on his phone instead, in the gas station lot outside Hawthorne on Saturday morning, while she was inside buying coffee and the moth was hammering the light over the ice freezer. A voice memo, four minutes, to his producer, because he had just been set back down on a highway after a trip he could not describe, and because he had narrated everything in his life since he was nineteen and did not know how to stop. It had her brother-in-law’s first name in it. It had Lissome. It had the eleven seconds.</w:t>
       </w:r>
     </w:p>
     <w:p>
@@ -29926,7 +29946,7 @@
           <w:color w:val="2B2B2B"/>
           <w:sz w:val="26"/>
         </w:rPr>
-        <w:t xml:space="preserve">They did not call it a dinner. Neither of them would. But they sat in the booth under the silent baseball game until the restaurant closed, and Elena paid, and Dana let her, and in the parking lot under the sodium lights they stood for a moment not quite touching, and then Elena got into her rental car and drove back to a hotel near a records-management conference she had no intention of attending, and Dana walked back across the highway to the dead mall with her hands in her pockets, and found, when she got to the pretzel room, that she had been smiling for the entire walk, and that she did not, this time, have to ask herself whether it was brave or sad.</w:t>
+        <w:t xml:space="preserve">They did not call it a dinner. Neither of them would. But they sat in the booth under the silent baseball game until the restaurant closed, and Elena paid, and Dana let her, and in the parking lot under the sodium lights they stood for a moment not quite touching, and then Elena got into her rental car and drove back to her hotel, and Dana walked back across the highway to the dead mall with her hands in her pockets, and found, when she got to the pretzel room, that she had been smiling for the entire walk, and that she did not, this time, have to ask herself whether it was brave or sad.</w:t>
       </w:r>
     </w:p>
     <w:p>
@@ -30185,7 +30205,7 @@
           <w:color w:val="2B2B2B"/>
           <w:sz w:val="26"/>
         </w:rPr>
-        <w:t xml:space="preserve">Nora looked at the pennies in the fountain. She thought about Feld on the video call, not looking up, listing what it would take: a hybrid, in the footprint, with a live implant, informed, asked, and willing. Feld’s plan, whatever it was worth, needed someone in the bowl who had been told by someone he trusted. The bowl would be full of strangers. It would contain exactly one person who would listen to her.</w:t>
+        <w:t xml:space="preserve">Nora looked at the pennies in the fountain. She thought about Feld on the video call, not looking up, listing what it would take: a hybrid, in the footprint, with a live implant, informed, asked, and willing.</w:t>
       </w:r>
     </w:p>
     <w:p>
@@ -34753,7 +34773,7 @@
           <w:color w:val="2B2B2B"/>
           <w:sz w:val="26"/>
         </w:rPr>
-        <w:t xml:space="preserve">It was thirty-four degrees in the shade, and there was no shade. The concourses smelled of sunscreen and beer and the hot sweet fry of churro stands. A public-address voice asked people in Spanish, English, French and German not to look directly at the sun without approved eclipse glasses, and then told them where the merchandise stands were. People had brought colanders, to make crescents on the concrete with the light through the holes. People had brought dogs. A mariachi band, for reasons no one could explain, was playing on the north concourse. The astronomers from Utrecht had set up tripods along the top of section 102 and were explaining Baily’s beads to anyone who slowed down.</w:t>
+        <w:t xml:space="preserve">It was thirty-four degrees in the shade, and there was no shade. The concourses smelled of sunscreen and beer and the hot sweet fry of churro stands. A public-address voice asked people in Spanish, English, French and German not to look directly at the sun without approved eclipse glasses, and then told them where the merchandise stands were. People had brought dogs. A mariachi band, for reasons no one could explain, was playing on the north concourse. The astronomers from Utrecht had set up tripods along the top of section 102 and were explaining Baily’s beads to anyone who slowed down.</w:t>
       </w:r>
     </w:p>
     <w:p>
@@ -36153,7 +36173,7 @@
           <w:color w:val="2B2B2B"/>
           <w:sz w:val="26"/>
         </w:rPr>
-        <w:t xml:space="preserve">She told him about the Kroger, and the three hours that went missing on the way, and the four hours in the nursery after he was born. She told him that what came back was him: grown from his mother’s blood, a twin of the baby she carried, human in every cell, and carrying a receiver at the base of his skull. She told him that the baby his mother carried was alive, on a ship, thirty-four years old, and spoke no English, and had never seen a sky. She told him what the ship was, and why it was dying, and what it wanted. She told him about the weather behind his eyes, and the afternoons that went missing, and the morning in Columbus, and the tickets that faced the screen, and the eleven shapes on the whiteboard. She told him what was going to happen in seven minutes. She told him about the colonel, and the key under the flip cover, and that nobody knew the percentage.</w:t>
+        <w:t xml:space="preserve">She told him about the Kroger, and the three hours that went missing on the way, and the four hours in the nursery after he was born. She told him that what came back was him: grown from his mother’s blood, a twin of the baby she carried, human in every cell, and carrying a receiver at the base of his skull. She told him that the baby his mother carried was alive, on a ship, thirty-four years old, and spoke no English, and had never seen a sky. She told him what the ship was, and why it was dying, and what it wanted. She told him about the weather behind his eyes, and the tickets that faced the screen, and the eleven shapes on the whiteboard. She told him what was going to happen in seven minutes. She told him about the colonel, and the key under the flip cover, and that nobody knew the percentage.</w:t>
       </w:r>
     </w:p>
     <w:p>
@@ -44091,7 +44111,7 @@
           <w:color w:val="2B2B2B"/>
           <w:sz w:val="26"/>
         </w:rPr>
-        <w:t xml:space="preserve">Dana turned back to the last page of the finding.</w:t>
+        <w:t xml:space="preserve">Dana turned back to the last page of the finding. At the head of every page, in Brussels typography, sat the Desk’s own name for the case: Protocol Flamingo.</w:t>
       </w:r>
     </w:p>
     <w:p>
@@ -44611,7 +44631,7 @@
           <w:color w:val="2B2B2B"/>
           <w:sz w:val="26"/>
         </w:rPr>
-        <w:t xml:space="preserve">“Then it’s his,” said Dana. “He gets told. He decides.”</w:t>
+        <w:t xml:space="preserve">“Then it’s his,” said Dana. “That’s Rosa’s rule.”</w:t>
       </w:r>
     </w:p>
     <w:p>
@@ -46391,7 +46411,7 @@
           <w:color w:val="2B2B2B"/>
           <w:sz w:val="26"/>
         </w:rPr>
-        <w:t xml:space="preserve">“Neither have we,” said Dana. She wrote the time in the log, to the second, the way Gary Huff would have. “Take your time. Ask.”</w:t>
+        <w:t xml:space="preserve">“Neither have we,” said Dana. She wrote the time in the log, to the second, the way Gary Huff would have, and headed the entry with the word Warren had added to the folder in July. “Take your time. Ask.”</w:t>
       </w:r>
     </w:p>
     <w:p>
@@ -46768,7 +46788,7 @@
           <w:sz w:val="26"/>
           <w:szCs w:val="26"/>
         </w:rPr>
-        <w:t xml:space="preserve">Protocol Flamingo. The Desk’s name for the Lissome case, taken from the pink a Dipstick turns when it finds the marker. Gladys wrote it in the margin. The file kept it.</w:t>
+        <w:t xml:space="preserve">Protocol Flamingo. The Desk’s name for the Lissome case, taken from the pink a Dipstick turns when it finds the marker. Gladys said it on the phone and Warren wrote it in pencil. The file kept it.</w:t>
       </w:r>
     </w:p>
     <w:p>

</xml_diff>